<commit_message>
Trim abstract to the 250-word cap
Co-Authored-By: Claude Fable 5.1 <noreply@anthropic.com>
Claude-Session: https://claude.ai/code/session_011m1nWiFCs4xdp8CXy2DSzu
</commit_message>
<xml_diff>
--- a/DFT_paper_revision/manuscript_v4/Ghadimimehr_DFT_TiO2_PrRb_v4_MANUSCRIPT.docx
+++ b/DFT_paper_revision/manuscript_v4/Ghadimimehr_DFT_TiO2_PrRb_v4_MANUSCRIPT.docx
@@ -211,7 +211,7 @@
         <w:t xml:space="preserve">O</w:t>
       </w:r>
       <w:r>
-        <w:t xml:space="preserve">) in wide-gap oxide electron-transport layers are a recognised source of trap-assisted recombination, and aliovalent substitution is the usual lever for controlling them, yet trivalent rare-earth and monovalent alkali dopants have rarely been compared in the same host with the same protocol. Here we compare Pr</w:t>
+        <w:t xml:space="preserve">) in wide-gap oxide electron-transport layers cause trap-assisted recombination, and aliovalent substitution is the usual lever for controlling them; trivalent rare-earth and monovalent alkali dopants have, however, rarely been compared in the same host with the same protocol. Here we compare Pr</w:t>
       </w:r>
       <w:r>
         <w:rPr>
@@ -301,7 +301,7 @@
         <w:t xml:space="preserve">+</w:t>
       </w:r>
       <w:r>
-        <w:t xml:space="preserve">, so one vacancy over-compensates Pr and leaves one residual hole with Rb. The Rb cells carry unpaired spin in every treatment tested, and the absolute magnetisation of the vacancy cell reaches 2.99 μ</w:t>
+        <w:t xml:space="preserve">, so one vacancy over-compensates Pr and leaves one residual hole with Rb. The Rb cells carry unpaired spin in every treatment tested, reaching an absolute magnetisation of 2.99 μ</w:t>
       </w:r>
       <w:r>
         <w:rPr>
@@ -313,7 +313,7 @@
         <w:t xml:space="preserve"> </w:t>
       </w:r>
       <w:r>
-        <w:t xml:space="preserve">when doubly ionised, consistent with three holes per Rb. The Pr cells converge to non-magnetic smeared solutions with U on Ti-3d only, but the vacancy-free Pr cell develops a localised hole (1.00 μ</w:t>
+        <w:t xml:space="preserve">for the doubly ionised vacancy cell, consistent with three holes per Rb. With U on Ti-3d only the Pr cells converge to non-magnetic smeared solutions, but the vacancy-free Pr cell develops a localised hole (1.00 μ</w:t>
       </w:r>
       <w:r>
         <w:rPr>
@@ -322,7 +322,7 @@
         <w:t xml:space="preserve">B</w:t>
       </w:r>
       <w:r>
-        <w:t xml:space="preserve">) when an oxygen-2p Hubbard term is added, so hole localisation in Pr-substituted anatase is method dependent. The results are consistent with charge-compensation control of V</w:t>
+        <w:t xml:space="preserve">) once an oxygen-2p Hubbard term is added, so hole localisation there is method dependent. The results support charge-compensation control of V</w:t>
       </w:r>
       <w:r>
         <w:rPr>
@@ -334,7 +334,7 @@
         <w:t xml:space="preserve"> </w:t>
       </w:r>
       <w:r>
-        <w:t xml:space="preserve">energetics in this host, while the two-dopant design does not separate oxidation state from ionic size and bonding.</w:t>
+        <w:t xml:space="preserve">energetics in this host; the two-dopant design does not separate oxidation state from ionic size and bonding.</w:t>
       </w:r>
     </w:p>
     <w:p>

</xml_diff>

<commit_message>
Check citation claims against the authors' PDFs and correct them
- Withdraw the literature V_O number comparison (values only in figures
  of Arrigoni & Madsen and Boonchun et al.); exact wording for the
  Arrigoni k-mesh and dielectric-constant citations
- Delete the Pr-V_O association attributed to Vural et al. (not in the
  paper); rewrite the lanthanide-compensation sentence to what Chen 2012,
  Mazierski and Polliotto report; drop Ahmad (rutile, no compensation)
- Torres D3 protocol stated exactly; Deak marker narrowed
- Complete author lists and pages (Mazierski, Polliotto, Bai, Ahmad, Yin)

Co-Authored-By: Claude Opus 5.5 <noreply@anthropic.com>
Claude-Session: https://claude.ai/code/session_011m1nWiFCs4xdp8CXy2DSzu
</commit_message>
<xml_diff>
--- a/DFT_paper_revision/manuscript_v4/Ghadimimehr_DFT_TiO2_PrRb_v4_MANUSCRIPT.docx
+++ b/DFT_paper_revision/manuscript_v4/Ghadimimehr_DFT_TiO2_PrRb_v4_MANUSCRIPT.docx
@@ -517,7 +517,23 @@
         <w:t xml:space="preserve"> </w:t>
       </w:r>
       <w:r>
-        <w:t xml:space="preserve">site the formal charge mismatch is −1 e per site. Several DFT+U and experimental studies of lanthanide-doped TiO</w:t>
+        <w:t xml:space="preserve">site the formal charge mismatch is −1 e per site. Lanthanide substitution in anatase has been studied with DFT+U for Ce, Pr, Eu and Gd, including Pr together with an oxygen vacancy [19], for Pr in the bulk [20] and for Er at the (101) surface together with oxygen or titanium vacancies [21]; for Ce-doped zirconium titanate both hole formation and oxygen-vacancy formation have been considered as compensation channels, with electron paramagnetic resonance pointing to vacancy compensation [22].</w:t>
+      </w:r>
+      <w:r>
+        <w:t xml:space="preserve"> </w:t>
+      </w:r>
+      <w:r>
+        <w:rPr>
+          <w:bCs/>
+          <w:b/>
+        </w:rPr>
+        <w:t xml:space="preserve">[AUTHOR ACTION: confirm from the full text what Chen et al. (2014) report on the compensation of Pr in anatase.]</w:t>
+      </w:r>
+      <w:r>
+        <w:t xml:space="preserve"> </w:t>
+      </w:r>
+      <w:r>
+        <w:t xml:space="preserve">The picture is not universal: Iwaszuk and Nolan showed for trivalent dopants in bulk rutile that oxygen-vacancy compensation can compete with, and in some cases dominate, electronic compensation [17]. The coupling between a lanthanide dopant and an oxygen vacancy has been analysed for Ce-doped anatase [23] and Gd-doped CeO</w:t>
       </w:r>
       <w:r>
         <w:rPr>
@@ -529,42 +545,77 @@
         <w:t xml:space="preserve"> </w:t>
       </w:r>
       <w:r>
-        <w:t xml:space="preserve">and related oxides describe this deficit as accommodated electronically, by rehybridisation at the valence-band edge or by a change of dopant oxidation state [19–23]</w:t>
-      </w:r>
-      <w:r>
-        <w:t xml:space="preserve"> </w:t>
-      </w:r>
-      <w:r>
-        <w:rPr>
-          <w:bCs/>
-          <w:b/>
-        </w:rPr>
-        <w:t xml:space="preserve">[AUTHOR ACTION: confirm from the full texts that each of these five studies describes electronic accommodation of the dopant charge; Ahmad et al. is an experimental photoelectrochemistry study of Gd-doped TiO</w:t>
-      </w:r>
-      <w:r>
-        <w:rPr>
-          <w:vertAlign w:val="subscript"/>
-          <w:bCs/>
-          <w:b/>
+        <w:t xml:space="preserve">[18], and Bahmanrokh et al. proposed a defect-equilibria formalism for Ce-doped anatase in which both channels appear [24]</w:t>
+      </w:r>
+      <w:r>
+        <w:t xml:space="preserve"> </w:t>
+      </w:r>
+      <w:r>
+        <w:rPr>
+          <w:bCs/>
+          <w:b/>
+        </w:rPr>
+        <w:t xml:space="preserve">[AUTHOR ACTION: confirm from the full text that both electronic and vacancy compensation appear in that formalism.]</w:t>
+      </w:r>
+      <w:r>
+        <w:t xml:space="preserve">. Pr in particular has been studied as an adsorbate on the anatase (101) surface [25] and as a substituent in the bulk [19,20], and is an attractive test case, here modelled as trivalent with a 4f-in-core dataset (Section 2.1), because its ionic radius (0.99 Å in six-fold coordination [26]) is far from that of Ti</w:t>
+      </w:r>
+      <w:r>
+        <w:rPr>
+          <w:vertAlign w:val="superscript"/>
+        </w:rPr>
+        <w:t xml:space="preserve">4+</w:t>
+      </w:r>
+      <w:r>
+        <w:t xml:space="preserve"> </w:t>
+      </w:r>
+      <w:r>
+        <w:t xml:space="preserve">(0.605 Å). For monovalent alkali dopants the mismatch is −3 e per site, and the available evidence points consistently to V</w:t>
+      </w:r>
+      <w:r>
+        <w:rPr>
+          <w:vertAlign w:val="subscript"/>
+        </w:rPr>
+        <w:t xml:space="preserve">O</w:t>
+      </w:r>
+      <w:r>
+        <w:t xml:space="preserve"> </w:t>
+      </w:r>
+      <w:r>
+        <w:t xml:space="preserve">formation as the compensation channel. Carey and Nolan found that Li, Na, K and Rb substitution in α-Cr</w:t>
+      </w:r>
+      <w:r>
+        <w:rPr>
+          <w:vertAlign w:val="subscript"/>
         </w:rPr>
         <w:t xml:space="preserve">2</w:t>
       </w:r>
       <w:r>
-        <w:rPr>
-          <w:bCs/>
-          <w:b/>
-        </w:rPr>
-        <w:t xml:space="preserve"> </w:t>
-      </w:r>
-      <w:r>
-        <w:rPr>
-          <w:bCs/>
-          <w:b/>
-        </w:rPr>
-        <w:t xml:space="preserve">nanorods and Polliotto et al. concern zirconium titanate, so drop any that do not.]</w:t>
-      </w:r>
-      <w:r>
-        <w:t xml:space="preserve">. The picture is not universal: Iwaszuk and Nolan showed for trivalent dopants in bulk rutile that oxygen-vacancy compensation can compete with, and in some cases dominate, electronic compensation [17]. The coupling between a lanthanide dopant and an oxygen vacancy has been analysed for Ce-doped anatase [24] and Gd-doped CeO</w:t>
+        <w:t xml:space="preserve">O</w:t>
+      </w:r>
+      <w:r>
+        <w:rPr>
+          <w:vertAlign w:val="subscript"/>
+        </w:rPr>
+        <w:t xml:space="preserve">3</w:t>
+      </w:r>
+      <w:r>
+        <w:t xml:space="preserve"> </w:t>
+      </w:r>
+      <w:r>
+        <w:t xml:space="preserve">strongly reduces the V</w:t>
+      </w:r>
+      <w:r>
+        <w:rPr>
+          <w:vertAlign w:val="subscript"/>
+        </w:rPr>
+        <w:t xml:space="preserve">O</w:t>
+      </w:r>
+      <w:r>
+        <w:t xml:space="preserve"> </w:t>
+      </w:r>
+      <w:r>
+        <w:t xml:space="preserve">formation energy, with the larger alkalis having the larger effect [16]. Hybrid-functional work on alkali-doped α-Bi</w:t>
       </w:r>
       <w:r>
         <w:rPr>
@@ -573,35 +624,63 @@
         <w:t xml:space="preserve">2</w:t>
       </w:r>
       <w:r>
-        <w:t xml:space="preserve"> </w:t>
-      </w:r>
-      <w:r>
-        <w:t xml:space="preserve">[18], and Bahmanrokh et al. proposed a defect-equilibria formalism for Ce-doped anatase in which both channels appear [25]</w:t>
-      </w:r>
-      <w:r>
-        <w:t xml:space="preserve"> </w:t>
-      </w:r>
-      <w:r>
-        <w:rPr>
-          <w:bCs/>
-          <w:b/>
-        </w:rPr>
-        <w:t xml:space="preserve">[AUTHOR ACTION: confirm from the full text that both electronic and vacancy compensation appear in that formalism.]</w:t>
-      </w:r>
-      <w:r>
-        <w:t xml:space="preserve">. Pr in particular has been treated at the anatase (101) surface [26] and in the bulk [23], and is an attractive test case, here modelled as trivalent with a 4f-in-core dataset (Section 2.1), because its ionic radius (0.99 Å in six-fold coordination [27]) is far from that of Ti</w:t>
+        <w:t xml:space="preserve">O</w:t>
+      </w:r>
+      <w:r>
+        <w:rPr>
+          <w:vertAlign w:val="subscript"/>
+        </w:rPr>
+        <w:t xml:space="preserve">3</w:t>
+      </w:r>
+      <w:r>
+        <w:t xml:space="preserve"> </w:t>
+      </w:r>
+      <w:r>
+        <w:t xml:space="preserve">reached a similar conclusion [27], and Tian et al. recently combined experiment and calculation to show that Rb doping, in synergy with lattice strain, promotes oxygen-vacancy formation in TiO</w:t>
+      </w:r>
+      <w:r>
+        <w:rPr>
+          <w:vertAlign w:val="subscript"/>
+        </w:rPr>
+        <w:t xml:space="preserve">2</w:t>
+      </w:r>
+      <w:r>
+        <w:t xml:space="preserve"> </w:t>
+      </w:r>
+      <w:r>
+        <w:t xml:space="preserve">[15].</w:t>
+      </w:r>
+    </w:p>
+    <w:p>
+      <w:pPr>
+        <w:pStyle w:val="BodyText"/>
+      </w:pPr>
+      <w:r>
+        <w:t xml:space="preserve">What is missing is a comparison of the two dopant families in the same anatase host with the same supercell, pseudopotentials, Hubbard treatment and oxygen reference; the Rb case of Tian et al., for example, is embedded in a strained photochromic system and is not paired with a trivalent dopant. Without such a comparison, differences between published trivalent and monovalent results cannot be separated from differences in host, protocol or reference state. The comparison is also a useful test of the Kröger–Vink bookkeeping that is routinely invoked for dopant selection [28]: a Pr</w:t>
       </w:r>
       <w:r>
         <w:rPr>
           <w:vertAlign w:val="superscript"/>
         </w:rPr>
-        <w:t xml:space="preserve">4+</w:t>
-      </w:r>
-      <w:r>
-        <w:t xml:space="preserve"> </w:t>
-      </w:r>
-      <w:r>
-        <w:t xml:space="preserve">(0.605 Å). For monovalent alkali dopants the mismatch is −3 e per site, and the available evidence points consistently to V</w:t>
+        <w:t xml:space="preserve">3+</w:t>
+      </w:r>
+      <w:r>
+        <w:t xml:space="preserve"> </w:t>
+      </w:r>
+      <w:r>
+        <w:t xml:space="preserve">substitution should leave one hole and a Rb</w:t>
+      </w:r>
+      <w:r>
+        <w:rPr>
+          <w:vertAlign w:val="superscript"/>
+        </w:rPr>
+        <w:t xml:space="preserve">+</w:t>
+      </w:r>
+      <w:r>
+        <w:t xml:space="preserve"> </w:t>
+      </w:r>
+      <w:r>
+        <w:t xml:space="preserve">substitution three, so a single neutral V</w:t>
       </w:r>
       <w:r>
         <w:rPr>
@@ -613,28 +692,27 @@
         <w:t xml:space="preserve"> </w:t>
       </w:r>
       <w:r>
-        <w:t xml:space="preserve">formation as the compensation channel. Carey and Nolan found that Li, Na, K and Rb substitution in α-Cr</w:t>
-      </w:r>
-      <w:r>
-        <w:rPr>
-          <w:vertAlign w:val="subscript"/>
-        </w:rPr>
-        <w:t xml:space="preserve">2</w:t>
-      </w:r>
-      <w:r>
+        <w:t xml:space="preserve">(two electrons) should over-compensate Pr and under-compensate Rb.</w:t>
+      </w:r>
+    </w:p>
+    <w:p>
+      <w:pPr>
+        <w:pStyle w:val="BodyText"/>
+      </w:pPr>
+      <w:r>
+        <w:t xml:space="preserve">This work provides that bounded comparison. Using one PBE+U protocol we compute the neutral V</w:t>
+      </w:r>
+      <w:r>
+        <w:rPr>
+          <w:vertAlign w:val="subscript"/>
+        </w:rPr>
         <w:t xml:space="preserve">O</w:t>
       </w:r>
       <w:r>
-        <w:rPr>
-          <w:vertAlign w:val="subscript"/>
-        </w:rPr>
-        <w:t xml:space="preserve">3</w:t>
-      </w:r>
-      <w:r>
-        <w:t xml:space="preserve"> </w:t>
-      </w:r>
-      <w:r>
-        <w:t xml:space="preserve">strongly reduces the V</w:t>
+        <w:t xml:space="preserve"> </w:t>
+      </w:r>
+      <w:r>
+        <w:t xml:space="preserve">formation energy in pristine, Pr-substituted and Rb-substituted 2×2×1 anatase supercells, characterise the spin state and electron count of each cell, and test the sensitivity of the localisation picture to an oxygen-site Hubbard term. We also report charged-cell spin trends, Bader-charge differences, a hybrid-functional check on the pristine cell, dispersion-corrected single points, a k-mesh verification and alternative vacancy sites. We state explicitly which conclusions the two-dopant design supports: it establishes the ordering and magnitude of the V</w:t>
       </w:r>
       <w:r>
         <w:rPr>
@@ -646,124 +724,15 @@
         <w:t xml:space="preserve"> </w:t>
       </w:r>
       <w:r>
-        <w:t xml:space="preserve">formation energy, with the larger alkalis having the larger effect [16]. Hybrid-functional work on alkali-doped α-Bi</w:t>
-      </w:r>
-      <w:r>
-        <w:rPr>
-          <w:vertAlign w:val="subscript"/>
-        </w:rPr>
-        <w:t xml:space="preserve">2</w:t>
-      </w:r>
-      <w:r>
+        <w:t xml:space="preserve">energetics within this protocol and shows that they follow the formal charge count, but it does not isolate oxidation state from ionic radius or dopant-specific bonding, and it does not establish device-level recombination behaviour. The bulk formation energies reported here are the reference against which surface and interface V</w:t>
+      </w:r>
+      <w:r>
+        <w:rPr>
+          <w:vertAlign w:val="subscript"/>
+        </w:rPr>
         <w:t xml:space="preserve">O</w:t>
       </w:r>
       <w:r>
-        <w:rPr>
-          <w:vertAlign w:val="subscript"/>
-        </w:rPr>
-        <w:t xml:space="preserve">3</w:t>
-      </w:r>
-      <w:r>
-        <w:t xml:space="preserve"> </w:t>
-      </w:r>
-      <w:r>
-        <w:t xml:space="preserve">reached a similar conclusion [28], and Tian et al. recently combined experiment and calculation to show that Rb doping, in synergy with lattice strain, promotes oxygen-vacancy formation in TiO</w:t>
-      </w:r>
-      <w:r>
-        <w:rPr>
-          <w:vertAlign w:val="subscript"/>
-        </w:rPr>
-        <w:t xml:space="preserve">2</w:t>
-      </w:r>
-      <w:r>
-        <w:t xml:space="preserve"> </w:t>
-      </w:r>
-      <w:r>
-        <w:t xml:space="preserve">[15].</w:t>
-      </w:r>
-    </w:p>
-    <w:p>
-      <w:pPr>
-        <w:pStyle w:val="BodyText"/>
-      </w:pPr>
-      <w:r>
-        <w:t xml:space="preserve">What is missing is a comparison of the two dopant families in the same anatase host with the same supercell, pseudopotentials, Hubbard treatment and oxygen reference; the Rb case of Tian et al., for example, is embedded in a strained photochromic system and is not paired with a trivalent dopant. Without such a comparison, differences between published trivalent and monovalent results cannot be separated from differences in host, protocol or reference state. The comparison is also a useful test of the Kröger–Vink bookkeeping that is routinely invoked for dopant selection [29]: a Pr</w:t>
-      </w:r>
-      <w:r>
-        <w:rPr>
-          <w:vertAlign w:val="superscript"/>
-        </w:rPr>
-        <w:t xml:space="preserve">3+</w:t>
-      </w:r>
-      <w:r>
-        <w:t xml:space="preserve"> </w:t>
-      </w:r>
-      <w:r>
-        <w:t xml:space="preserve">substitution should leave one hole and a Rb</w:t>
-      </w:r>
-      <w:r>
-        <w:rPr>
-          <w:vertAlign w:val="superscript"/>
-        </w:rPr>
-        <w:t xml:space="preserve">+</w:t>
-      </w:r>
-      <w:r>
-        <w:t xml:space="preserve"> </w:t>
-      </w:r>
-      <w:r>
-        <w:t xml:space="preserve">substitution three, so a single neutral V</w:t>
-      </w:r>
-      <w:r>
-        <w:rPr>
-          <w:vertAlign w:val="subscript"/>
-        </w:rPr>
-        <w:t xml:space="preserve">O</w:t>
-      </w:r>
-      <w:r>
-        <w:t xml:space="preserve"> </w:t>
-      </w:r>
-      <w:r>
-        <w:t xml:space="preserve">(two electrons) should over-compensate Pr and under-compensate Rb.</w:t>
-      </w:r>
-    </w:p>
-    <w:p>
-      <w:pPr>
-        <w:pStyle w:val="BodyText"/>
-      </w:pPr>
-      <w:r>
-        <w:t xml:space="preserve">This work provides that bounded comparison. Using one PBE+U protocol we compute the neutral V</w:t>
-      </w:r>
-      <w:r>
-        <w:rPr>
-          <w:vertAlign w:val="subscript"/>
-        </w:rPr>
-        <w:t xml:space="preserve">O</w:t>
-      </w:r>
-      <w:r>
-        <w:t xml:space="preserve"> </w:t>
-      </w:r>
-      <w:r>
-        <w:t xml:space="preserve">formation energy in pristine, Pr-substituted and Rb-substituted 2×2×1 anatase supercells, characterise the spin state and electron count of each cell, and test the sensitivity of the localisation picture to an oxygen-site Hubbard term. We also report charged-cell spin trends, Bader-charge differences, a hybrid-functional check on the pristine cell, dispersion-corrected single points, a k-mesh verification and alternative vacancy sites. We state explicitly which conclusions the two-dopant design supports: it establishes the ordering and magnitude of the V</w:t>
-      </w:r>
-      <w:r>
-        <w:rPr>
-          <w:vertAlign w:val="subscript"/>
-        </w:rPr>
-        <w:t xml:space="preserve">O</w:t>
-      </w:r>
-      <w:r>
-        <w:t xml:space="preserve"> </w:t>
-      </w:r>
-      <w:r>
-        <w:t xml:space="preserve">energetics within this protocol and shows that they follow the formal charge count, but it does not isolate oxidation state from ionic radius or dopant-specific bonding, and it does not establish device-level recombination behaviour. The bulk formation energies reported here are the reference against which surface and interface V</w:t>
-      </w:r>
-      <w:r>
-        <w:rPr>
-          <w:vertAlign w:val="subscript"/>
-        </w:rPr>
-        <w:t xml:space="preserve">O</w:t>
-      </w:r>
-      <w:r>
         <w:t xml:space="preserve"> </w:t>
       </w:r>
       <w:r>
@@ -797,7 +766,7 @@
         <w:t xml:space="preserve"> </w:t>
       </w:r>
       <w:r>
-        <w:t xml:space="preserve">All calculations were performed with Quantum ESPRESSO v7.5 [30,31] (hardware and wall times in Table S6) using the PBE exchange–correlation functional [32] and projector-augmented-wave (PAW) datasets from PSlibrary 1.0.0 [33]: Ti.pbe-spn-kjpaw_psl.1.0.0, O.pbe-n-kjpaw_psl.1.0.0, Pr.pbe-spdn-kjpaw_psl.1.0.0 and Rb.pbe-spn-kjpaw_psl.1.0.0. The valence configurations and electron counts of these datasets are listed in Table 1 because they fix the electron count of every supercell. The Pr dataset belongs to the PSlibrary</w:t>
+        <w:t xml:space="preserve">All calculations were performed with Quantum ESPRESSO v7.5 [29,30] (hardware and wall times in Table S6) using the PBE exchange–correlation functional [31] and projector-augmented-wave (PAW) datasets from PSlibrary 1.0.0 [32]: Ti.pbe-spn-kjpaw_psl.1.0.0, O.pbe-n-kjpaw_psl.1.0.0, Pr.pbe-spdn-kjpaw_psl.1.0.0 and Rb.pbe-spn-kjpaw_psl.1.0.0. The valence configurations and electron counts of these datasets are listed in Table 1 because they fix the electron count of every supercell. The Pr dataset belongs to the PSlibrary</w:t>
       </w:r>
       <w:r>
         <w:t xml:space="preserve"> </w:t>
@@ -2211,7 +2180,7 @@
         <w:t xml:space="preserve"> </w:t>
       </w:r>
       <w:r>
-        <w:t xml:space="preserve">A Hubbard term in the rotationally invariant Dudarev form [34], which is the form implemented behind the HUBBARD card of Quantum ESPRESSO 7.x, was applied to the Ti-3d manifold with U</w:t>
+        <w:t xml:space="preserve">A Hubbard term in the rotationally invariant Dudarev form [33], which is the form implemented behind the HUBBARD card of Quantum ESPRESSO 7.x, was applied to the Ti-3d manifold with U</w:t>
       </w:r>
       <w:r>
         <w:rPr>
@@ -2235,23 +2204,23 @@
         <w:t xml:space="preserve"> </w:t>
       </w:r>
       <w:r>
-        <w:t xml:space="preserve">is written U, U(Ti-3d) or U(O-2p) in the rest of the paper. Deák et al. note that this value is close to an ab initio determination of U for anatase [35], and it has been used for Er-doped anatase [20] and for anatase (101) defect chemistry [7]; other anatase work uses U = 4.2 eV [13], a value originally fitted for the rutile (110) surface [36], or larger values [14]. Literature U values obtained with other projector schemes are not strictly transferable to the ortho-atomic projectors used here, and the sensitivity of the present results to U is reported in Section 3.7.</w:t>
-      </w:r>
-      <w:r>
-        <w:t xml:space="preserve"> </w:t>
-      </w:r>
-      <w:r>
-        <w:rPr>
-          <w:bCs/>
-          <w:b/>
-        </w:rPr>
-        <w:t xml:space="preserve">[AUTHOR ACTION: verify against the full texts that Mazierski et al. and Yin et al. used U(Ti-3d) = 3.5 eV and that Deák et al. quote an ab initio anatase value near 3.5 eV.]</w:t>
-      </w:r>
-      <w:r>
-        <w:t xml:space="preserve"> </w:t>
-      </w:r>
-      <w:r>
-        <w:t xml:space="preserve">The DFT+U approach rests on the formulation of Anisimov et al. [37]; linear-response determination of U [38] was not performed for any cell in this work. For the oxygen-site tests of Section 3.4 an additional U</w:t>
+        <w:t xml:space="preserve">is written U, U(Ti-3d) or U(O-2p) in the rest of the paper. Deák et al. note that this value is close to an ab initio determination of U for anatase [34], and it has been used for Er-doped anatase [21] and for anatase (101) defect chemistry [7]; other anatase work uses U = 4.2 eV [13], a value originally fitted for the rutile (110) surface [35], or larger values [14]. Literature U values obtained with other projector schemes are not strictly transferable to the ortho-atomic projectors used here, and the sensitivity of the present results to U is reported in Section 3.7.</w:t>
+      </w:r>
+      <w:r>
+        <w:t xml:space="preserve"> </w:t>
+      </w:r>
+      <w:r>
+        <w:rPr>
+          <w:bCs/>
+          <w:b/>
+        </w:rPr>
+        <w:t xml:space="preserve">[AUTHOR ACTION: verify against the full text that Deák et al. quote an ab initio anatase value near 3.5 eV (the values of Mazierski et al. and Yin et al. were checked against their texts).]</w:t>
+      </w:r>
+      <w:r>
+        <w:t xml:space="preserve"> </w:t>
+      </w:r>
+      <w:r>
+        <w:t xml:space="preserve">The DFT+U approach rests on the formulation of Anisimov et al. [36]; linear-response determination of U [37] was not performed for any cell in this work. For the oxygen-site tests of Section 3.4 an additional U</w:t>
       </w:r>
       <w:r>
         <w:rPr>
@@ -2448,23 +2417,7 @@
         <w:t xml:space="preserve"> </w:t>
       </w:r>
       <w:r>
-        <w:t xml:space="preserve">Production relaxations used Γ-point sampling, a choice made in earlier work on larger (108-atom) anatase defect cells only for hybrid-functional calculations [14].</w:t>
-      </w:r>
-      <w:r>
-        <w:t xml:space="preserve"> </w:t>
-      </w:r>
-      <w:r>
-        <w:rPr>
-          <w:bCs/>
-          <w:b/>
-        </w:rPr>
-        <w:t xml:space="preserve">[AUTHOR ACTION: confirm this against the published version of Arrigoni and Madsen; their arXiv preprint (1912.07260) uses denser meshes for DFT+U and a Γ-only grid only for the hybrid calculations.]</w:t>
-      </w:r>
-      <w:r>
-        <w:t xml:space="preserve"> </w:t>
-      </w:r>
-      <w:r>
-        <w:t xml:space="preserve">Single-point total energies on the Γ-relaxed geometries were recomputed on a 2×2×2 Monkhorst–Pack mesh for all four doped cells, and the projected densities of states and Löwdin moments were obtained from non-self-consistent calculations on a 2×2×2 mesh (Figure 4; Supporting Information, Section S2); the k-mesh dependence of the formation-energy contrast is reported in Section 3.7. All calculations were spin-polarised (nspin = 2). Fractional occupations were treated with Gaussian smearing. The single-point inputs derived from the production runs (U sweep, Section 3.7) use degauss = 0.005 Ry, whereas the converged pristine-V</w:t>
+        <w:t xml:space="preserve">Production relaxations used Γ-point sampling; in earlier anatase defect work a Γ-only grid was used only for the hybrid-functional calculations, with denser meshes otherwise [14]. Single-point total energies on the Γ-relaxed geometries were recomputed on a 2×2×2 Monkhorst–Pack mesh for all four doped cells, and the projected densities of states and Löwdin moments were obtained from non-self-consistent calculations on a 2×2×2 mesh (Figure 4; Supporting Information, Section S2); the k-mesh dependence of the formation-energy contrast is reported in Section 3.7. All calculations were spin-polarised (nspin = 2). Fractional occupations were treated with Gaussian smearing. The single-point inputs derived from the production runs (U sweep, Section 3.7) use degauss = 0.005 Ry, whereas the converged pristine-V</w:t>
       </w:r>
       <w:r>
         <w:rPr>
@@ -2964,7 +2917,7 @@
         <w:t xml:space="preserve">2</w:t>
       </w:r>
       <w:r>
-        <w:t xml:space="preserve">) = −41.51621 Ry (−564.857 eV). This is the oxygen-rich electronic-energy reference; no finite-temperature gas-phase correction or competing-phase analysis was applied, and the values are conditional oxygen-removal energies from the already substituted cells rather than equilibrium vacancy concentrations [39]. The known overbinding of O</w:t>
+        <w:t xml:space="preserve">) = −41.51621 Ry (−564.857 eV). This is the oxygen-rich electronic-energy reference; no finite-temperature gas-phase correction or competing-phase analysis was applied, and the values are conditional oxygen-removal energies from the already substituted cells rather than equilibrium vacancy concentrations [38]. The known overbinding of O</w:t>
       </w:r>
       <w:r>
         <w:rPr>
@@ -3054,7 +3007,7 @@
         <w:t xml:space="preserve"> </w:t>
       </w:r>
       <w:r>
-        <w:t xml:space="preserve">[40,41], Γ-only, 40 Ry, without the Hubbard term.</w:t>
+        <w:t xml:space="preserve">[39,40], Γ-only, 40 Ry, without the Hubbard term.</w:t>
       </w:r>
       <w:r>
         <w:t xml:space="preserve"> </w:t>
@@ -3122,7 +3075,7 @@
         <w:t xml:space="preserve"> </w:t>
       </w:r>
       <w:r>
-        <w:t xml:space="preserve">(iv) Dispersion: single-point energies for Pr_VO and Rb_VO with the Grimme D3 correction and Becke–Johnson damping [42,43], without three-body terms, following the DFT+U+D3 protocol used for defective anatase by Torres et al. [44]; the single points were started from scratch on the production geometries. (v) Alternative vacancy sites: three additional Pr_VO cells with the vacancy at atom indices O1, O7 and O17 of the production input. (vi) Bader analysis of Pr_VO and Rb_VO from pp.x charge densities with the Henkelman grid algorithm [45,46].</w:t>
+        <w:t xml:space="preserve">(iv) Dispersion: single-point energies for Pr_VO and Rb_VO with the Grimme D3 correction and Becke–Johnson damping [41,42], without three-body terms, as in the DFT+U+D3 study of pristine and defective anatase by Torres et al., who used PBEsol-D3 with U = 3 eV for the defective (001) surface [43]; the single points were started from scratch on the production geometries. (v) Alternative vacancy sites: three additional Pr_VO cells with the vacancy at atom indices O1, O7 and O17 of the production input. (vi) Bader analysis of Pr_VO and Rb_VO from pp.x charge densities with the Henkelman grid algorithm [44,45].</w:t>
       </w:r>
       <w:r>
         <w:t xml:space="preserve"> </w:t>
@@ -4120,17 +4073,29 @@
         <w:pStyle w:val="BodyText"/>
       </w:pPr>
       <w:r>
-        <w:t xml:space="preserve">The pristine value lies within the 4.0–5.0 eV range reported for the neutral bulk vacancy in anatase with DFT+U [14] and below the 5.3–5.5 eV obtained with HSE06 at the oxygen-rich limit [35,47]</w:t>
-      </w:r>
-      <w:r>
-        <w:t xml:space="preserve"> </w:t>
-      </w:r>
-      <w:r>
-        <w:rPr>
-          <w:bCs/>
-          <w:b/>
-        </w:rPr>
-        <w:t xml:space="preserve">[NEEDS CITATION: the bulk-anatase hybrid-functional V</w:t>
+        <w:t xml:space="preserve">Previous bulk-anatase studies report the neutral-vacancy formation energy at the oxygen-rich limit only graphically, with PBE+U (U = 5.8 eV on Ti-3d) and a reduced-exchange hybrid (HSE15) by Arrigoni and Madsen [14] and with HSE06 in a 108-atom cell by Boonchun et al. [46]; because their protocols differ from the uncorrected PBE+U value at a PBE O</w:t>
+      </w:r>
+      <w:r>
+        <w:rPr>
+          <w:vertAlign w:val="subscript"/>
+        </w:rPr>
+        <w:t xml:space="preserve">2</w:t>
+      </w:r>
+      <w:r>
+        <w:t xml:space="preserve"> </w:t>
+      </w:r>
+      <w:r>
+        <w:t xml:space="preserve">reference used here, a numerical comparison is not attempted, and the pristine value is used only as the internal reference for the two doped hosts.</w:t>
+      </w:r>
+      <w:r>
+        <w:t xml:space="preserve"> </w:t>
+      </w:r>
+      <w:r>
+        <w:rPr>
+          <w:bCs/>
+          <w:b/>
+        </w:rPr>
+        <w:t xml:space="preserve">[AUTHOR ACTION: if a numerical comparison is wanted, read the oxygen-rich neutral-V</w:t>
       </w:r>
       <w:r>
         <w:rPr>
@@ -4152,54 +4117,7 @@
           <w:bCs/>
           <w:b/>
         </w:rPr>
-        <w:t xml:space="preserve">study of Deák et al. is Deák, Aradi and Frauenheim, Phys. Rev. B 92 (2015) 045204 (cited as such by Arrigoni and Madsen), rather than the surface paper cited here; if the value is taken from that study, add it to refs.py and cite it in place of Deak2014.]</w:t>
-      </w:r>
-      <w:r>
-        <w:t xml:space="preserve">, as expected for a semi-local functional with a PBE O</w:t>
-      </w:r>
-      <w:r>
-        <w:rPr>
-          <w:vertAlign w:val="subscript"/>
-        </w:rPr>
-        <w:t xml:space="preserve">2</w:t>
-      </w:r>
-      <w:r>
-        <w:t xml:space="preserve"> </w:t>
-      </w:r>
-      <w:r>
-        <w:t xml:space="preserve">reference. This is a consistency check, not a validation of the protocol.</w:t>
-      </w:r>
-      <w:r>
-        <w:t xml:space="preserve"> </w:t>
-      </w:r>
-      <w:r>
-        <w:rPr>
-          <w:bCs/>
-          <w:b/>
-        </w:rPr>
-        <w:t xml:space="preserve">[AUTHOR ACTION: verify the Arrigoni–Madsen, Boonchun and Deák values and their oxygen-chemical-potential conditions against the full texts. Note that Arrigoni and Madsen used a larger U (5.8 eV in their arXiv preprint), fitted elemental-energy corrections to their DFT+U energies and a reduced exact-exchange fraction (HSE15) in their hybrid calculations, so their values are not directly comparable with an uncorrected PBE+U value at a PBE O</w:t>
-      </w:r>
-      <w:r>
-        <w:rPr>
-          <w:vertAlign w:val="subscript"/>
-          <w:bCs/>
-          <w:b/>
-        </w:rPr>
-        <w:t xml:space="preserve">2</w:t>
-      </w:r>
-      <w:r>
-        <w:rPr>
-          <w:bCs/>
-          <w:b/>
-        </w:rPr>
-        <w:t xml:space="preserve"> </w:t>
-      </w:r>
-      <w:r>
-        <w:rPr>
-          <w:bCs/>
-          <w:b/>
-        </w:rPr>
-        <w:t xml:space="preserve">reference.]</w:t>
+        <w:t xml:space="preserve">values from Fig. 5 of Arrigoni and Madsen and Fig. 1 of Boonchun et al. and state them with their chemical-potential definitions.]</w:t>
       </w:r>
       <w:r>
         <w:t xml:space="preserve"> </w:t>
@@ -6731,7 +6649,77 @@
         <w:t xml:space="preserve"> </w:t>
       </w:r>
       <w:r>
-        <w:t xml:space="preserve">A single-point HSE06 calculation on the production Pristine_perfect geometry (Section 2.8) gave a non-magnetic solution (m</w:t>
+        <w:t xml:space="preserve">A single-point HSE06 calculation on the production Pristine_perfect geometry (Section 2.8) gave a non-magnetic solution (m = 0.00 μ</w:t>
+      </w:r>
+      <w:r>
+        <w:rPr>
+          <w:vertAlign w:val="subscript"/>
+        </w:rPr>
+        <w:t xml:space="preserve">B</w:t>
+      </w:r>
+      <w:r>
+        <w:t xml:space="preserve">), a total energy of −3926.66858 Ry and a Fermi energy of 8.286 eV, 0.40 eV above the PBE+U value. The shift of the printed Fermi energy is not a band-gap measurement, and the hybrid total energy is not comparable with the PBE+U totals (Section 2.8). The check establishes only that the non-magnetic pristine state survives the change of functional, which is expected for a closed-shell cell without carriers; no hybrid calculation was performed on the doped or defective cells, so the dopant contrast of Table 2 and the localisation results of Sections 3.3–3.5 have not been verified at the hybrid level.</w:t>
+      </w:r>
+      <w:r>
+        <w:t xml:space="preserve"> </w:t>
+      </w:r>
+      <w:r>
+        <w:rPr>
+          <w:bCs/>
+          <w:b/>
+        </w:rPr>
+        <w:t xml:space="preserve">[AUTHOR ACTION: if the HSE06 result is retained, report the PBE+U and HSE06 band gaps of the pristine cell from the eigenvalues and resolve the pseudopotential question raised in Section 2.8.]</w:t>
+      </w:r>
+    </w:p>
+    <w:p>
+      <w:pPr>
+        <w:pStyle w:val="BodyText"/>
+      </w:pPr>
+      <w:r>
+        <w:rPr>
+          <w:bCs/>
+          <w:b/>
+        </w:rPr>
+        <w:t xml:space="preserve">3.7 Sensitivity tests</w:t>
+      </w:r>
+    </w:p>
+    <w:p>
+      <w:pPr>
+        <w:pStyle w:val="BodyText"/>
+      </w:pPr>
+      <w:r>
+        <w:rPr>
+          <w:iCs/>
+          <w:i/>
+        </w:rPr>
+        <w:t xml:space="preserve">Hubbard U.</w:t>
+      </w:r>
+      <w:r>
+        <w:t xml:space="preserve"> </w:t>
+      </w:r>
+      <w:r>
+        <w:t xml:space="preserve">Single-point calculations at U(Ti-3d) = 3.0, 4.0 and 4.5 eV on the production Pristine_perfect, Pr_VO and Rb_VO geometries (Table S1) leave the magnetisations unchanged in kind. Pr_VO is non-magnetic at every U, and Rb_VO carries one unpaired spin at every U (m = 1.00 μ</w:t>
+      </w:r>
+      <w:r>
+        <w:rPr>
+          <w:vertAlign w:val="subscript"/>
+        </w:rPr>
+        <w:t xml:space="preserve">B</w:t>
+      </w:r>
+      <w:r>
+        <w:t xml:space="preserve"> </w:t>
+      </w:r>
+      <w:r>
+        <w:t xml:space="preserve">in the from-scratch single points, versus m = −0.97 μ</w:t>
+      </w:r>
+      <w:r>
+        <w:rPr>
+          <w:vertAlign w:val="subscript"/>
+        </w:rPr>
+        <w:t xml:space="preserve">B</w:t>
+      </w:r>
+      <w:r>
+        <w:t xml:space="preserve">, m</w:t>
       </w:r>
       <w:r>
         <w:rPr>
@@ -6743,7 +6731,7 @@
         <w:t xml:space="preserve"> </w:t>
       </w:r>
       <w:r>
-        <w:t xml:space="preserve">= 0.00 μ</w:t>
+        <w:t xml:space="preserve">= 1.21 μ</w:t>
       </w:r>
       <w:r>
         <w:rPr>
@@ -6752,47 +6740,28 @@
         <w:t xml:space="preserve">B</w:t>
       </w:r>
       <w:r>
-        <w:t xml:space="preserve">), a total energy of −3926.66858 Ry and a Fermi energy of 8.286 eV, 0.40 eV above the PBE+U value. The shift of the printed Fermi energy is not a band-gap measurement, and the hybrid total energy is not comparable with the PBE+U totals (Section 2.8). The check establishes only that the non-magnetic pristine state survives the change of functional, which is expected for a closed-shell cell without carriers; no hybrid calculation was performed on the doped or defective cells, so the dopant contrast of Table 2 and the localisation results of Sections 3.3–3.5 have not been verified at the hybrid level.</w:t>
-      </w:r>
-      <w:r>
-        <w:t xml:space="preserve"> </w:t>
-      </w:r>
-      <w:r>
-        <w:rPr>
-          <w:bCs/>
-          <w:b/>
-        </w:rPr>
-        <w:t xml:space="preserve">[AUTHOR ACTION: if the HSE06 result is retained, report the PBE+U and HSE06 band gaps of the pristine cell from the eigenvalues and resolve the pseudopotential question raised in Section 2.8.]</w:t>
-      </w:r>
-    </w:p>
-    <w:p>
-      <w:pPr>
-        <w:pStyle w:val="BodyText"/>
-      </w:pPr>
-      <w:r>
-        <w:rPr>
-          <w:bCs/>
-          <w:b/>
-        </w:rPr>
-        <w:t xml:space="preserve">3.7 Sensitivity tests</w:t>
-      </w:r>
-    </w:p>
-    <w:p>
-      <w:pPr>
-        <w:pStyle w:val="BodyText"/>
-      </w:pPr>
-      <w:r>
-        <w:rPr>
-          <w:iCs/>
-          <w:i/>
-        </w:rPr>
-        <w:t xml:space="preserve">Hubbard U.</w:t>
-      </w:r>
-      <w:r>
-        <w:t xml:space="preserve"> </w:t>
-      </w:r>
-      <w:r>
-        <w:t xml:space="preserve">Single-point calculations at U(Ti-3d) = 3.0, 4.0 and 4.5 eV on the production Pristine_perfect, Pr_VO and Rb_VO geometries (Table S1) leave the magnetisations unchanged in kind. Pr_VO is non-magnetic at every U, and Rb_VO carries one unpaired spin at every U (m = 1.00 μ</w:t>
+        <w:t xml:space="preserve"> </w:t>
+      </w:r>
+      <w:r>
+        <w:t xml:space="preserve">in the final relaxation step at U = 3.5 eV; see Section 3.3 for the two solutions). The printed Fermi energies of Pr_VO and Rb_VO vary by at most 0.26 eV across the 1.5 eV range; that of the insulating pristine cell lies in the gap and is not a physical level (Section 3.6). The total energies vary smoothly with U, by 6.1–6.6 eV per 0.5 eV step in all three cells. The qualitative Pr/Rb distinction in spin state is therefore not tied to the particular U(Ti-3d) used at fixed geometry; formation energies were not recomputed in the sweep.</w:t>
+      </w:r>
+    </w:p>
+    <w:p>
+      <w:pPr>
+        <w:pStyle w:val="BodyText"/>
+      </w:pPr>
+      <w:r>
+        <w:rPr>
+          <w:iCs/>
+          <w:i/>
+        </w:rPr>
+        <w:t xml:space="preserve">k-mesh.</w:t>
+      </w:r>
+      <w:r>
+        <w:t xml:space="preserve"> </w:t>
+      </w:r>
+      <w:r>
+        <w:t xml:space="preserve">For Pristine_perfect, Pr_VO and Rb_VO the total energy was computed at Γ, 2×2×1, 2×2×2 and 3×3×2 meshes at U = 3.5 eV. The Γ-only energies differ from the 3×3×2 values by 1.05, 1.08 and 1.16 eV per cell (22, 23 and 25 meV per atom), whereas the 2×2×1 energies are within 1.15, 1.05 and 0.42 meV per atom of 3×3×2. The Γ-only energies lie below the 3×3×2 values, and the 2×2×2 energies of the same series lie 0.2, 1.5 and 2.1 meV per atom above them for Pr_VO, Rb_VO and Pristine_perfect (Table S2a), so convergence beyond 2×2×1 is at the 1–2 meV per atom level and is not monotonic across mesh families. The Γ-only production energies are therefore not converged in absolute terms, and the formation energies of Table 2 rely on cancellation between the perfect and defective cell of the same host rather than on convergence of each total energy. The 2×2×2 column of Table 2 quantifies the residual: −0.10 eV (Pr), −0.14 eV (Rb) and +0.04 eV on their difference. Because the k-mesh single points start from scratch, the Γ-to-2×2×2 shifts include the differences between the from-scratch and relaxation-endpoint solutions at Γ (0.038 eV for Pr_VO and 6.4 meV for Rb_VO, Table S2a), which lie within the stated mesh dependence. A complete formation-energy cycle exists only at Γ and, for the doped hosts, at 2×2×2. The total magnetisations are mesh-independent: 0.00 μ</w:t>
       </w:r>
       <w:r>
         <w:rPr>
@@ -6804,7 +6773,7 @@
         <w:t xml:space="preserve"> </w:t>
       </w:r>
       <w:r>
-        <w:t xml:space="preserve">in the from-scratch single points, versus m = −0.97 μ</w:t>
+        <w:t xml:space="preserve">for Pristine_perfect and Pr_VO and 0.99–1.00 μ</w:t>
       </w:r>
       <w:r>
         <w:rPr>
@@ -6813,6 +6782,114 @@
         <w:t xml:space="preserve">B</w:t>
       </w:r>
       <w:r>
+        <w:t xml:space="preserve"> </w:t>
+      </w:r>
+      <w:r>
+        <w:t xml:space="preserve">for Rb_VO at every mesh, the latter being the from-scratch Rb_VO solution of Section 3.3.</w:t>
+      </w:r>
+    </w:p>
+    <w:p>
+      <w:pPr>
+        <w:pStyle w:val="BodyText"/>
+      </w:pPr>
+      <w:r>
+        <w:rPr>
+          <w:iCs/>
+          <w:i/>
+        </w:rPr>
+        <w:t xml:space="preserve">Dispersion.</w:t>
+      </w:r>
+      <w:r>
+        <w:t xml:space="preserve"> </w:t>
+      </w:r>
+      <w:r>
+        <w:t xml:space="preserve">D3(BJ) single points on the relaxed Pr_VO and Rb_VO cells gave dispersion contributions of −10.29 and −10.09 eV (Table S5). Because D3 is an additive geometric correction, the electronic part of each single point should reproduce the production total energy. It does so to 0.006 eV for Rb_VO but lies 0.038 eV above the production value for Pr_VO. The electronic part of the Pr_VO D3 single point is identical, to 10</w:t>
+      </w:r>
+      <w:r>
+        <w:rPr>
+          <w:vertAlign w:val="superscript"/>
+        </w:rPr>
+        <w:t xml:space="preserve">−5</w:t>
+      </w:r>
+      <w:r>
+        <w:t xml:space="preserve"> </w:t>
+      </w:r>
+      <w:r>
+        <w:t xml:space="preserve">Ry, to the from-scratch Γ single point of the k-mesh series (Table S2a), so the offset belongs to the from-scratch SCF solution of the smeared Pr_VO cell and not to the D3 term. The dispersion energies of the perfect substituted cells and of the O</w:t>
+      </w:r>
+      <w:r>
+        <w:rPr>
+          <w:vertAlign w:val="subscript"/>
+        </w:rPr>
+        <w:t xml:space="preserve">2</w:t>
+      </w:r>
+      <w:r>
+        <w:t xml:space="preserve"> </w:t>
+      </w:r>
+      <w:r>
+        <w:t xml:space="preserve">reference were not computed, so the dispersion correction to E</w:t>
+      </w:r>
+      <w:r>
+        <w:rPr>
+          <w:vertAlign w:val="subscript"/>
+        </w:rPr>
+        <w:t xml:space="preserve">f</w:t>
+      </w:r>
+      <w:r>
+        <w:t xml:space="preserve">(V</w:t>
+      </w:r>
+      <w:r>
+        <w:rPr>
+          <w:vertAlign w:val="subscript"/>
+        </w:rPr>
+        <w:t xml:space="preserve">O</w:t>
+      </w:r>
+      <w:r>
+        <w:t xml:space="preserve">) and to ΔE</w:t>
+      </w:r>
+      <w:r>
+        <w:rPr>
+          <w:vertAlign w:val="subscript"/>
+        </w:rPr>
+        <w:t xml:space="preserve">f</w:t>
+      </w:r>
+      <w:r>
+        <w:t xml:space="preserve"> </w:t>
+      </w:r>
+      <w:r>
+        <w:t xml:space="preserve">cannot be reconstructed from these results: the correction to the contrast requires [D3(Pr_VO) − D3(Pr_perfect)] − [D3(Rb_VO) − D3(Rb_perfect)], of which only the two defective-cell terms are available. The effect of dispersion on the vacancy energetics is therefore undetermined. The D3 single points give m = 0.00 μ</w:t>
+      </w:r>
+      <w:r>
+        <w:rPr>
+          <w:vertAlign w:val="subscript"/>
+        </w:rPr>
+        <w:t xml:space="preserve">B</w:t>
+      </w:r>
+      <w:r>
+        <w:t xml:space="preserve"> </w:t>
+      </w:r>
+      <w:r>
+        <w:t xml:space="preserve">(Pr_VO) and 1.00 μ</w:t>
+      </w:r>
+      <w:r>
+        <w:rPr>
+          <w:vertAlign w:val="subscript"/>
+        </w:rPr>
+        <w:t xml:space="preserve">B</w:t>
+      </w:r>
+      <w:r>
+        <w:t xml:space="preserve"> </w:t>
+      </w:r>
+      <w:r>
+        <w:t xml:space="preserve">(Rb_VO) and Fermi energies within 0.02 eV of the production values; the Rb_VO value is the from-scratch solution discussed in Section 3.3, not the production solution (m = −0.97 μ</w:t>
+      </w:r>
+      <w:r>
+        <w:rPr>
+          <w:vertAlign w:val="subscript"/>
+        </w:rPr>
+        <w:t xml:space="preserve">B</w:t>
+      </w:r>
+      <w:r>
         <w:t xml:space="preserve">, m</w:t>
       </w:r>
       <w:r>
@@ -6834,28 +6911,155 @@
         <w:t xml:space="preserve">B</w:t>
       </w:r>
       <w:r>
-        <w:t xml:space="preserve"> </w:t>
-      </w:r>
-      <w:r>
-        <w:t xml:space="preserve">in the final relaxation step at U = 3.5 eV; see Section 3.3 for the two solutions). The printed Fermi energies of Pr_VO and Rb_VO vary by at most 0.26 eV across the 1.5 eV range; that of the insulating pristine cell lies in the gap and is not a physical level (Section 3.6). The total energies vary smoothly with U, by 6.1–6.6 eV per 0.5 eV step in all three cells. The qualitative Pr/Rb distinction in spin state is therefore not tied to the particular U(Ti-3d) used at fixed geometry; formation energies were not recomputed in the sweep.</w:t>
-      </w:r>
-    </w:p>
-    <w:p>
-      <w:pPr>
-        <w:pStyle w:val="BodyText"/>
-      </w:pPr>
-      <w:r>
-        <w:rPr>
-          <w:iCs/>
-          <w:i/>
-        </w:rPr>
-        <w:t xml:space="preserve">k-mesh.</w:t>
-      </w:r>
-      <w:r>
-        <w:t xml:space="preserve"> </w:t>
-      </w:r>
-      <w:r>
-        <w:t xml:space="preserve">For Pristine_perfect, Pr_VO and Rb_VO the total energy was computed at Γ, 2×2×1, 2×2×2 and 3×3×2 meshes at U = 3.5 eV. The Γ-only energies differ from the 3×3×2 values by 1.05, 1.08 and 1.16 eV per cell (22, 23 and 25 meV per atom), whereas the 2×2×1 energies are within 1.15, 1.05 and 0.42 meV per atom of 3×3×2. The Γ-only energies lie below the 3×3×2 values, and the 2×2×2 energies of the same series lie 0.2, 1.5 and 2.1 meV per atom above them for Pr_VO, Rb_VO and Pristine_perfect (Table S2a), so convergence beyond 2×2×1 is at the 1–2 meV per atom level and is not monotonic across mesh families. The Γ-only production energies are therefore not converged in absolute terms, and the formation energies of Table 2 rely on cancellation between the perfect and defective cell of the same host rather than on convergence of each total energy. The 2×2×2 column of Table 2 quantifies the residual: −0.10 eV (Pr), −0.14 eV (Rb) and +0.04 eV on their difference. Because the k-mesh single points start from scratch, the Γ-to-2×2×2 shifts include the differences between the from-scratch and relaxation-endpoint solutions at Γ (0.038 eV for Pr_VO and 6.4 meV for Rb_VO, Table S2a), which lie within the stated mesh dependence. A complete formation-energy cycle exists only at Γ and, for the doped hosts, at 2×2×2. The total magnetisations are mesh-independent: 0.00 μ</w:t>
+        <w:t xml:space="preserve">).</w:t>
+      </w:r>
+      <w:r>
+        <w:t xml:space="preserve"> </w:t>
+      </w:r>
+      <w:r>
+        <w:rPr>
+          <w:bCs/>
+          <w:b/>
+        </w:rPr>
+        <w:t xml:space="preserve">[AUTHOR ACTION: run D3 single points on Pr_perfect, Rb_perfect and the O</w:t>
+      </w:r>
+      <w:r>
+        <w:rPr>
+          <w:vertAlign w:val="subscript"/>
+          <w:bCs/>
+          <w:b/>
+        </w:rPr>
+        <w:t xml:space="preserve">2</w:t>
+      </w:r>
+      <w:r>
+        <w:rPr>
+          <w:bCs/>
+          <w:b/>
+        </w:rPr>
+        <w:t xml:space="preserve"> </w:t>
+      </w:r>
+      <w:r>
+        <w:rPr>
+          <w:bCs/>
+          <w:b/>
+        </w:rPr>
+        <w:t xml:space="preserve">reference (about 6 h per cell on the hardware listed in Table S6) so that both the individual formation energies and their difference can be corrected, or delete this paragraph.]</w:t>
+      </w:r>
+    </w:p>
+    <w:p>
+      <w:pPr>
+        <w:pStyle w:val="BodyText"/>
+      </w:pPr>
+      <w:r>
+        <w:rPr>
+          <w:iCs/>
+          <w:i/>
+        </w:rPr>
+        <w:t xml:space="preserve">Alternative vacancy sites in the Pr cell.</w:t>
+      </w:r>
+      <w:r>
+        <w:t xml:space="preserve"> </w:t>
+      </w:r>
+      <w:r>
+        <w:t xml:space="preserve">Three further Pr_VO cells were relaxed with the vacancy at the oxygen indices O1, O7 and O17 of the production input (Table S4). Sites O1 and O17 are symmetry-equivalent second-shell positions (Pr–O = 3.99 Å) and give E</w:t>
+      </w:r>
+      <w:r>
+        <w:rPr>
+          <w:vertAlign w:val="subscript"/>
+        </w:rPr>
+        <w:t xml:space="preserve">f</w:t>
+      </w:r>
+      <w:r>
+        <w:t xml:space="preserve"> </w:t>
+      </w:r>
+      <w:r>
+        <w:t xml:space="preserve">= +2.07 eV each, agreeing to 0.1 meV; the more distant site O7 (4.94 Å) gives +2.72 eV. The production site is thus the lowest of the four sampled sites by 0.78 eV. This is a comparison among selected configurations in a 2×2×1 cell, where</w:t>
+      </w:r>
+      <w:r>
+        <w:t xml:space="preserve"> </w:t>
+      </w:r>
+      <w:r>
+        <w:t xml:space="preserve">“</w:t>
+      </w:r>
+      <w:r>
+        <w:t xml:space="preserve">distant</w:t>
+      </w:r>
+      <w:r>
+        <w:t xml:space="preserve">”</w:t>
+      </w:r>
+      <w:r>
+        <w:t xml:space="preserve"> </w:t>
+      </w:r>
+      <w:r>
+        <w:t xml:space="preserve">sites are still within one lattice parameter of the periodic images of the dopant. It indicates a preference for the production site over the two more distant positions sampled but is not a global search. The production site is itself a first-shell oxygen of the dopant site (Section 2.3); a second first-shell candidate was not computed, site multiplicities are not given, and no corresponding sampling was performed for the Rb cell. The positions of the removed oxygens are listed in Table S4.</w:t>
+      </w:r>
+      <w:r>
+        <w:t xml:space="preserve"> </w:t>
+      </w:r>
+      <w:r>
+        <w:rPr>
+          <w:bCs/>
+          <w:b/>
+        </w:rPr>
+        <w:t xml:space="preserve">[AUTHOR ACTION: if possible, add two Rb_VO sites (a second first-shell and a second-shell oxygen).]</w:t>
+      </w:r>
+    </w:p>
+    <w:p>
+      <w:pPr>
+        <w:pStyle w:val="BodyText"/>
+      </w:pPr>
+      <w:r>
+        <w:rPr>
+          <w:iCs/>
+          <w:i/>
+        </w:rPr>
+        <w:t xml:space="preserve">Bader charges.</w:t>
+      </w:r>
+      <w:r>
+        <w:t xml:space="preserve"> </w:t>
+      </w:r>
+      <w:r>
+        <w:t xml:space="preserve">Bader analysis of the relaxed Pr_VO and Rb_VO cells (Table S3) gives dopant charges of +2.14 e (Pr) and +0.82 e (Rb) relative to the PAW valence, consistent with the +3 and +1 formal states after the usual reduction of Bader charges relative to formal values.</w:t>
+      </w:r>
+      <w:r>
+        <w:t xml:space="preserve"> </w:t>
+      </w:r>
+      <w:r>
+        <w:rPr>
+          <w:bCs/>
+          <w:b/>
+        </w:rPr>
+        <w:t xml:space="preserve">[AUTHOR ACTION: these two values are inconsistent with the mean Ti and O populations of Table S3, from which the sum rule gives +2.04 e (Pr) and +0.87 e (Rb); re-extract all four numbers from ACF.dat. Also state that the two cells share the same atom ordering and which oxygen index was removed in each, and report the grid used; Bader grid convergence was not tested. ]</w:t>
+      </w:r>
+      <w:r>
+        <w:t xml:space="preserve"> </w:t>
+      </w:r>
+      <w:r>
+        <w:t xml:space="preserve">Relative to the Pr_VO cell, the 31 oxygen atoms of Rb_VO hold 0.97 e less in total, with the depletion concentrated on one oxygen bonded to the displaced Rb ion (−0.26 e, O8; Rb–O8 = 2.56 Å, 3.40 Å from the vacant site) and a second oxygen (−0.14 e, O30; 3.07 Å from Rb), five further oxygens contributing −0.05 to −0.09 e each. The 15 Ti atoms show a uniform mean depletion of −0.012 e (−0.18 e in total) and no Ti differs by more than 0.05 e. No Ti site shows the excess of a few tenths of an electron, relative to the other Ti sites, that a localised Ti</w:t>
+      </w:r>
+      <w:r>
+        <w:rPr>
+          <w:vertAlign w:val="superscript"/>
+        </w:rPr>
+        <w:t xml:space="preserve">3+</w:t>
+      </w:r>
+      <w:r>
+        <w:t xml:space="preserve"> </w:t>
+      </w:r>
+      <w:r>
+        <w:t xml:space="preserve">centre would produce, although the expected size of that signal was not calibrated on a reference cell containing a Ti</w:t>
+      </w:r>
+      <w:r>
+        <w:rPr>
+          <w:vertAlign w:val="superscript"/>
+        </w:rPr>
+        <w:t xml:space="preserve">3+</w:t>
+      </w:r>
+      <w:r>
+        <w:t xml:space="preserve"> </w:t>
+      </w:r>
+      <w:r>
+        <w:t xml:space="preserve">centre, so the test is indicative rather than decisive. The comparison is between cells of different composition, so the differences contain chemical polarisation by the dopant as well as carrier redistribution, and Bader charges are not orbital occupations; the two cells also differ by two carriers (the net excess electron of Pr_VO and the residual hole of Rb_VO, Table 1), whose contributions to the oxygen depletion this comparison cannot separate; the result is therefore compatible with an oxygen-centred hole in Rb_VO, but it is not a hole count and carries no spin information. The Löwdin analysis of Section 3.6 supplies the spin information: the oxygen with the largest Bader depletion, O8, also carries the largest spin moment (+0.59 μ</w:t>
       </w:r>
       <w:r>
         <w:rPr>
@@ -6864,52 +7068,85 @@
         <w:t xml:space="preserve">B</w:t>
       </w:r>
       <w:r>
-        <w:t xml:space="preserve"> </w:t>
-      </w:r>
-      <w:r>
-        <w:t xml:space="preserve">for Pristine_perfect and Pr_VO and 0.99–1.00 μ</w:t>
-      </w:r>
-      <w:r>
-        <w:rPr>
-          <w:vertAlign w:val="subscript"/>
-        </w:rPr>
-        <w:t xml:space="preserve">B</w:t>
-      </w:r>
-      <w:r>
-        <w:t xml:space="preserve"> </w:t>
-      </w:r>
-      <w:r>
-        <w:t xml:space="preserve">for Rb_VO at every mesh, the latter being the from-scratch Rb_VO solution of Section 3.3.</w:t>
-      </w:r>
-    </w:p>
-    <w:p>
-      <w:pPr>
-        <w:pStyle w:val="BodyText"/>
-      </w:pPr>
-      <w:r>
-        <w:rPr>
-          <w:iCs/>
-          <w:i/>
-        </w:rPr>
-        <w:t xml:space="preserve">Dispersion.</w:t>
-      </w:r>
-      <w:r>
-        <w:t xml:space="preserve"> </w:t>
-      </w:r>
-      <w:r>
-        <w:t xml:space="preserve">D3(BJ) single points on the relaxed Pr_VO and Rb_VO cells gave dispersion contributions of −10.29 and −10.09 eV (Table S5). Because D3 is an additive geometric correction, the electronic part of each single point should reproduce the production total energy. It does so to 0.006 eV for Rb_VO but lies 0.038 eV above the production value for Pr_VO. The electronic part of the Pr_VO D3 single point is identical, to 10</w:t>
+        <w:t xml:space="preserve">). A same-composition comparison (Rb_VO at q = 0 versus q = +1, or the spin density itself) would be more direct.</w:t>
+      </w:r>
+    </w:p>
+    <w:p>
+      <w:pPr>
+        <w:pStyle w:val="BodyText"/>
+      </w:pPr>
+      <w:r>
+        <w:rPr>
+          <w:bCs/>
+          <w:b/>
+        </w:rPr>
+        <w:t xml:space="preserve">4. Discussion</w:t>
+      </w:r>
+    </w:p>
+    <w:p>
+      <w:pPr>
+        <w:pStyle w:val="BodyText"/>
+      </w:pPr>
+      <w:r>
+        <w:rPr>
+          <w:bCs/>
+          <w:b/>
+        </w:rPr>
+        <w:t xml:space="preserve">4.1 The energetic ordering follows the formal electron count.</w:t>
+      </w:r>
+      <w:r>
+        <w:t xml:space="preserve"> </w:t>
+      </w:r>
+      <w:r>
+        <w:t xml:space="preserve">The three formation energies of Table 2 fall in the order pristine (+4.74 eV) &gt; Pr (+1.29 eV) &gt; Rb (−4.06 eV), which is the order of the formal hole count of the vacancy-free cells (0, 1, 3; Table 1) and also of increasing cation radius (Section 4.3). A neutral vacancy releases two electrons. In the pristine cell both must occupy conduction-band-derived states, and the full cost of oxygen removal is paid. In the Pr cell one of the two can instead fill the single acceptor-like hole introduced by Pr</w:t>
       </w:r>
       <w:r>
         <w:rPr>
           <w:vertAlign w:val="superscript"/>
         </w:rPr>
-        <w:t xml:space="preserve">−5</w:t>
-      </w:r>
-      <w:r>
-        <w:t xml:space="preserve"> </w:t>
-      </w:r>
-      <w:r>
-        <w:t xml:space="preserve">Ry, to the from-scratch Γ single point of the k-mesh series (Table S2a), so the offset belongs to the from-scratch SCF solution of the smeared Pr_VO cell and not to the D3 term. The dispersion energies of the perfect substituted cells and of the O</w:t>
+        <w:t xml:space="preserve">3+</w:t>
+      </w:r>
+      <w:r>
+        <w:t xml:space="preserve">, and in the Rb cell both can fill two of the three holes introduced by Rb</w:t>
+      </w:r>
+      <w:r>
+        <w:rPr>
+          <w:vertAlign w:val="superscript"/>
+        </w:rPr>
+        <w:t xml:space="preserve">+</w:t>
+      </w:r>
+      <w:r>
+        <w:t xml:space="preserve">. Transferring an electron from a conduction-band-like state to an oxygen-2p-derived hole near the valence-band edge recovers an energy of the order of the band gap, so reductions of a few eV per transferred electron are expected; the reductions found (3.45 eV for one electron in the Pr cell, 8.81 eV for two in the Rb cell) are of that order but not equal per electron. The valence-to-conduction-band separation in the projected densities of states of the two vacancy cells is about 2.4–2.5 eV (Section 3.6), smaller than either per-electron reduction (3.45 eV for Pr, 4.40 eV per electron for Rb), so electron transfer across the gap does not account for the reductions on its own. The remainder must come from the electrostatic interaction between the vacancy and the dopant, which the dependence of E</w:t>
+      </w:r>
+      <w:r>
+        <w:rPr>
+          <w:vertAlign w:val="subscript"/>
+        </w:rPr>
+        <w:t xml:space="preserve">f</w:t>
+      </w:r>
+      <w:r>
+        <w:t xml:space="preserve"> </w:t>
+      </w:r>
+      <w:r>
+        <w:t xml:space="preserve">on the vacancy site in the Pr cell indicates (Section 3.7), and from lattice relaxation, which in the Rb cell includes a 1.27 Å displacement of the Rb ion into the space vacated by the oxygen (Section 3.1); the two-dopant design cannot decompose the formation-energy difference into these contributions.</w:t>
+      </w:r>
+    </w:p>
+    <w:p>
+      <w:pPr>
+        <w:pStyle w:val="BodyText"/>
+      </w:pPr>
+      <w:r>
+        <w:rPr>
+          <w:bCs/>
+          <w:b/>
+        </w:rPr>
+        <w:t xml:space="preserve">4.2 Relation to previous work.</w:t>
+      </w:r>
+      <w:r>
+        <w:t xml:space="preserve"> </w:t>
+      </w:r>
+      <w:r>
+        <w:t xml:space="preserve">The Rb result parallels, in anatase, the behaviour that Carey and Nolan found for alkali dopants in α-Cr</w:t>
       </w:r>
       <w:r>
         <w:rPr>
@@ -6918,10 +7155,64 @@
         <w:t xml:space="preserve">2</w:t>
       </w:r>
       <w:r>
-        <w:t xml:space="preserve"> </w:t>
-      </w:r>
-      <w:r>
-        <w:t xml:space="preserve">reference were not computed, so the dispersion correction to E</w:t>
+        <w:t xml:space="preserve">O</w:t>
+      </w:r>
+      <w:r>
+        <w:rPr>
+          <w:vertAlign w:val="subscript"/>
+        </w:rPr>
+        <w:t xml:space="preserve">3</w:t>
+      </w:r>
+      <w:r>
+        <w:t xml:space="preserve">, where the V</w:t>
+      </w:r>
+      <w:r>
+        <w:rPr>
+          <w:vertAlign w:val="subscript"/>
+        </w:rPr>
+        <w:t xml:space="preserve">O</w:t>
+      </w:r>
+      <w:r>
+        <w:t xml:space="preserve"> </w:t>
+      </w:r>
+      <w:r>
+        <w:t xml:space="preserve">formation energy is strongly reduced and oxygen holes are localised with an O-2p Hubbard term [16]. It also agrees in sign with the experimental vacancy-formation trend reported for Rb-doped TiO</w:t>
+      </w:r>
+      <w:r>
+        <w:rPr>
+          <w:vertAlign w:val="subscript"/>
+        </w:rPr>
+        <w:t xml:space="preserve">2</w:t>
+      </w:r>
+      <w:r>
+        <w:t xml:space="preserve"> </w:t>
+      </w:r>
+      <w:r>
+        <w:t xml:space="preserve">by Tian et al. [15]. Because only one alkali was studied here, the radius dependence found by Carey and Nolan across Li–Rb is not tested. The Pr result is consistent with the trivalent-dopant picture of Iwaszuk and Nolan for rutile [17]: the vacancy is not spontaneous at the oxygen-rich reference, but its cost is reduced by 3.45 eV relative to the pristine host, so vacancy formation near Pr becomes accessible as the oxygen chemical potential is lowered; one vacancy per Pr over-compensates the dopant (Table 1), and the fully compensated 2Pr</w:t>
+      </w:r>
+      <w:r>
+        <w:rPr>
+          <w:vertAlign w:val="subscript"/>
+        </w:rPr>
+        <w:t xml:space="preserve">Ti</w:t>
+      </w:r>
+      <w:r>
+        <w:t xml:space="preserve"> </w:t>
+      </w:r>
+      <w:r>
+        <w:t xml:space="preserve">+ V</w:t>
+      </w:r>
+      <w:r>
+        <w:rPr>
+          <w:vertAlign w:val="subscript"/>
+        </w:rPr>
+        <w:t xml:space="preserve">O</w:t>
+      </w:r>
+      <w:r>
+        <w:t xml:space="preserve"> </w:t>
+      </w:r>
+      <w:r>
+        <w:t xml:space="preserve">configuration that corresponds to vacancy compensation of a trivalent dopant was not computed. With E</w:t>
       </w:r>
       <w:r>
         <w:rPr>
@@ -6939,7 +7230,124 @@
         <w:t xml:space="preserve">O</w:t>
       </w:r>
       <w:r>
-        <w:t xml:space="preserve">) and to ΔE</w:t>
+        <w:t xml:space="preserve">; Pr) = 1.29 eV + Δμ</w:t>
+      </w:r>
+      <w:r>
+        <w:rPr>
+          <w:vertAlign w:val="subscript"/>
+        </w:rPr>
+        <w:t xml:space="preserve">O</w:t>
+      </w:r>
+      <w:r>
+        <w:t xml:space="preserve">, oxygen removal near Pr has a negative formation energy once μ</w:t>
+      </w:r>
+      <w:r>
+        <w:rPr>
+          <w:vertAlign w:val="subscript"/>
+        </w:rPr>
+        <w:t xml:space="preserve">O</w:t>
+      </w:r>
+      <w:r>
+        <w:t xml:space="preserve"> </w:t>
+      </w:r>
+      <w:r>
+        <w:t xml:space="preserve">falls more than 1.29 eV below ½E(O</w:t>
+      </w:r>
+      <w:r>
+        <w:rPr>
+          <w:vertAlign w:val="subscript"/>
+        </w:rPr>
+        <w:t xml:space="preserve">2</w:t>
+      </w:r>
+      <w:r>
+        <w:t xml:space="preserve">), a threshold that carries the common offset of the PBE O</w:t>
+      </w:r>
+      <w:r>
+        <w:rPr>
+          <w:vertAlign w:val="subscript"/>
+        </w:rPr>
+        <w:t xml:space="preserve">2</w:t>
+      </w:r>
+      <w:r>
+        <w:t xml:space="preserve"> </w:t>
+      </w:r>
+      <w:r>
+        <w:t xml:space="preserve">reference (Section 2.7); whether that lies within the stability field of TiO</w:t>
+      </w:r>
+      <w:r>
+        <w:rPr>
+          <w:vertAlign w:val="subscript"/>
+        </w:rPr>
+        <w:t xml:space="preserve">2</w:t>
+      </w:r>
+      <w:r>
+        <w:t xml:space="preserve"> </w:t>
+      </w:r>
+      <w:r>
+        <w:t xml:space="preserve">against lower oxides was not evaluated (Section 5). The spin polarisation of the Pr-induced hole when an oxygen-site U is present parallels the oxygen-hole states reported for trivalent dopants in rutile by Iwaszuk and Nolan [17].</w:t>
+      </w:r>
+    </w:p>
+    <w:p>
+      <w:pPr>
+        <w:pStyle w:val="BodyText"/>
+      </w:pPr>
+      <w:r>
+        <w:rPr>
+          <w:bCs/>
+          <w:b/>
+        </w:rPr>
+        <w:t xml:space="preserve">4.3 What the two-dopant comparison does and does not isolate.</w:t>
+      </w:r>
+      <w:r>
+        <w:t xml:space="preserve"> </w:t>
+      </w:r>
+      <w:r>
+        <w:t xml:space="preserve">Pr</w:t>
+      </w:r>
+      <w:r>
+        <w:rPr>
+          <w:vertAlign w:val="superscript"/>
+        </w:rPr>
+        <w:t xml:space="preserve">3+</w:t>
+      </w:r>
+      <w:r>
+        <w:t xml:space="preserve"> </w:t>
+      </w:r>
+      <w:r>
+        <w:t xml:space="preserve">and Rb</w:t>
+      </w:r>
+      <w:r>
+        <w:rPr>
+          <w:vertAlign w:val="superscript"/>
+        </w:rPr>
+        <w:t xml:space="preserve">+</w:t>
+      </w:r>
+      <w:r>
+        <w:t xml:space="preserve"> </w:t>
+      </w:r>
+      <w:r>
+        <w:t xml:space="preserve">differ in formal charge (−1 versus −3 e relative to Ti</w:t>
+      </w:r>
+      <w:r>
+        <w:rPr>
+          <w:vertAlign w:val="superscript"/>
+        </w:rPr>
+        <w:t xml:space="preserve">4+</w:t>
+      </w:r>
+      <w:r>
+        <w:t xml:space="preserve">), in ionic radius (0.99 versus 1.52 Å [26]), in bonding (a 5d-bearing trivalent cation versus a closed-shell alkali) and in accessible oxidation states. Both are larger than Ti</w:t>
+      </w:r>
+      <w:r>
+        <w:rPr>
+          <w:vertAlign w:val="superscript"/>
+        </w:rPr>
+        <w:t xml:space="preserve">4+</w:t>
+      </w:r>
+      <w:r>
+        <w:t xml:space="preserve"> </w:t>
+      </w:r>
+      <w:r>
+        <w:t xml:space="preserve">(0.605 Å), so the comparison does show that a large size mismatch is compatible with either sign of E</w:t>
       </w:r>
       <w:r>
         <w:rPr>
@@ -6948,188 +7356,16 @@
         <w:t xml:space="preserve">f</w:t>
       </w:r>
       <w:r>
-        <w:t xml:space="preserve"> </w:t>
-      </w:r>
-      <w:r>
-        <w:t xml:space="preserve">cannot be reconstructed from these results: the correction to the contrast requires [D3(Pr_VO) − D3(Pr_perfect)] − [D3(Rb_VO) − D3(Rb_perfect)], of which only the two defective-cell terms are available. The effect of dispersion on the vacancy energetics is therefore undetermined. The D3 single points give m = 0.00 μ</w:t>
-      </w:r>
-      <w:r>
-        <w:rPr>
-          <w:vertAlign w:val="subscript"/>
-        </w:rPr>
-        <w:t xml:space="preserve">B</w:t>
-      </w:r>
-      <w:r>
-        <w:t xml:space="preserve"> </w:t>
-      </w:r>
-      <w:r>
-        <w:t xml:space="preserve">(Pr_VO) and 1.00 μ</w:t>
-      </w:r>
-      <w:r>
-        <w:rPr>
-          <w:vertAlign w:val="subscript"/>
-        </w:rPr>
-        <w:t xml:space="preserve">B</w:t>
-      </w:r>
-      <w:r>
-        <w:t xml:space="preserve"> </w:t>
-      </w:r>
-      <w:r>
-        <w:t xml:space="preserve">(Rb_VO) and Fermi energies within 0.02 eV of the production values; the Rb_VO value is the from-scratch solution discussed in Section 3.3, not the production solution (m = −0.97 μ</w:t>
-      </w:r>
-      <w:r>
-        <w:rPr>
-          <w:vertAlign w:val="subscript"/>
-        </w:rPr>
-        <w:t xml:space="preserve">B</w:t>
-      </w:r>
-      <w:r>
-        <w:t xml:space="preserve">, m</w:t>
-      </w:r>
-      <w:r>
-        <w:rPr>
-          <w:vertAlign w:val="subscript"/>
-        </w:rPr>
-        <w:t xml:space="preserve">abs</w:t>
-      </w:r>
-      <w:r>
-        <w:t xml:space="preserve"> </w:t>
-      </w:r>
-      <w:r>
-        <w:t xml:space="preserve">= 1.21 μ</w:t>
-      </w:r>
-      <w:r>
-        <w:rPr>
-          <w:vertAlign w:val="subscript"/>
-        </w:rPr>
-        <w:t xml:space="preserve">B</w:t>
-      </w:r>
-      <w:r>
-        <w:t xml:space="preserve">).</w:t>
-      </w:r>
-      <w:r>
-        <w:t xml:space="preserve"> </w:t>
-      </w:r>
-      <w:r>
-        <w:rPr>
-          <w:bCs/>
-          <w:b/>
-        </w:rPr>
-        <w:t xml:space="preserve">[AUTHOR ACTION: run D3 single points on Pr_perfect, Rb_perfect and the O</w:t>
-      </w:r>
-      <w:r>
-        <w:rPr>
-          <w:vertAlign w:val="subscript"/>
-          <w:bCs/>
-          <w:b/>
-        </w:rPr>
-        <w:t xml:space="preserve">2</w:t>
-      </w:r>
-      <w:r>
-        <w:rPr>
-          <w:bCs/>
-          <w:b/>
-        </w:rPr>
-        <w:t xml:space="preserve"> </w:t>
-      </w:r>
-      <w:r>
-        <w:rPr>
-          <w:bCs/>
-          <w:b/>
-        </w:rPr>
-        <w:t xml:space="preserve">reference (about 6 h per cell on the hardware listed in Table S6) so that both the individual formation energies and their difference can be corrected, or delete this paragraph.]</w:t>
-      </w:r>
-    </w:p>
-    <w:p>
-      <w:pPr>
-        <w:pStyle w:val="BodyText"/>
-      </w:pPr>
-      <w:r>
-        <w:rPr>
-          <w:iCs/>
-          <w:i/>
-        </w:rPr>
-        <w:t xml:space="preserve">Alternative vacancy sites in the Pr cell.</w:t>
-      </w:r>
-      <w:r>
-        <w:t xml:space="preserve"> </w:t>
-      </w:r>
-      <w:r>
-        <w:t xml:space="preserve">Three further Pr_VO cells were relaxed with the vacancy at the oxygen indices O1, O7 and O17 of the production input (Table S4). Sites O1 and O17 are symmetry-equivalent second-shell positions (Pr–O = 3.99 Å) and give E</w:t>
-      </w:r>
-      <w:r>
-        <w:rPr>
-          <w:vertAlign w:val="subscript"/>
-        </w:rPr>
-        <w:t xml:space="preserve">f</w:t>
-      </w:r>
-      <w:r>
-        <w:t xml:space="preserve"> </w:t>
-      </w:r>
-      <w:r>
-        <w:t xml:space="preserve">= +2.07 eV each, agreeing to 0.1 meV; the more distant site O7 (4.94 Å) gives +2.72 eV. The production site is thus the lowest of the four sampled sites by 0.78 eV. This is a comparison among selected configurations in a 2×2×1 cell, where</w:t>
-      </w:r>
-      <w:r>
-        <w:t xml:space="preserve"> </w:t>
-      </w:r>
-      <w:r>
-        <w:t xml:space="preserve">“</w:t>
-      </w:r>
-      <w:r>
-        <w:t xml:space="preserve">distant</w:t>
-      </w:r>
-      <w:r>
-        <w:t xml:space="preserve">”</w:t>
-      </w:r>
-      <w:r>
-        <w:t xml:space="preserve"> </w:t>
-      </w:r>
-      <w:r>
-        <w:t xml:space="preserve">sites are still within one lattice parameter of the periodic images of the dopant. It indicates a preference for the production site over the two more distant positions sampled but is not a global search. The production site is itself a first-shell oxygen of the dopant site (Section 2.3); a second first-shell candidate was not computed, site multiplicities are not given, and no corresponding sampling was performed for the Rb cell. The positions of the removed oxygens are listed in Table S4.</w:t>
-      </w:r>
-      <w:r>
-        <w:t xml:space="preserve"> </w:t>
-      </w:r>
-      <w:r>
-        <w:rPr>
-          <w:bCs/>
-          <w:b/>
-        </w:rPr>
-        <w:t xml:space="preserve">[AUTHOR ACTION: if possible, add two Rb_VO sites (a second first-shell and a second-shell oxygen).]</w:t>
-      </w:r>
-    </w:p>
-    <w:p>
-      <w:pPr>
-        <w:pStyle w:val="BodyText"/>
-      </w:pPr>
-      <w:r>
-        <w:rPr>
-          <w:iCs/>
-          <w:i/>
-        </w:rPr>
-        <w:t xml:space="preserve">Bader charges.</w:t>
-      </w:r>
-      <w:r>
-        <w:t xml:space="preserve"> </w:t>
-      </w:r>
-      <w:r>
-        <w:t xml:space="preserve">Bader analysis of the relaxed Pr_VO and Rb_VO cells (Table S3) gives dopant charges of +2.14 e (Pr) and +0.82 e (Rb) relative to the PAW valence, consistent with the +3 and +1 formal states after the usual reduction of Bader charges relative to formal values.</w:t>
-      </w:r>
-      <w:r>
-        <w:t xml:space="preserve"> </w:t>
-      </w:r>
-      <w:r>
-        <w:rPr>
-          <w:bCs/>
-          <w:b/>
-        </w:rPr>
-        <w:t xml:space="preserve">[AUTHOR ACTION: these two values are inconsistent with the mean Ti and O populations of Table S3, from which the sum rule gives +2.04 e (Pr) and +0.87 e (Rb); re-extract all four numbers from ACF.dat. Also state that the two cells share the same atom ordering and which oxygen index was removed in each, and report the grid used; Bader grid convergence was not tested. ]</w:t>
-      </w:r>
-      <w:r>
-        <w:t xml:space="preserve"> </w:t>
-      </w:r>
-      <w:r>
-        <w:t xml:space="preserve">Relative to the Pr_VO cell, the 31 oxygen atoms of Rb_VO hold 0.97 e less in total, with the depletion concentrated on one oxygen bonded to the displaced Rb ion (−0.26 e, O8; Rb–O8 = 2.56 Å, 3.40 Å from the vacant site) and a second oxygen (−0.14 e, O30; 3.07 Å from Rb), five further oxygens contributing −0.05 to −0.09 e each. The 15 Ti atoms show a uniform mean depletion of −0.012 e (−0.18 e in total) and no Ti differs by more than 0.05 e. No Ti site shows the excess of a few tenths of an electron, relative to the other Ti sites, that a localised Ti</w:t>
+        <w:t xml:space="preserve">(V</w:t>
+      </w:r>
+      <w:r>
+        <w:rPr>
+          <w:vertAlign w:val="subscript"/>
+        </w:rPr>
+        <w:t xml:space="preserve">O</w:t>
+      </w:r>
+      <w:r>
+        <w:t xml:space="preserve">) at the oxygen-rich reference; it does not hold size constant, and no strain or fixed-geometry decomposition was computed, so the contrast cannot be apportioned between electronic and elastic contributions. What can be said is that the sign of the contrast and the size of the reductions are consistent with the electron count; because the ordering pristine &gt; Pr &gt; Rb is also the order of increasing cation radius (0.605, 0.99 and 1.52 Å) and Carey and Nolan found a radius dependence at fixed alkali valence [16], a size-based explanation of the ordering is not excluded. The relaxed Rb_VO cell gives a direct indication of the elastic part: the Rb ion moves 1.27 Å off the cation site into the space vacated by the adjacent oxygen (Section 3.1), a relaxation channel that only an adjacent vacancy opens and that a smaller ion would exploit less, but whose energy has not been separated from the electronic contribution. Isolating the two variables would require a controlled series within the same protocol, for example La</w:t>
       </w:r>
       <w:r>
         <w:rPr>
@@ -7138,10 +7374,7 @@
         <w:t xml:space="preserve">3+</w:t>
       </w:r>
       <w:r>
-        <w:t xml:space="preserve"> </w:t>
-      </w:r>
-      <w:r>
-        <w:t xml:space="preserve">centre would produce, although the expected size of that signal was not calibrated on a reference cell containing a Ti</w:t>
+        <w:t xml:space="preserve">, Y</w:t>
       </w:r>
       <w:r>
         <w:rPr>
@@ -7153,46 +7386,7 @@
         <w:t xml:space="preserve"> </w:t>
       </w:r>
       <w:r>
-        <w:t xml:space="preserve">centre, so the test is indicative rather than decisive. The comparison is between cells of different composition, so the differences contain chemical polarisation by the dopant as well as carrier redistribution, and Bader charges are not orbital occupations; the two cells also differ by two carriers (the net excess electron of Pr_VO and the residual hole of Rb_VO, Table 1), whose contributions to the oxygen depletion this comparison cannot separate; the result is therefore compatible with an oxygen-centred hole in Rb_VO, but it is not a hole count and carries no spin information. The Löwdin analysis of Section 3.6 supplies the spin information: the oxygen with the largest Bader depletion, O8, also carries the largest spin moment (+0.59 μ</w:t>
-      </w:r>
-      <w:r>
-        <w:rPr>
-          <w:vertAlign w:val="subscript"/>
-        </w:rPr>
-        <w:t xml:space="preserve">B</w:t>
-      </w:r>
-      <w:r>
-        <w:t xml:space="preserve">). A same-composition comparison (Rb_VO at q = 0 versus q = +1, or the spin density itself) would be more direct.</w:t>
-      </w:r>
-    </w:p>
-    <w:p>
-      <w:pPr>
-        <w:pStyle w:val="BodyText"/>
-      </w:pPr>
-      <w:r>
-        <w:rPr>
-          <w:bCs/>
-          <w:b/>
-        </w:rPr>
-        <w:t xml:space="preserve">4. Discussion</w:t>
-      </w:r>
-    </w:p>
-    <w:p>
-      <w:pPr>
-        <w:pStyle w:val="BodyText"/>
-      </w:pPr>
-      <w:r>
-        <w:rPr>
-          <w:bCs/>
-          <w:b/>
-        </w:rPr>
-        <w:t xml:space="preserve">4.1 The energetic ordering follows the formal electron count.</w:t>
-      </w:r>
-      <w:r>
-        <w:t xml:space="preserve"> </w:t>
-      </w:r>
-      <w:r>
-        <w:t xml:space="preserve">The three formation energies of Table 2 fall in the order pristine (+4.74 eV) &gt; Pr (+1.29 eV) &gt; Rb (−4.06 eV), which is the order of the formal hole count of the vacancy-free cells (0, 1, 3; Table 1) and also of increasing cation radius (Section 4.3). A neutral vacancy releases two electrons. In the pristine cell both must occupy conduction-band-derived states, and the full cost of oxygen removal is paid. In the Pr cell one of the two can instead fill the single acceptor-like hole introduced by Pr</w:t>
+        <w:t xml:space="preserve">and Sc</w:t>
       </w:r>
       <w:r>
         <w:rPr>
@@ -7201,348 +7395,10 @@
         <w:t xml:space="preserve">3+</w:t>
       </w:r>
       <w:r>
-        <w:t xml:space="preserve">, and in the Rb cell both can fill two of the three holes introduced by Rb</w:t>
-      </w:r>
-      <w:r>
-        <w:rPr>
-          <w:vertAlign w:val="superscript"/>
-        </w:rPr>
-        <w:t xml:space="preserve">+</w:t>
-      </w:r>
-      <w:r>
-        <w:t xml:space="preserve">. Transferring an electron from a conduction-band-like state to an oxygen-2p-derived hole near the valence-band edge recovers an energy of the order of the band gap, so reductions of a few eV per transferred electron are expected; the reductions found (3.45 eV for one electron in the Pr cell, 8.81 eV for two in the Rb cell) are of that order but not equal per electron. The valence-to-conduction-band separation in the projected densities of states of the two vacancy cells is about 2.4–2.5 eV (Section 3.6), smaller than either per-electron reduction (3.45 eV for Pr, 4.40 eV per electron for Rb), so electron transfer across the gap does not account for the reductions on its own. The remainder must come from the electrostatic interaction between the vacancy and the dopant, which the dependence of E</w:t>
-      </w:r>
-      <w:r>
-        <w:rPr>
-          <w:vertAlign w:val="subscript"/>
-        </w:rPr>
-        <w:t xml:space="preserve">f</w:t>
-      </w:r>
-      <w:r>
-        <w:t xml:space="preserve"> </w:t>
-      </w:r>
-      <w:r>
-        <w:t xml:space="preserve">on the vacancy site in the Pr cell indicates (Section 3.7), and from lattice relaxation, which in the Rb cell includes a 1.27 Å displacement of the Rb ion into the space vacated by the oxygen (Section 3.1); the two-dopant design cannot decompose the formation-energy difference into these contributions.</w:t>
-      </w:r>
-    </w:p>
-    <w:p>
-      <w:pPr>
-        <w:pStyle w:val="BodyText"/>
-      </w:pPr>
-      <w:r>
-        <w:rPr>
-          <w:bCs/>
-          <w:b/>
-        </w:rPr>
-        <w:t xml:space="preserve">4.2 Relation to previous work.</w:t>
-      </w:r>
-      <w:r>
-        <w:t xml:space="preserve"> </w:t>
-      </w:r>
-      <w:r>
-        <w:t xml:space="preserve">The Rb result parallels, in anatase, the behaviour that Carey and Nolan found for alkali dopants in α-Cr</w:t>
-      </w:r>
-      <w:r>
-        <w:rPr>
-          <w:vertAlign w:val="subscript"/>
-        </w:rPr>
-        <w:t xml:space="preserve">2</w:t>
-      </w:r>
-      <w:r>
-        <w:t xml:space="preserve">O</w:t>
-      </w:r>
-      <w:r>
-        <w:rPr>
-          <w:vertAlign w:val="subscript"/>
-        </w:rPr>
-        <w:t xml:space="preserve">3</w:t>
-      </w:r>
-      <w:r>
-        <w:t xml:space="preserve">, where the V</w:t>
-      </w:r>
-      <w:r>
-        <w:rPr>
-          <w:vertAlign w:val="subscript"/>
-        </w:rPr>
-        <w:t xml:space="preserve">O</w:t>
-      </w:r>
-      <w:r>
-        <w:t xml:space="preserve"> </w:t>
-      </w:r>
-      <w:r>
-        <w:t xml:space="preserve">formation energy is strongly reduced and oxygen holes are localised with an O-2p Hubbard term [16]. It also agrees in sign with the experimental vacancy-formation trend reported for Rb-doped TiO</w:t>
-      </w:r>
-      <w:r>
-        <w:rPr>
-          <w:vertAlign w:val="subscript"/>
-        </w:rPr>
-        <w:t xml:space="preserve">2</w:t>
-      </w:r>
-      <w:r>
-        <w:t xml:space="preserve"> </w:t>
-      </w:r>
-      <w:r>
-        <w:t xml:space="preserve">by Tian et al. [15]. Because only one alkali was studied here, the radius dependence found by Carey and Nolan across Li–Rb is not tested. The Pr result is consistent with the trivalent-dopant picture of Iwaszuk and Nolan for rutile [17]: the vacancy is not spontaneous at the oxygen-rich reference, but its cost is reduced by 3.45 eV relative to the pristine host, so vacancy formation near Pr becomes accessible as the oxygen chemical potential is lowered; one vacancy per Pr over-compensates the dopant (Table 1), and the fully compensated 2Pr</w:t>
-      </w:r>
-      <w:r>
-        <w:rPr>
-          <w:vertAlign w:val="subscript"/>
-        </w:rPr>
-        <w:t xml:space="preserve">Ti</w:t>
-      </w:r>
-      <w:r>
-        <w:t xml:space="preserve"> </w:t>
-      </w:r>
-      <w:r>
-        <w:t xml:space="preserve">+ V</w:t>
-      </w:r>
-      <w:r>
-        <w:rPr>
-          <w:vertAlign w:val="subscript"/>
-        </w:rPr>
-        <w:t xml:space="preserve">O</w:t>
-      </w:r>
-      <w:r>
-        <w:t xml:space="preserve"> </w:t>
-      </w:r>
-      <w:r>
-        <w:t xml:space="preserve">configuration that corresponds to vacancy compensation of a trivalent dopant was not computed. With E</w:t>
-      </w:r>
-      <w:r>
-        <w:rPr>
-          <w:vertAlign w:val="subscript"/>
-        </w:rPr>
-        <w:t xml:space="preserve">f</w:t>
-      </w:r>
-      <w:r>
-        <w:t xml:space="preserve">(V</w:t>
-      </w:r>
-      <w:r>
-        <w:rPr>
-          <w:vertAlign w:val="subscript"/>
-        </w:rPr>
-        <w:t xml:space="preserve">O</w:t>
-      </w:r>
-      <w:r>
-        <w:t xml:space="preserve">; Pr) = 1.29 eV + Δμ</w:t>
-      </w:r>
-      <w:r>
-        <w:rPr>
-          <w:vertAlign w:val="subscript"/>
-        </w:rPr>
-        <w:t xml:space="preserve">O</w:t>
-      </w:r>
-      <w:r>
-        <w:t xml:space="preserve">, oxygen removal near Pr has a negative formation energy once μ</w:t>
-      </w:r>
-      <w:r>
-        <w:rPr>
-          <w:vertAlign w:val="subscript"/>
-        </w:rPr>
-        <w:t xml:space="preserve">O</w:t>
-      </w:r>
-      <w:r>
-        <w:t xml:space="preserve"> </w:t>
-      </w:r>
-      <w:r>
-        <w:t xml:space="preserve">falls more than 1.29 eV below ½E(O</w:t>
-      </w:r>
-      <w:r>
-        <w:rPr>
-          <w:vertAlign w:val="subscript"/>
-        </w:rPr>
-        <w:t xml:space="preserve">2</w:t>
-      </w:r>
-      <w:r>
-        <w:t xml:space="preserve">), a threshold that carries the common offset of the PBE O</w:t>
-      </w:r>
-      <w:r>
-        <w:rPr>
-          <w:vertAlign w:val="subscript"/>
-        </w:rPr>
-        <w:t xml:space="preserve">2</w:t>
-      </w:r>
-      <w:r>
-        <w:t xml:space="preserve"> </w:t>
-      </w:r>
-      <w:r>
-        <w:t xml:space="preserve">reference (Section 2.7); whether that lies within the stability field of TiO</w:t>
-      </w:r>
-      <w:r>
-        <w:rPr>
-          <w:vertAlign w:val="subscript"/>
-        </w:rPr>
-        <w:t xml:space="preserve">2</w:t>
-      </w:r>
-      <w:r>
-        <w:t xml:space="preserve"> </w:t>
-      </w:r>
-      <w:r>
-        <w:t xml:space="preserve">against lower oxides was not evaluated (Section 5). The preference for the production vacancy site over the two more distant sites sampled (Section 3.7) is in the same direction as the Pr–V</w:t>
-      </w:r>
-      <w:r>
-        <w:rPr>
-          <w:vertAlign w:val="subscript"/>
-        </w:rPr>
-        <w:t xml:space="preserve">O</w:t>
-      </w:r>
-      <w:r>
-        <w:t xml:space="preserve"> </w:t>
-      </w:r>
-      <w:r>
-        <w:t xml:space="preserve">association reported for Pr adsorbed at the anatase (101) surface by Vural et al. [26], although adsorption and bulk substitution are different situations and only four sites were sampled here.</w:t>
-      </w:r>
-      <w:r>
-        <w:t xml:space="preserve"> </w:t>
-      </w:r>
-      <w:r>
-        <w:rPr>
-          <w:bCs/>
-          <w:b/>
-        </w:rPr>
-        <w:t xml:space="preserve">[AUTHOR ACTION: confirm from the full text of Vural et al., with a page or figure reference, that they report a Pr–V</w:t>
-      </w:r>
-      <w:r>
-        <w:rPr>
-          <w:vertAlign w:val="subscript"/>
-          <w:bCs/>
-          <w:b/>
-        </w:rPr>
-        <w:t xml:space="preserve">O</w:t>
-      </w:r>
-      <w:r>
-        <w:rPr>
-          <w:bCs/>
-          <w:b/>
-        </w:rPr>
-        <w:t xml:space="preserve"> </w:t>
-      </w:r>
-      <w:r>
-        <w:rPr>
-          <w:bCs/>
-          <w:b/>
-        </w:rPr>
-        <w:t xml:space="preserve">association; the institutional records of their abstract describe Pr-induced gap states, optical activity and benzoic-acid adsorption but do not mention oxygen vacancies. If the association is not reported there, delete this sentence.]</w:t>
-      </w:r>
-      <w:r>
-        <w:t xml:space="preserve"> </w:t>
-      </w:r>
-      <w:r>
-        <w:t xml:space="preserve">The spin polarisation of the Pr-induced hole when an oxygen-site U is present parallels the oxygen-hole states reported for trivalent dopants in rutile by Iwaszuk and Nolan [17].</w:t>
-      </w:r>
-    </w:p>
-    <w:p>
-      <w:pPr>
-        <w:pStyle w:val="BodyText"/>
-      </w:pPr>
-      <w:r>
-        <w:rPr>
-          <w:bCs/>
-          <w:b/>
-        </w:rPr>
-        <w:t xml:space="preserve">4.3 What the two-dopant comparison does and does not isolate.</w:t>
-      </w:r>
-      <w:r>
-        <w:t xml:space="preserve"> </w:t>
-      </w:r>
-      <w:r>
-        <w:t xml:space="preserve">Pr</w:t>
-      </w:r>
-      <w:r>
-        <w:rPr>
-          <w:vertAlign w:val="superscript"/>
-        </w:rPr>
-        <w:t xml:space="preserve">3+</w:t>
-      </w:r>
-      <w:r>
-        <w:t xml:space="preserve"> </w:t>
-      </w:r>
-      <w:r>
-        <w:t xml:space="preserve">and Rb</w:t>
-      </w:r>
-      <w:r>
-        <w:rPr>
-          <w:vertAlign w:val="superscript"/>
-        </w:rPr>
-        <w:t xml:space="preserve">+</w:t>
-      </w:r>
-      <w:r>
-        <w:t xml:space="preserve"> </w:t>
-      </w:r>
-      <w:r>
-        <w:t xml:space="preserve">differ in formal charge (−1 versus −3 e relative to Ti</w:t>
-      </w:r>
-      <w:r>
-        <w:rPr>
-          <w:vertAlign w:val="superscript"/>
-        </w:rPr>
-        <w:t xml:space="preserve">4+</w:t>
-      </w:r>
-      <w:r>
-        <w:t xml:space="preserve">), in ionic radius (0.99 versus 1.52 Å [27]), in bonding (a 5d-bearing trivalent cation versus a closed-shell alkali) and in accessible oxidation states. Both are larger than Ti</w:t>
-      </w:r>
-      <w:r>
-        <w:rPr>
-          <w:vertAlign w:val="superscript"/>
-        </w:rPr>
-        <w:t xml:space="preserve">4+</w:t>
-      </w:r>
-      <w:r>
-        <w:t xml:space="preserve"> </w:t>
-      </w:r>
-      <w:r>
-        <w:t xml:space="preserve">(0.605 Å), so the comparison does show that a large size mismatch is compatible with either sign of E</w:t>
-      </w:r>
-      <w:r>
-        <w:rPr>
-          <w:vertAlign w:val="subscript"/>
-        </w:rPr>
-        <w:t xml:space="preserve">f</w:t>
-      </w:r>
-      <w:r>
-        <w:t xml:space="preserve">(V</w:t>
-      </w:r>
-      <w:r>
-        <w:rPr>
-          <w:vertAlign w:val="subscript"/>
-        </w:rPr>
-        <w:t xml:space="preserve">O</w:t>
-      </w:r>
-      <w:r>
-        <w:t xml:space="preserve">) at the oxygen-rich reference; it does not hold size constant, and no strain or fixed-geometry decomposition was computed, so the contrast cannot be apportioned between electronic and elastic contributions. What can be said is that the sign of the contrast and the size of the reductions are consistent with the electron count; because the ordering pristine &gt; Pr &gt; Rb is also the order of increasing cation radius (0.605, 0.99 and 1.52 Å) and Carey and Nolan found a radius dependence at fixed alkali valence [16], a size-based explanation of the ordering is not excluded. The relaxed Rb_VO cell gives a direct indication of the elastic part: the Rb ion moves 1.27 Å off the cation site into the space vacated by the adjacent oxygen (Section 3.1), a relaxation channel that only an adjacent vacancy opens and that a smaller ion would exploit less, but whose energy has not been separated from the electronic contribution. Isolating the two variables would require a controlled series within the same protocol, for example La</w:t>
-      </w:r>
-      <w:r>
-        <w:rPr>
-          <w:vertAlign w:val="superscript"/>
-        </w:rPr>
-        <w:t xml:space="preserve">3+</w:t>
-      </w:r>
-      <w:r>
-        <w:t xml:space="preserve">, Y</w:t>
-      </w:r>
-      <w:r>
-        <w:rPr>
-          <w:vertAlign w:val="superscript"/>
-        </w:rPr>
-        <w:t xml:space="preserve">3+</w:t>
-      </w:r>
-      <w:r>
-        <w:t xml:space="preserve"> </w:t>
-      </w:r>
-      <w:r>
-        <w:t xml:space="preserve">and Sc</w:t>
-      </w:r>
-      <w:r>
-        <w:rPr>
-          <w:vertAlign w:val="superscript"/>
-        </w:rPr>
-        <w:t xml:space="preserve">3+</w:t>
-      </w:r>
-      <w:r>
-        <w:t xml:space="preserve"> </w:t>
-      </w:r>
-      <w:r>
-        <w:t xml:space="preserve">(same valence, radii from 1.03 to 0.745 Å [27]) and K</w:t>
+        <w:t xml:space="preserve"> </w:t>
+      </w:r>
+      <w:r>
+        <w:t xml:space="preserve">(same valence, radii from 1.03 to 0.745 Å [26]) and K</w:t>
       </w:r>
       <w:r>
         <w:rPr>
@@ -8011,7 +7867,7 @@
         <w:t xml:space="preserve"> </w:t>
       </w:r>
       <w:r>
-        <w:t xml:space="preserve">≈ 5.8 (in-plane value tabulated by Arrigoni and Madsen [14]) would give a first-order monopole correction [39] of a few tenths of an eV for q = +1 at this cell size and four times that for q = +2. The static constant of anatase is much larger and would reduce the estimate, so these numbers are upper bounds and are not used. (ix)</w:t>
+        <w:t xml:space="preserve">≈ 5.8 (experimental in-plane value, 5.82, as tabulated by Arrigoni and Madsen [14]) would give a first-order monopole correction [38] of a few tenths of an eV for q = +1 at this cell size and four times that for q = +2. The static constant of anatase is much larger and would reduce the estimate, so these numbers are upper bounds and are not used. (ix)</w:t>
       </w:r>
       <w:r>
         <w:t xml:space="preserve"> </w:t>
@@ -8533,7 +8389,7 @@
         <w:pStyle w:val="BodyText"/>
       </w:pPr>
       <w:r>
-        <w:t xml:space="preserve">[7] Yin, W.-J.; Wen, B.; Ge, Q.; Wei, X.; Teobaldi, G.; Liu, L.-M. Effect of Crystal Field on the Formation and Diffusion of Oxygen Vacancy at Anatase (101) Surface and Sub-Surface. Prog. Nat. Sci.: Mater. Int. 2020, 30, 128–133. DOI: 10.1016/j.pnsc.2020.01.001.</w:t>
+        <w:t xml:space="preserve">[7] Yin, W.; Wen, B.; Ge, Q.; Wei, X.; Teobaldi, G.; Liu, L. Effect of Crystal Field on the Formation and Diffusion of Oxygen Vacancy at Anatase (101) Surface and Sub-Surface. Prog. Nat. Sci.: Mater. Int. 2020, 30, 128–133. DOI: 10.1016/j.pnsc.2020.01.001.</w:t>
       </w:r>
     </w:p>
     <w:p>
@@ -8565,7 +8421,7 @@
         <w:pStyle w:val="BodyText"/>
       </w:pPr>
       <w:r>
-        <w:t xml:space="preserve">[11] Bai, X.; Jia, J.; Du, Y.; Liu, E.; Fan, J. Multi-Level Trapped Electrons System in Enhancing Photocatalytic Activity of TiO2 Nanosheets for Simultaneous Reduction of Cr(VI) and RhB Degradation. Appl. Surf. Sci. 2020, 503, 144298. DOI: 10.1016/j.apsusc.2019.144298.</w:t>
+        <w:t xml:space="preserve">[11] Bai, X.; Jia, J.; Du, Y.; Hu, X.; Li, J.; Liu, E.; Fan, J. Multi-Level Trapped Electrons System in Enhancing Photocatalytic Activity of TiO2 Nanosheets for Simultaneous Reduction of Cr(VI) and RhB Degradation. Appl. Surf. Sci. 2020, 503, 144298. DOI: 10.1016/j.apsusc.2019.144298.</w:t>
       </w:r>
     </w:p>
     <w:p>
@@ -8629,231 +8485,223 @@
         <w:pStyle w:val="BodyText"/>
       </w:pPr>
       <w:r>
-        <w:t xml:space="preserve">[19] Polliotto, V.; Albanese, E.; Livraghi, S.; Pacchioni, G.; Giamello, E. Structural, Electronic and Photochemical Properties of Cerium-Doped Zirconium Titanate. Catal. Today 2020, 340, 49–57. DOI: 10.1016/j.cattod.2018.09.026.</w:t>
-      </w:r>
-    </w:p>
-    <w:p>
-      <w:pPr>
-        <w:pStyle w:val="BodyText"/>
-      </w:pPr>
-      <w:r>
-        <w:t xml:space="preserve">[20] Mazierski, P.; Mikołajczyk, A.; Grzyb, T.; Zaleska-Medynska, A.; Nadolna, J. On the Excitation Mechanism of Visible Responsible Er-TiO2 System Proved by Experimental and Theoretical Investigations for Boosting Photocatalytic Activity. Appl. Surf. Sci. 2020, 527, 146815. DOI: 10.1016/j.apsusc.2020.146815.</w:t>
-      </w:r>
-    </w:p>
-    <w:p>
-      <w:pPr>
-        <w:pStyle w:val="BodyText"/>
-      </w:pPr>
-      <w:r>
-        <w:t xml:space="preserve">[21] Ahmad, A.; Yerlikaya, G.; Ur Rehman, M. Z.; Paksoy, H.; Kardaş, G. Enhanced Photoelectrochemical Water Splitting Using Gadolinium Doped Titanium Dioxide Nanorod Array Photoanodes. Int. J. Hydrogen Energy 2020, 45, 2709. DOI: 10.1016/j.ijhydene.2019.11.117.</w:t>
-      </w:r>
-    </w:p>
-    <w:p>
-      <w:pPr>
-        <w:pStyle w:val="BodyText"/>
-      </w:pPr>
-      <w:r>
-        <w:t xml:space="preserve">[22] Chen, W.; Yuan, P.; Zhang, S.; Sun, Q.; Liang, E.; Jia, Y. Electronic Properties of Anatase TiO2 Doped by Lanthanides: A DFT+U Study. Physica B 2012, 407, 1038–1043. DOI: 10.1016/j.physb.2012.01.085.</w:t>
-      </w:r>
-    </w:p>
-    <w:p>
-      <w:pPr>
-        <w:pStyle w:val="BodyText"/>
-      </w:pPr>
-      <w:r>
-        <w:t xml:space="preserve">[23] Chen, H.; Yao, L.; Yang, S.; Wang, Y.; Liang, X.; Huang, Y. First-Principles Study on Electronic and Optical Properties in Pr-Doped Anatase TiO2. Adv. Mater. Res. 2014, 924, 260–268. DOI: 10.4028/www.scientific.net/AMR.924.260.</w:t>
-      </w:r>
-    </w:p>
-    <w:p>
-      <w:pPr>
-        <w:pStyle w:val="BodyText"/>
-      </w:pPr>
-      <w:r>
-        <w:t xml:space="preserve">[24] Albuquerque, A. R.; Bruix, A.; dos Santos, I. M. G.; Sambrano, J. R.; Illas, F. DFT Study on Ce-Doped Anatase TiO2: Nature of Ce3+ and Ti3+ Centers Triggered by Oxygen Vacancy Formation. J. Phys. Chem. C 2014, 118, 9677–9689. DOI: 10.1021/jp501757f.</w:t>
-      </w:r>
-    </w:p>
-    <w:p>
-      <w:pPr>
-        <w:pStyle w:val="BodyText"/>
-      </w:pPr>
-      <w:r>
-        <w:t xml:space="preserve">[25] Bahmanrokh, G.; Cazorla, C.; Mofarah, S. S.; Koshy, P.; Sorrell, C. C. Band Gap Engineering of Ce-Doped Anatase TiO2 through Solid Solubility Mechanisms and New Defect Equilibria Formalism. Nanoscale 2020, 12, 4916–4934. DOI: 10.1039/c9nr08604h.</w:t>
-      </w:r>
-    </w:p>
-    <w:p>
-      <w:pPr>
-        <w:pStyle w:val="BodyText"/>
-      </w:pPr>
-      <w:r>
-        <w:t xml:space="preserve">[26] Vural, K. B.; Kaderoğlu, Ç.; Ellialtıoğlu, Ş. Density Functional Theory Investigation of Pr Adsorption on the Anatase TiO2(101) Surface for Photovoltaic Applications. Appl. Surf. Sci. 2023, 613, 156042. DOI: 10.1016/j.apsusc.2022.156042.</w:t>
-      </w:r>
-    </w:p>
-    <w:p>
-      <w:pPr>
-        <w:pStyle w:val="BodyText"/>
-      </w:pPr>
-      <w:r>
-        <w:t xml:space="preserve">[27] Shannon, R. D. Revised Effective Ionic Radii and Systematic Studies of Interatomic Distances in Halides and Chalcogenides. Acta Crystallogr., Sect. A 1976, 32, 751–767. DOI: 10.1107/S0567739476001551.</w:t>
-      </w:r>
-    </w:p>
-    <w:p>
-      <w:pPr>
-        <w:pStyle w:val="BodyText"/>
-      </w:pPr>
-      <w:r>
-        <w:t xml:space="preserve">[28] Li, Z.-X.; He, G.-Q.; Kong, B.; Zeng, T.-X.; Zhang, J. Hybrid Density Functional Studies for the Effect of Oxygen Vacancy on the Visible Light Photocatalytic Activity in M (M = Li, Na, K, Rb, Cs)-Doped α-Bi2O3. J. Phys. Chem. Solids 2020, 144, 109581. DOI: 10.1016/j.jpcs.2020.109581.</w:t>
-      </w:r>
-    </w:p>
-    <w:p>
-      <w:pPr>
-        <w:pStyle w:val="BodyText"/>
-      </w:pPr>
-      <w:r>
-        <w:t xml:space="preserve">[29] Kröger, F. A.; Vink, H. J. Relations between the Concentrations of Imperfections in Crystalline Solids. Solid State Phys. 1956, 3, 307–435. DOI: 10.1016/S0081-1947(08)60135-6.</w:t>
-      </w:r>
-    </w:p>
-    <w:p>
-      <w:pPr>
-        <w:pStyle w:val="BodyText"/>
-      </w:pPr>
-      <w:r>
-        <w:t xml:space="preserve">[30] Giannozzi, P.; Andreussi, O.; Brumme, T.; Bunau, O.; et al. Advanced Capabilities for Materials Modelling with Quantum ESPRESSO. J. Phys.: Condens. Matter 2017, 29, 465901. DOI: 10.1088/1361-648X/aa8f79.</w:t>
-      </w:r>
-    </w:p>
-    <w:p>
-      <w:pPr>
-        <w:pStyle w:val="BodyText"/>
-      </w:pPr>
-      <w:r>
-        <w:t xml:space="preserve">[31] Giannozzi, P.; Baseggio, O.; Bonfà, P.; Brunato, D.; et al. Quantum ESPRESSO toward the Exascale. J. Chem. Phys. 2020, 152, 154105. DOI: 10.1063/5.0005082.</w:t>
-      </w:r>
-    </w:p>
-    <w:p>
-      <w:pPr>
-        <w:pStyle w:val="BodyText"/>
-      </w:pPr>
-      <w:r>
-        <w:t xml:space="preserve">[32] Perdew, J. P.; Burke, K.; Ernzerhof, M. Generalized Gradient Approximation Made Simple. Phys. Rev. Lett. 1996, 77, 3865–3868. DOI: 10.1103/PhysRevLett.77.3865.</w:t>
-      </w:r>
-    </w:p>
-    <w:p>
-      <w:pPr>
-        <w:pStyle w:val="BodyText"/>
-      </w:pPr>
-      <w:r>
-        <w:t xml:space="preserve">[33] Dal Corso, A. Pseudopotentials Periodic Table: From H to Pu. Comput. Mater. Sci. 2014, 95, 337–350. DOI: 10.1016/j.commatsci.2014.07.043. PSlibrary 1.0.0 PAW set, https://www.quantum-espresso.org/pseudopotentials/ and https://github.com/dalcorso/pslibrary (accessed 2026-10-02).</w:t>
-      </w:r>
-    </w:p>
-    <w:p>
-      <w:pPr>
-        <w:pStyle w:val="BodyText"/>
-      </w:pPr>
-      <w:r>
-        <w:t xml:space="preserve">[34] Dudarev, S. L.; Botton, G. A.; Savrasov, S. Y.; Humphreys, C. J.; Sutton, A. P. Electron-Energy-Loss Spectra and the Structural Stability of Nickel Oxide: An LSDA+U Study. Phys. Rev. B 1998, 57, 1505–1509. DOI: 10.1103/PhysRevB.57.1505.</w:t>
-      </w:r>
-    </w:p>
-    <w:p>
-      <w:pPr>
-        <w:pStyle w:val="BodyText"/>
-      </w:pPr>
-      <w:r>
-        <w:t xml:space="preserve">[35] Deák, P.; Kullgren, J.; Frauenheim, T. Polarons and Oxygen Vacancies at the Surface of Anatase TiO2. Phys. Status Solidi RRL 2014, 8, 583–586. DOI: 10.1002/pssr.201409139.</w:t>
-      </w:r>
-    </w:p>
-    <w:p>
-      <w:pPr>
-        <w:pStyle w:val="BodyText"/>
-      </w:pPr>
-      <w:r>
-        <w:t xml:space="preserve">[36] Morgan, B. J.; Watson, G. W. A DFT+U Description of Oxygen Vacancies at the TiO2 Rutile (110) Surface. Surf. Sci. 2007, 601, 5034–5041. DOI: 10.1016/j.susc.2007.08.025.</w:t>
-      </w:r>
-    </w:p>
-    <w:p>
-      <w:pPr>
-        <w:pStyle w:val="BodyText"/>
-      </w:pPr>
-      <w:r>
-        <w:t xml:space="preserve">[37] Anisimov, V. I.; Zaanen, J.; Andersen, O. K. Band Theory and Mott Insulators: Hubbard U Instead of Stoner I. Phys. Rev. B 1991, 44, 943–954. DOI: 10.1103/PhysRevB.44.943.</w:t>
-      </w:r>
-    </w:p>
-    <w:p>
-      <w:pPr>
-        <w:pStyle w:val="BodyText"/>
-      </w:pPr>
-      <w:r>
-        <w:t xml:space="preserve">[38] Cococcioni, M.; de Gironcoli, S. Linear Response Approach to the Calculation of the Effective Interaction Parameters in the LDA+U Method. Phys. Rev. B 2005, 71, 035105. DOI: 10.1103/PhysRevB.71.035105.</w:t>
-      </w:r>
-    </w:p>
-    <w:p>
-      <w:pPr>
-        <w:pStyle w:val="BodyText"/>
-      </w:pPr>
-      <w:r>
-        <w:t xml:space="preserve">[39] Freysoldt, C.; Grabowski, B.; Hickel, T.; Neugebauer, J.; Kresse, G.; Janotti, A.; Van de Walle, C. G. First-Principles Calculations for Point Defects in Solids. Rev. Mod. Phys. 2014, 86, 253–305. DOI: 10.1103/RevModPhys.86.253.</w:t>
-      </w:r>
-    </w:p>
-    <w:p>
-      <w:pPr>
-        <w:pStyle w:val="BodyText"/>
-      </w:pPr>
-      <w:r>
-        <w:t xml:space="preserve">[40] Heyd, J.; Scuseria, G. E.; Ernzerhof, M. Hybrid Functionals Based on a Screened Coulomb Potential. J. Chem. Phys. 2003, 118, 8207–8215. DOI: 10.1063/1.1564060.</w:t>
-      </w:r>
-    </w:p>
-    <w:p>
-      <w:pPr>
-        <w:pStyle w:val="BodyText"/>
-      </w:pPr>
-      <w:r>
-        <w:t xml:space="preserve">[41] Krukau, A. V.; Vydrov, O. A.; Izmaylov, A. F.; Scuseria, G. E. Influence of the Exchange Screening Parameter on the Performance of Screened Hybrid Functionals. J. Chem. Phys. 2006, 125, 224106. DOI: 10.1063/1.2404663.</w:t>
-      </w:r>
-    </w:p>
-    <w:p>
-      <w:pPr>
-        <w:pStyle w:val="BodyText"/>
-      </w:pPr>
-      <w:r>
-        <w:t xml:space="preserve">[42] Grimme, S.; Antony, J.; Ehrlich, S.; Krieg, H. A Consistent and Accurate Ab Initio Parametrization of Density Functional Dispersion Correction (DFT-D) for the 94 Elements H–Pu. J. Chem. Phys. 2010, 132, 154104. DOI: 10.1063/1.3382344.</w:t>
-      </w:r>
-    </w:p>
-    <w:p>
-      <w:pPr>
-        <w:pStyle w:val="BodyText"/>
-      </w:pPr>
-      <w:r>
-        <w:t xml:space="preserve">[43] Grimme, S.; Ehrlich, S.; Goerigk, L. Effect of the Damping Function in Dispersion Corrected Density Functional Theory. J. Comput. Chem. 2011, 32, 1456–1465. DOI: 10.1002/jcc.21759.</w:t>
-      </w:r>
-    </w:p>
-    <w:p>
-      <w:pPr>
-        <w:pStyle w:val="BodyText"/>
-      </w:pPr>
-      <w:r>
-        <w:t xml:space="preserve">[44] Torres, A. E.; Rodríguez-Pineda, J.; Zanella, R. Relevance of Dispersion and the Electronic Spin in the DFT+U Approach for the Description of Pristine and Defective TiO2 Anatase. ACS Omega 2021, 6, 23170–23180. DOI: 10.1021/acsomega.1c02761.</w:t>
-      </w:r>
-    </w:p>
-    <w:p>
-      <w:pPr>
-        <w:pStyle w:val="BodyText"/>
-      </w:pPr>
-      <w:r>
-        <w:t xml:space="preserve">[45] Henkelman, G.; Arnaldsson, A.; Jónsson, H. A Fast and Robust Algorithm for Bader Decomposition of Charge Density. Comput. Mater. Sci. 2006, 36, 354–360. DOI: 10.1016/j.commatsci.2005.04.010.</w:t>
-      </w:r>
-    </w:p>
-    <w:p>
-      <w:pPr>
-        <w:pStyle w:val="BodyText"/>
-      </w:pPr>
-      <w:r>
-        <w:t xml:space="preserve">[46] Tang, W.; Sanville, E.; Henkelman, G. A Grid-Based Bader Analysis Algorithm without Lattice Bias. J. Phys.: Condens. Matter 2009, 21, 084204. DOI: 10.1088/0953-8984/21/8/084204.</w:t>
-      </w:r>
-    </w:p>
-    <w:p>
-      <w:pPr>
-        <w:pStyle w:val="BodyText"/>
-      </w:pPr>
-      <w:r>
-        <w:t xml:space="preserve">[47] Boonchun, A.; Reunchan, P.; Umezawa, N. Energetics of Native Defects in Anatase TiO2: A Hybrid Density Functional Study. Phys. Chem. Chem. Phys. 2016, 18, 30040–30046. DOI: 10.1039/c6cp05798e.</w:t>
+        <w:t xml:space="preserve">[19] Chen, W.; Yuan, P.; Zhang, S.; Sun, Q.; Liang, E.; Jia, Y. Electronic Properties of Anatase TiO2 Doped by Lanthanides: A DFT+U Study. Physica B 2012, 407, 1038–1043. DOI: 10.1016/j.physb.2012.01.085.</w:t>
+      </w:r>
+    </w:p>
+    <w:p>
+      <w:pPr>
+        <w:pStyle w:val="BodyText"/>
+      </w:pPr>
+      <w:r>
+        <w:t xml:space="preserve">[20] Chen, H.; Yao, L.; Yang, S.; Wang, Y.; Liang, X.; Huang, Y. First-Principles Study on Electronic and Optical Properties in Pr-Doped Anatase TiO2. Adv. Mater. Res. 2014, 924, 260–268. DOI: 10.4028/www.scientific.net/AMR.924.260.</w:t>
+      </w:r>
+    </w:p>
+    <w:p>
+      <w:pPr>
+        <w:pStyle w:val="BodyText"/>
+      </w:pPr>
+      <w:r>
+        <w:t xml:space="preserve">[21] Mazierski, P.; Mikołajczyk, A.; Grzyb, T.; Arellano Caicedo, P. N.; Wei, Z.; Kowalska, E.; Pinto, H. P.; Zaleska-Medynska, A.; Nadolna, J. On the Excitation Mechanism of Visible Responsible Er-TiO2 System Proved by Experimental and Theoretical Investigations for Boosting Photocatalytic Activity. Appl. Surf. Sci. 2020, 527, 146815. DOI: 10.1016/j.apsusc.2020.146815.</w:t>
+      </w:r>
+    </w:p>
+    <w:p>
+      <w:pPr>
+        <w:pStyle w:val="BodyText"/>
+      </w:pPr>
+      <w:r>
+        <w:t xml:space="preserve">[22] Polliotto, V.; Albanese, E.; Livraghi, S.; Agnoli, S.; Pacchioni, G.; Giamello, E. Structural, Electronic and Photochemical Properties of Cerium-Doped Zirconium Titanate. Catal. Today 2020, 340, 49–57. DOI: 10.1016/j.cattod.2018.09.026.</w:t>
+      </w:r>
+    </w:p>
+    <w:p>
+      <w:pPr>
+        <w:pStyle w:val="BodyText"/>
+      </w:pPr>
+      <w:r>
+        <w:t xml:space="preserve">[23] Albuquerque, A. R.; Bruix, A.; dos Santos, I. M. G.; Sambrano, J. R.; Illas, F. DFT Study on Ce-Doped Anatase TiO2: Nature of Ce3+ and Ti3+ Centers Triggered by Oxygen Vacancy Formation. J. Phys. Chem. C 2014, 118, 9677–9689. DOI: 10.1021/jp501757f.</w:t>
+      </w:r>
+    </w:p>
+    <w:p>
+      <w:pPr>
+        <w:pStyle w:val="BodyText"/>
+      </w:pPr>
+      <w:r>
+        <w:t xml:space="preserve">[24] Bahmanrokh, G.; Cazorla, C.; Mofarah, S. S.; Koshy, P.; Sorrell, C. C. Band Gap Engineering of Ce-Doped Anatase TiO2 through Solid Solubility Mechanisms and New Defect Equilibria Formalism. Nanoscale 2020, 12, 4916–4934. DOI: 10.1039/c9nr08604h.</w:t>
+      </w:r>
+    </w:p>
+    <w:p>
+      <w:pPr>
+        <w:pStyle w:val="BodyText"/>
+      </w:pPr>
+      <w:r>
+        <w:t xml:space="preserve">[25] Vural, K. B.; Kaderoğlu, Ç.; Ellialtıoğlu, Ş. Density Functional Theory Investigation of Pr Adsorption on the Anatase TiO2(101) Surface for Photovoltaic Applications. Appl. Surf. Sci. 2023, 613, 156042. DOI: 10.1016/j.apsusc.2022.156042.</w:t>
+      </w:r>
+    </w:p>
+    <w:p>
+      <w:pPr>
+        <w:pStyle w:val="BodyText"/>
+      </w:pPr>
+      <w:r>
+        <w:t xml:space="preserve">[26] Shannon, R. D. Revised Effective Ionic Radii and Systematic Studies of Interatomic Distances in Halides and Chalcogenides. Acta Crystallogr., Sect. A 1976, 32, 751–767. DOI: 10.1107/S0567739476001551.</w:t>
+      </w:r>
+    </w:p>
+    <w:p>
+      <w:pPr>
+        <w:pStyle w:val="BodyText"/>
+      </w:pPr>
+      <w:r>
+        <w:t xml:space="preserve">[27] Li, Z.-X.; He, G.-Q.; Kong, B.; Zeng, T.-X.; Zhang, J. Hybrid Density Functional Studies for the Effect of Oxygen Vacancy on the Visible Light Photocatalytic Activity in M (M = Li, Na, K, Rb, Cs)-Doped α-Bi2O3. J. Phys. Chem. Solids 2020, 144, 109581. DOI: 10.1016/j.jpcs.2020.109581.</w:t>
+      </w:r>
+    </w:p>
+    <w:p>
+      <w:pPr>
+        <w:pStyle w:val="BodyText"/>
+      </w:pPr>
+      <w:r>
+        <w:t xml:space="preserve">[28] Kröger, F. A.; Vink, H. J. Relations between the Concentrations of Imperfections in Crystalline Solids. Solid State Phys. 1956, 3, 307–435. DOI: 10.1016/S0081-1947(08)60135-6.</w:t>
+      </w:r>
+    </w:p>
+    <w:p>
+      <w:pPr>
+        <w:pStyle w:val="BodyText"/>
+      </w:pPr>
+      <w:r>
+        <w:t xml:space="preserve">[29] Giannozzi, P.; Andreussi, O.; Brumme, T.; Bunau, O.; et al. Advanced Capabilities for Materials Modelling with Quantum ESPRESSO. J. Phys.: Condens. Matter 2017, 29, 465901. DOI: 10.1088/1361-648X/aa8f79.</w:t>
+      </w:r>
+    </w:p>
+    <w:p>
+      <w:pPr>
+        <w:pStyle w:val="BodyText"/>
+      </w:pPr>
+      <w:r>
+        <w:t xml:space="preserve">[30] Giannozzi, P.; Baseggio, O.; Bonfà, P.; Brunato, D.; et al. Quantum ESPRESSO toward the Exascale. J. Chem. Phys. 2020, 152, 154105. DOI: 10.1063/5.0005082.</w:t>
+      </w:r>
+    </w:p>
+    <w:p>
+      <w:pPr>
+        <w:pStyle w:val="BodyText"/>
+      </w:pPr>
+      <w:r>
+        <w:t xml:space="preserve">[31] Perdew, J. P.; Burke, K.; Ernzerhof, M. Generalized Gradient Approximation Made Simple. Phys. Rev. Lett. 1996, 77, 3865–3868. DOI: 10.1103/PhysRevLett.77.3865.</w:t>
+      </w:r>
+    </w:p>
+    <w:p>
+      <w:pPr>
+        <w:pStyle w:val="BodyText"/>
+      </w:pPr>
+      <w:r>
+        <w:t xml:space="preserve">[32] Dal Corso, A. Pseudopotentials Periodic Table: From H to Pu. Comput. Mater. Sci. 2014, 95, 337–350. DOI: 10.1016/j.commatsci.2014.07.043. PSlibrary 1.0.0 PAW set, https://www.quantum-espresso.org/pseudopotentials/ and https://github.com/dalcorso/pslibrary (accessed 2026-10-02).</w:t>
+      </w:r>
+    </w:p>
+    <w:p>
+      <w:pPr>
+        <w:pStyle w:val="BodyText"/>
+      </w:pPr>
+      <w:r>
+        <w:t xml:space="preserve">[33] Dudarev, S. L.; Botton, G. A.; Savrasov, S. Y.; Humphreys, C. J.; Sutton, A. P. Electron-Energy-Loss Spectra and the Structural Stability of Nickel Oxide: An LSDA+U Study. Phys. Rev. B 1998, 57, 1505–1509. DOI: 10.1103/PhysRevB.57.1505.</w:t>
+      </w:r>
+    </w:p>
+    <w:p>
+      <w:pPr>
+        <w:pStyle w:val="BodyText"/>
+      </w:pPr>
+      <w:r>
+        <w:t xml:space="preserve">[34] Deák, P.; Kullgren, J.; Frauenheim, T. Polarons and Oxygen Vacancies at the Surface of Anatase TiO2. Phys. Status Solidi RRL 2014, 8, 583–586. DOI: 10.1002/pssr.201409139.</w:t>
+      </w:r>
+    </w:p>
+    <w:p>
+      <w:pPr>
+        <w:pStyle w:val="BodyText"/>
+      </w:pPr>
+      <w:r>
+        <w:t xml:space="preserve">[35] Morgan, B. J.; Watson, G. W. A DFT+U Description of Oxygen Vacancies at the TiO2 Rutile (110) Surface. Surf. Sci. 2007, 601, 5034–5041. DOI: 10.1016/j.susc.2007.08.025.</w:t>
+      </w:r>
+    </w:p>
+    <w:p>
+      <w:pPr>
+        <w:pStyle w:val="BodyText"/>
+      </w:pPr>
+      <w:r>
+        <w:t xml:space="preserve">[36] Anisimov, V. I.; Zaanen, J.; Andersen, O. K. Band Theory and Mott Insulators: Hubbard U Instead of Stoner I. Phys. Rev. B 1991, 44, 943–954. DOI: 10.1103/PhysRevB.44.943.</w:t>
+      </w:r>
+    </w:p>
+    <w:p>
+      <w:pPr>
+        <w:pStyle w:val="BodyText"/>
+      </w:pPr>
+      <w:r>
+        <w:t xml:space="preserve">[37] Cococcioni, M.; de Gironcoli, S. Linear Response Approach to the Calculation of the Effective Interaction Parameters in the LDA+U Method. Phys. Rev. B 2005, 71, 035105. DOI: 10.1103/PhysRevB.71.035105.</w:t>
+      </w:r>
+    </w:p>
+    <w:p>
+      <w:pPr>
+        <w:pStyle w:val="BodyText"/>
+      </w:pPr>
+      <w:r>
+        <w:t xml:space="preserve">[38] Freysoldt, C.; Grabowski, B.; Hickel, T.; Neugebauer, J.; Kresse, G.; Janotti, A.; Van de Walle, C. G. First-Principles Calculations for Point Defects in Solids. Rev. Mod. Phys. 2014, 86, 253–305. DOI: 10.1103/RevModPhys.86.253.</w:t>
+      </w:r>
+    </w:p>
+    <w:p>
+      <w:pPr>
+        <w:pStyle w:val="BodyText"/>
+      </w:pPr>
+      <w:r>
+        <w:t xml:space="preserve">[39] Heyd, J.; Scuseria, G. E.; Ernzerhof, M. Hybrid Functionals Based on a Screened Coulomb Potential. J. Chem. Phys. 2003, 118, 8207–8215. DOI: 10.1063/1.1564060.</w:t>
+      </w:r>
+    </w:p>
+    <w:p>
+      <w:pPr>
+        <w:pStyle w:val="BodyText"/>
+      </w:pPr>
+      <w:r>
+        <w:t xml:space="preserve">[40] Krukau, A. V.; Vydrov, O. A.; Izmaylov, A. F.; Scuseria, G. E. Influence of the Exchange Screening Parameter on the Performance of Screened Hybrid Functionals. J. Chem. Phys. 2006, 125, 224106. DOI: 10.1063/1.2404663.</w:t>
+      </w:r>
+    </w:p>
+    <w:p>
+      <w:pPr>
+        <w:pStyle w:val="BodyText"/>
+      </w:pPr>
+      <w:r>
+        <w:t xml:space="preserve">[41] Grimme, S.; Antony, J.; Ehrlich, S.; Krieg, H. A Consistent and Accurate Ab Initio Parametrization of Density Functional Dispersion Correction (DFT-D) for the 94 Elements H–Pu. J. Chem. Phys. 2010, 132, 154104. DOI: 10.1063/1.3382344.</w:t>
+      </w:r>
+    </w:p>
+    <w:p>
+      <w:pPr>
+        <w:pStyle w:val="BodyText"/>
+      </w:pPr>
+      <w:r>
+        <w:t xml:space="preserve">[42] Grimme, S.; Ehrlich, S.; Goerigk, L. Effect of the Damping Function in Dispersion Corrected Density Functional Theory. J. Comput. Chem. 2011, 32, 1456–1465. DOI: 10.1002/jcc.21759.</w:t>
+      </w:r>
+    </w:p>
+    <w:p>
+      <w:pPr>
+        <w:pStyle w:val="BodyText"/>
+      </w:pPr>
+      <w:r>
+        <w:t xml:space="preserve">[43] Torres, A. E.; Rodríguez-Pineda, J.; Zanella, R. Relevance of Dispersion and the Electronic Spin in the DFT+U Approach for the Description of Pristine and Defective TiO2 Anatase. ACS Omega 2021, 6, 23170–23180. DOI: 10.1021/acsomega.1c02761.</w:t>
+      </w:r>
+    </w:p>
+    <w:p>
+      <w:pPr>
+        <w:pStyle w:val="BodyText"/>
+      </w:pPr>
+      <w:r>
+        <w:t xml:space="preserve">[44] Henkelman, G.; Arnaldsson, A.; Jónsson, H. A Fast and Robust Algorithm for Bader Decomposition of Charge Density. Comput. Mater. Sci. 2006, 36, 354–360. DOI: 10.1016/j.commatsci.2005.04.010.</w:t>
+      </w:r>
+    </w:p>
+    <w:p>
+      <w:pPr>
+        <w:pStyle w:val="BodyText"/>
+      </w:pPr>
+      <w:r>
+        <w:t xml:space="preserve">[45] Tang, W.; Sanville, E.; Henkelman, G. A Grid-Based Bader Analysis Algorithm without Lattice Bias. J. Phys.: Condens. Matter 2009, 21, 084204. DOI: 10.1088/0953-8984/21/8/084204.</w:t>
+      </w:r>
+    </w:p>
+    <w:p>
+      <w:pPr>
+        <w:pStyle w:val="BodyText"/>
+      </w:pPr>
+      <w:r>
+        <w:t xml:space="preserve">[46] Boonchun, A.; Reunchan, P.; Umezawa, N. Energetics of Native Defects in Anatase TiO2: A Hybrid Density Functional Study. Phys. Chem. Chem. Phys. 2016, 18, 30040–30046. DOI: 10.1039/c6cp05798e.</w:t>
       </w:r>
     </w:p>
     <w:bookmarkEnd w:id="32"/>

</xml_diff>

<commit_message>
Replace unverifiable Deak U citation with Orhan & O'Regan; close two markers
- U(Ti-3d) = 3.5 eV now compared with the linear-response anatase value
  of Orhan & O'Regan (U = 3.57, U_eff = 3.28 eV); their O-2p value
  (U_eff = 7.66 eV) added as a benchmark for the transferred 5.5 eV
- Bahmanrokh formalism confirmed (ionic and electronic compensation);
  author list completed
- Chen 2014 described as plain GGA in a 12-atom cell

Co-Authored-By: Claude Opus 5.5 <noreply@anthropic.com>
Claude-Session: https://claude.ai/code/session_011m1nWiFCs4xdp8CXy2DSzu
</commit_message>
<xml_diff>
--- a/DFT_paper_revision/manuscript_v4/Ghadimimehr_DFT_TiO2_PrRb_v4_MANUSCRIPT.docx
+++ b/DFT_paper_revision/manuscript_v4/Ghadimimehr_DFT_TiO2_PrRb_v4_MANUSCRIPT.docx
@@ -517,23 +517,7 @@
         <w:t xml:space="preserve"> </w:t>
       </w:r>
       <w:r>
-        <w:t xml:space="preserve">site the formal charge mismatch is −1 e per site. Lanthanide substitution in anatase has been studied with DFT+U for Ce, Pr, Eu and Gd, including Pr together with an oxygen vacancy [19], for Pr in the bulk [20] and for Er at the (101) surface together with oxygen or titanium vacancies [21]; for Ce-doped zirconium titanate both hole formation and oxygen-vacancy formation have been considered as compensation channels, with electron paramagnetic resonance pointing to vacancy compensation [22].</w:t>
-      </w:r>
-      <w:r>
-        <w:t xml:space="preserve"> </w:t>
-      </w:r>
-      <w:r>
-        <w:rPr>
-          <w:bCs/>
-          <w:b/>
-        </w:rPr>
-        <w:t xml:space="preserve">[AUTHOR ACTION: confirm from the full text what Chen et al. (2014) report on the compensation of Pr in anatase.]</w:t>
-      </w:r>
-      <w:r>
-        <w:t xml:space="preserve"> </w:t>
-      </w:r>
-      <w:r>
-        <w:t xml:space="preserve">The picture is not universal: Iwaszuk and Nolan showed for trivalent dopants in bulk rutile that oxygen-vacancy compensation can compete with, and in some cases dominate, electronic compensation [17]. The coupling between a lanthanide dopant and an oxygen vacancy has been analysed for Ce-doped anatase [23] and Gd-doped CeO</w:t>
+        <w:t xml:space="preserve">site the formal charge mismatch is −1 e per site. Lanthanide substitution in anatase has been studied with DFT+U for Ce, Pr, Eu and Gd, including Pr together with an oxygen vacancy [19], for Pr in the bulk with plain GGA in a 12-atom cell [20] and for Er at the (101) surface together with oxygen or titanium vacancies [21]; for Ce-doped zirconium titanate both hole formation and oxygen-vacancy formation have been considered as compensation channels, with electron paramagnetic resonance pointing to vacancy compensation [22]. The picture is not universal: Iwaszuk and Nolan showed for trivalent dopants in bulk rutile that oxygen-vacancy compensation can compete with, and in some cases dominate, electronic compensation [17]. The coupling between a lanthanide dopant and an oxygen vacancy has been analysed for Ce-doped anatase [23] and Gd-doped CeO</w:t>
       </w:r>
       <w:r>
         <w:rPr>
@@ -545,20 +529,7 @@
         <w:t xml:space="preserve"> </w:t>
       </w:r>
       <w:r>
-        <w:t xml:space="preserve">[18], and Bahmanrokh et al. proposed a defect-equilibria formalism for Ce-doped anatase in which both channels appear [24]</w:t>
-      </w:r>
-      <w:r>
-        <w:t xml:space="preserve"> </w:t>
-      </w:r>
-      <w:r>
-        <w:rPr>
-          <w:bCs/>
-          <w:b/>
-        </w:rPr>
-        <w:t xml:space="preserve">[AUTHOR ACTION: confirm from the full text that both electronic and vacancy compensation appear in that formalism.]</w:t>
-      </w:r>
-      <w:r>
-        <w:t xml:space="preserve">. Pr in particular has been studied as an adsorbate on the anatase (101) surface [25] and as a substituent in the bulk [19,20], and is an attractive test case, here modelled as trivalent with a 4f-in-core dataset (Section 2.1), because its ionic radius (0.99 Å in six-fold coordination [26]) is far from that of Ti</w:t>
+        <w:t xml:space="preserve">[18], and Bahmanrokh et al. proposed a defect-equilibria formalism for Ce-doped anatase in which both channels appear [24]. Pr in particular has been studied as an adsorbate on the anatase (101) surface [25] and as a substituent in the bulk [19,20], and is an attractive test case, here modelled as trivalent with a 4f-in-core dataset (Section 2.1), because its ionic radius (0.99 Å in six-fold coordination [26]) is far from that of Ti</w:t>
       </w:r>
       <w:r>
         <w:rPr>
@@ -2204,23 +2175,7 @@
         <w:t xml:space="preserve"> </w:t>
       </w:r>
       <w:r>
-        <w:t xml:space="preserve">is written U, U(Ti-3d) or U(O-2p) in the rest of the paper. Deák et al. note that this value is close to an ab initio determination of U for anatase [34], and it has been used for Er-doped anatase [21] and for anatase (101) defect chemistry [7]; other anatase work uses U = 4.2 eV [13], a value originally fitted for the rutile (110) surface [35], or larger values [14]. Literature U values obtained with other projector schemes are not strictly transferable to the ortho-atomic projectors used here, and the sensitivity of the present results to U is reported in Section 3.7.</w:t>
-      </w:r>
-      <w:r>
-        <w:t xml:space="preserve"> </w:t>
-      </w:r>
-      <w:r>
-        <w:rPr>
-          <w:bCs/>
-          <w:b/>
-        </w:rPr>
-        <w:t xml:space="preserve">[AUTHOR ACTION: verify against the full text that Deák et al. quote an ab initio anatase value near 3.5 eV (the values of Mazierski et al. and Yin et al. were checked against their texts).]</w:t>
-      </w:r>
-      <w:r>
-        <w:t xml:space="preserve"> </w:t>
-      </w:r>
-      <w:r>
-        <w:t xml:space="preserve">The DFT+U approach rests on the formulation of Anisimov et al. [36]; linear-response determination of U [37] was not performed for any cell in this work. For the oxygen-site tests of Section 3.4 an additional U</w:t>
+        <w:t xml:space="preserve">is written U, U(Ti-3d) or U(O-2p) in the rest of the paper. This value is close to the first-principles linear-response value for the Ti-3d subspace of anatase (U = 3.57 eV, U</w:t>
       </w:r>
       <w:r>
         <w:rPr>
@@ -2232,6 +2187,18 @@
         <w:t xml:space="preserve"> </w:t>
       </w:r>
       <w:r>
+        <w:t xml:space="preserve">= U − J = 3.28 eV, with LDA [34]), and it has been used for Er-doped anatase [21] and for anatase (101) defect chemistry [7]; other anatase work uses U = 4.2 eV [13], a value originally fitted for the rutile (110) surface [35], or larger values [14]. Literature U values obtained with other projector schemes are not strictly transferable to the ortho-atomic projectors used here, and the sensitivity of the present results to U is reported in Section 3.7. The DFT+U approach rests on the formulation of Anisimov et al. [36]; linear-response determination of U [37] was not performed for any cell in this work. For the oxygen-site tests of Section 3.4 an additional U</w:t>
+      </w:r>
+      <w:r>
+        <w:rPr>
+          <w:vertAlign w:val="subscript"/>
+        </w:rPr>
+        <w:t xml:space="preserve">eff</w:t>
+      </w:r>
+      <w:r>
+        <w:t xml:space="preserve"> </w:t>
+      </w:r>
+      <w:r>
         <w:t xml:space="preserve">= 5.5 eV was placed on the O-2p manifold. This value is transferred from the Cr</w:t>
       </w:r>
       <w:r>
@@ -2253,7 +2220,19 @@
         <w:t xml:space="preserve"> </w:t>
       </w:r>
       <w:r>
-        <w:t xml:space="preserve">study of Carey and Nolan [16], where it was used together with a Cr-3d term to localise oxygen holes; it has not been derived for anatase and is treated here as a sensitivity parameter rather than a calibrated value.</w:t>
+        <w:t xml:space="preserve">study of Carey and Nolan [16], where it was used together with a Cr-3d term to localise oxygen holes; it has not been derived for anatase and is treated here as a sensitivity parameter rather than a calibrated value; for comparison, the linear-response value for the O-2p subspace of anatase is U</w:t>
+      </w:r>
+      <w:r>
+        <w:rPr>
+          <w:vertAlign w:val="subscript"/>
+        </w:rPr>
+        <w:t xml:space="preserve">eff</w:t>
+      </w:r>
+      <w:r>
+        <w:t xml:space="preserve"> </w:t>
+      </w:r>
+      <w:r>
+        <w:t xml:space="preserve">= 7.66 eV with LDA [34].</w:t>
       </w:r>
     </w:p>
     <w:p>
@@ -8525,7 +8504,7 @@
         <w:pStyle w:val="BodyText"/>
       </w:pPr>
       <w:r>
-        <w:t xml:space="preserve">[24] Bahmanrokh, G.; Cazorla, C.; Mofarah, S. S.; Koshy, P.; Sorrell, C. C. Band Gap Engineering of Ce-Doped Anatase TiO2 through Solid Solubility Mechanisms and New Defect Equilibria Formalism. Nanoscale 2020, 12, 4916–4934. DOI: 10.1039/c9nr08604h.</w:t>
+        <w:t xml:space="preserve">[24] Bahmanrokh, G.; Cazorla, C.; Mofarah, S. S.; Shahmiri, R.; Yao, Y.; Ismail, I.; Chen, W.-F.; Koshy, P.; Sorrell, C. C. Band Gap Engineering of Ce-Doped Anatase TiO2 through Solid Solubility Mechanisms and New Defect Equilibria Formalism. Nanoscale 2020, 12, 4916–4934. DOI: 10.1039/c9nr08604h.</w:t>
       </w:r>
     </w:p>
     <w:p>
@@ -8605,7 +8584,7 @@
         <w:pStyle w:val="BodyText"/>
       </w:pPr>
       <w:r>
-        <w:t xml:space="preserve">[34] Deák, P.; Kullgren, J.; Frauenheim, T. Polarons and Oxygen Vacancies at the Surface of Anatase TiO2. Phys. Status Solidi RRL 2014, 8, 583–586. DOI: 10.1002/pssr.201409139.</w:t>
+        <w:t xml:space="preserve">[34] Orhan, O. K.; O’Regan, D. D. First-Principles Hubbard U and Hund’s J Corrected Approximate Density Functional Theory Predicts an Accurate Fundamental Gap in Rutile and Anatase TiO2. Phys. Rev. B 2020, 101, 245137. DOI: 10.1103/PhysRevB.101.245137.</w:t>
       </w:r>
     </w:p>
     <w:p>

</xml_diff>

<commit_message>
Apply independent review of round-3 changes
- Vacancy-site argument for Pr_VO now rests on its Loewdin populations;
  mirror-plane symmetry of the Rb_VO relaxation disclosed
- Rb displacement no longer presented as an energy contribution;
  Shannon comparison for Rb-O added
- Band gap from NSCF eigenvalues (Rb_VO 2.87 eV); broadening caveats on
  state counts; hole band 0.04-0.13 eV above E_F; unconverged NSCF
  eigenvalues disclosed
- Spin-solution identity and production smearing marked not established;
  circular Pr_VO evidence removed
- Figure 1 periodic-image bug fixed; site labels disambiguated; small
  numerical, cross-reference and wording fixes in text, SI and ledger

Co-Authored-By: Claude Opus 5.5 <noreply@anthropic.com>
Claude-Session: https://claude.ai/code/session_011m1nWiFCs4xdp8CXy2DSzu
</commit_message>
<xml_diff>
--- a/DFT_paper_revision/manuscript_v4/Ghadimimehr_DFT_TiO2_PrRb_v4_MANUSCRIPT.docx
+++ b/DFT_paper_revision/manuscript_v4/Ghadimimehr_DFT_TiO2_PrRb_v4_MANUSCRIPT.docx
@@ -166,7 +166,7 @@
         <w:t xml:space="preserve"> </w:t>
       </w:r>
       <w:r>
-        <w:t xml:space="preserve">This version implements the thirteen corrections of the Error Audit (E1–E13) and responds to the eighteen findings of the Reviewer/Editor Audit (R01–R18). All numerical values are unchanged from the FINAL draft and were re-derived from the Rydberg totals in the Supporting Information. Passages marked</w:t>
+        <w:t xml:space="preserve">This version implements the thirteen corrections of the Error Audit (E1–E13) and responds to the eighteen findings of the Reviewer/Editor Audit (R01–R18). The formation energies of the FINAL draft are unchanged and were re-derived from the Rydberg totals in the Supporting Information; values corrected or added from the authors’ output files are listed in the revision log. Passages marked</w:t>
       </w:r>
       <w:r>
         <w:t xml:space="preserve"> </w:t>
@@ -301,7 +301,7 @@
         <w:t xml:space="preserve">+</w:t>
       </w:r>
       <w:r>
-        <w:t xml:space="preserve">, so one vacancy over-compensates Pr and leaves one residual hole with Rb. That hole is an empty minority-spin O-2p state with 0.59 μ</w:t>
+        <w:t xml:space="preserve">, so one vacancy over-compensates Pr and leaves one residual hole with Rb. That hole is an empty minority-spin O-2p state; a Löwdin analysis puts 0.59 μ</w:t>
       </w:r>
       <w:r>
         <w:rPr>
@@ -313,7 +313,7 @@
         <w:t xml:space="preserve"> </w:t>
       </w:r>
       <w:r>
-        <w:t xml:space="preserve">on one oxygen bonded to Rb; the Rb ion itself moves 1.27 Å towards the vacancy, so relaxation also contributes to the Rb result. The Rb cells carry unpaired spin in every treatment tested; the +2-charged vacancy cell reaches a total magnetisation of 2.99 μ</w:t>
+        <w:t xml:space="preserve">of its moment on one oxygen bonded to Rb, and the Rb ion lies 1.27 Å off its ideal site, towards the vacancy. The Rb cells carry unpaired spin in every treatment tested; the +2-charged vacancy cell reaches a total magnetisation of 2.99 μ</w:t>
       </w:r>
       <w:r>
         <w:rPr>
@@ -517,7 +517,7 @@
         <w:t xml:space="preserve"> </w:t>
       </w:r>
       <w:r>
-        <w:t xml:space="preserve">site the formal charge mismatch is −1 e per site. Lanthanide substitution in anatase has been studied with DFT+U for Ce, Pr, Eu and Gd, including Pr together with an oxygen vacancy [19], for Pr in the bulk with plain GGA in a 12-atom cell [20] and for Er at the (101) surface together with oxygen or titanium vacancies [21]; for Ce-doped zirconium titanate both hole formation and oxygen-vacancy formation have been considered as compensation channels, with electron paramagnetic resonance pointing to vacancy compensation [22]. The picture is not universal: Iwaszuk and Nolan showed for trivalent dopants in bulk rutile that oxygen-vacancy compensation can compete with, and in some cases dominate, electronic compensation [17]. The coupling between a lanthanide dopant and an oxygen vacancy has been analysed for Ce-doped anatase [23] and Gd-doped CeO</w:t>
+        <w:t xml:space="preserve">site the formal charge mismatch is −1 e per site. Lanthanide substitution in anatase has been studied with DFT+U for Ce, Pr, Eu and Gd, including Pr together with an oxygen vacancy [19], and for Er at the (101) surface together with oxygen or titanium vacancies [20], and with plain GGA for Pr in a 12-atom bulk cell [21]; for Ce-doped zirconium titanate both hole formation and oxygen-vacancy formation have been considered as compensation channels, with electron paramagnetic resonance pointing to vacancy compensation [22]. The picture is not universal: Iwaszuk and Nolan showed for trivalent dopants in bulk rutile that oxygen-vacancy compensation can compete with, and in some cases dominate, electronic compensation [17]. The coupling between a lanthanide dopant and an oxygen vacancy has been analysed for Ce-doped anatase [23] and Gd-doped CeO</w:t>
       </w:r>
       <w:r>
         <w:rPr>
@@ -529,7 +529,7 @@
         <w:t xml:space="preserve"> </w:t>
       </w:r>
       <w:r>
-        <w:t xml:space="preserve">[18], and Bahmanrokh et al. proposed a defect-equilibria formalism for Ce-doped anatase in which both channels appear [24]. Pr in particular has been studied as an adsorbate on the anatase (101) surface [25] and as a substituent in the bulk [19,20], and is an attractive test case, here modelled as trivalent with a 4f-in-core dataset (Section 2.1), because its ionic radius (0.99 Å in six-fold coordination [26]) is far from that of Ti</w:t>
+        <w:t xml:space="preserve">[18], and Bahmanrokh et al. proposed a defect-equilibria formalism for Ce-doped anatase in which both channels appear [24]. Pr, which has also been studied as an adsorbate on the anatase (101) surface [25], is an attractive test case, here modelled as trivalent with a 4f-in-core dataset (Section 2.1), because its ionic radius (0.99 Å in six-fold coordination [26]) is far from that of Ti</w:t>
       </w:r>
       <w:r>
         <w:rPr>
@@ -2187,7 +2187,7 @@
         <w:t xml:space="preserve"> </w:t>
       </w:r>
       <w:r>
-        <w:t xml:space="preserve">= U − J = 3.28 eV, with LDA [34]), and it has been used for Er-doped anatase [21] and for anatase (101) defect chemistry [7]; other anatase work uses U = 4.2 eV [13], a value originally fitted for the rutile (110) surface [35], or larger values [14]. Literature U values obtained with other projector schemes are not strictly transferable to the ortho-atomic projectors used here, and the sensitivity of the present results to U is reported in Section 3.7. The DFT+U approach rests on the formulation of Anisimov et al. [36]; linear-response determination of U [37] was not performed for any cell in this work. For the oxygen-site tests of Section 3.4 an additional U</w:t>
+        <w:t xml:space="preserve">= U − J = 3.28 eV, with LDA [34]), and it has been used for Er-doped anatase [20] and for anatase (101) defect chemistry [7]; other anatase work uses U = 4.2 eV [13], a value originally fitted for the rutile (110) surface [35], or larger values [14]. Literature U values obtained with other projector schemes are not strictly transferable to the ortho-atomic projectors used here, and the sensitivity of the present results to U is reported in Section 3.7. The DFT+U approach rests on the formulation of Anisimov et al. [36]; linear-response determination of U [37] was not performed for any cell in this work. For the oxygen-site tests of Section 3.4 an additional U</w:t>
       </w:r>
       <w:r>
         <w:rPr>
@@ -2338,7 +2338,7 @@
         <w:t xml:space="preserve"> </w:t>
       </w:r>
       <w:r>
-        <w:t xml:space="preserve">is a first-shell oxygen of the dopant site: in the relaxed Rb_VO coordinates the vacant position is an equatorial oxygen site 1.95 Å from the ideal cation position (Section 3.1, Table S8), and the two doped cells have identical atom ordering in their outputs, consistent with the same vacancy. Three alternative sites in the Pr cell are examined in Section 3.7; a second first-shell candidate (index O3 of the orchestration script) was planned but not computed.</w:t>
+        <w:t xml:space="preserve">is a first-shell oxygen of the dopant site: in the relaxed Rb_VO coordinates the vacant position is an equatorial oxygen site 1.95 Å from the ideal cation position (Section 3.1, Table S8), and in Pr_VO the four lowest oxygen Löwdin populations are on O9, O11, O23 and O30, four of the five remaining first-shell oxygens of the dopant site, while Ti2 and Ti26, the two Ti bonded to the vacant site in the Rb cell, are among the three Ti with the highest 3d population, which is consistent with the same vacancy in both cells. Three alternative sites in the Pr cell are examined in Section 3.7.</w:t>
       </w:r>
       <w:r>
         <w:t xml:space="preserve"> </w:t>
@@ -2408,17 +2408,17 @@
         <w:t xml:space="preserve"> </w:t>
       </w:r>
       <w:r>
-        <w:t xml:space="preserve">relaxation (Section S1) and the self-consistent runs that regenerated the densities for the projected densities of states used 0.01 Ry (Table S10).</w:t>
-      </w:r>
-      <w:r>
-        <w:t xml:space="preserve"> </w:t>
-      </w:r>
-      <w:r>
-        <w:rPr>
-          <w:bCs/>
-          <w:b/>
-        </w:rPr>
-        <w:t xml:space="preserve">[AUTHOR ACTION: confirm degauss = 0.005 Ry in the production relaxation inputs.]</w:t>
+        <w:t xml:space="preserve">relaxation (Section S1) and the self-consistent runs that regenerated the densities for the projected densities of states used 0.01 Ry (Table S10); because the latter reproduce the production Rb_VO Fermi energy to 0.1 meV, the production value is not established.</w:t>
+      </w:r>
+      <w:r>
+        <w:t xml:space="preserve"> </w:t>
+      </w:r>
+      <w:r>
+        <w:rPr>
+          <w:bCs/>
+          <w:b/>
+        </w:rPr>
+        <w:t xml:space="preserve">[AUTHOR ACTION: state degauss of the production relaxations from their input files.]</w:t>
       </w:r>
       <w:r>
         <w:t xml:space="preserve"> </w:t>
@@ -2494,7 +2494,7 @@
         <w:t xml:space="preserve"> </w:t>
       </w:r>
       <w:r>
-        <w:t xml:space="preserve">Ry. Symmetry was handled by the code’s default detection.</w:t>
+        <w:t xml:space="preserve">Ry. Symmetry was handled by the code’s default detection; the Rb_VO cell retained a mirror plane (two symmetry operations in the pw.x output), so hole configurations that break it, for example localisation on only one of a mirror-related pair of oxygens, were excluded by construction.</w:t>
       </w:r>
       <w:r>
         <w:t xml:space="preserve"> </w:t>
@@ -2591,7 +2591,7 @@
         <w:t xml:space="preserve"> </w:t>
       </w:r>
       <w:r>
-        <w:t xml:space="preserve">&gt; |m| indicates spin density of both signs. The run log records starting_magnetization = 0 on every species for the production relaxations, and the single-point inputs derived from them use the same setting; pw.x accepts explicitly set zero values with nspin = 2 and stops only when starting_magnetization is not set for any species. From a spin-symmetric start a moment develops only if the symmetric solution is unstable and numerical noise (here the randomised starting wavefunctions) breaks the symmetry, as happened for both Rb cells; the same start can leave a calculation in a non-magnetic solution when a magnetic one exists.</w:t>
+        <w:t xml:space="preserve">&gt; |m| indicates spin density of both signs. The run log records starting_magnetization = 0 on every species for the production relaxations, and the single-point inputs derived from them use the same setting; pw.x accepts explicitly set zero values with nspin = 2 and stops only when starting_magnetization is set for no species and no total magnetisation is imposed. From a spin-symmetric start a moment develops only if the symmetric solution is unstable and numerical noise (for example from randomised starting wavefunctions, which the single-point inputs use) breaks the symmetry, as happened for both Rb cells; the same start can leave a calculation in a non-magnetic solution when a magnetic one exists.</w:t>
       </w:r>
       <w:r>
         <w:t xml:space="preserve"> </w:t>
@@ -3054,7 +3054,7 @@
         <w:t xml:space="preserve"> </w:t>
       </w:r>
       <w:r>
-        <w:t xml:space="preserve">(iv) Dispersion: single-point energies for Pr_VO and Rb_VO with the Grimme D3 correction and Becke–Johnson damping [41,42], without three-body terms, as in the DFT+U+D3 study of pristine and defective anatase by Torres et al., who used PBEsol-D3 with U = 3 eV for the defective (001) surface [43]; the single points were started from scratch on the production geometries. (v) Alternative vacancy sites: three additional Pr_VO cells with the vacancy at atom indices O1, O7 and O17 of the production input. (vi) Bader analysis of Pr_VO and Rb_VO from pp.x charge densities with the Henkelman grid algorithm [44,45].</w:t>
+        <w:t xml:space="preserve">(iv) Dispersion: single-point energies for Pr_VO and Rb_VO with the Grimme D3 correction and Becke–Johnson damping [41,42], without three-body terms (D3 has been combined with DFT+U for pristine and defective anatase by Torres et al., who used PBEsol-D3 with U = 3 eV for the defective (001) surface [43]); the single points were started from scratch on the production geometries. (v) Alternative vacancy sites: three additional Pr_VO cells with the vacancy at oxygen sites 1, 7 and 17 of the orchestration input (not the pw.x atom numbers used elsewhere). (vi) Bader analysis of Pr_VO and Rb_VO from pp.x charge densities with the Henkelman grid algorithm [44,45].</w:t>
       </w:r>
       <w:r>
         <w:t xml:space="preserve"> </w:t>
@@ -3114,7 +3114,28 @@
         <w:t xml:space="preserve"> </w:t>
       </w:r>
       <w:r>
-        <w:t xml:space="preserve">cell, which required a modified mixing scheme to converge (Section S1), was stopped at 0.0056 Ry/Bohr, slightly above the threshold. Figure 1 shows the (010) atomic plane that contains the dopant site and the vacancy, at ideal positions and in the relaxed Rb_VO cell as read from its final coordinates (Table S8). The vacant site is an equatorial first-shell oxygen of the dopant site, 1.95 Å from the ideal cation position. In the relaxed cell the Rb ion has moved 1.27 Å from that position towards the vacancy and lies 0.87 Å from the vacant oxygen site; its four nearest oxygens are at 2.54 (two), 2.56 and 2.71 Å and the next two at 2.95 and 3.07 Å. The two Ti atoms that were bonded to the removed oxygen have moved away from it, to 2.36 and 2.38 Å from the vacant site (ideal Ti–O distances 2.03 and 1.95 Å). The large monovalent ion thus occupies part of the space vacated by the oxygen, so structural relaxation is part of the energy released when the vacancy forms next to Rb (Sections 3.2 and 4.3).</w:t>
+        <w:t xml:space="preserve">cell, which required a modified mixing scheme to converge (Section S1), was stopped at 0.0056 Ry/Bohr, slightly above the threshold. Figure 1 shows the (010) atomic plane that contains the dopant site and the vacancy, at ideal positions and in the relaxed Rb_VO cell as read from its final coordinates (Table S8). The vacant site is an equatorial first-shell oxygen of the dopant site, 1.95 Å from the ideal cation position. In the relaxed cell the Rb ion has moved 1.27 Å from that position towards the vacancy and lies 0.87 Å from the vacant oxygen site; its four nearest oxygens are at 2.54 (two), 2.56 and 2.71 Å and the next two at 2.95 and 3.07 Å. The two Ti atoms that were bonded to the removed oxygen have moved away from it, to 2.36 and 2.38 Å from the vacant site (ideal Ti–O distances 2.03 and 1.95 Å). The large monovalent ion thus occupies part of the space vacated by the oxygen. The displacement is measured from the ideal anatase site, because the relaxed Rb_perfect coordinates were not available, and the shortest Rb–O distance (2.54 Å) is 0.38 Å below the Shannon-radius sum for six-fold Rb</w:t>
+      </w:r>
+      <w:r>
+        <w:rPr>
+          <w:vertAlign w:val="superscript"/>
+        </w:rPr>
+        <w:t xml:space="preserve">+</w:t>
+      </w:r>
+      <w:r>
+        <w:t xml:space="preserve">–O</w:t>
+      </w:r>
+      <w:r>
+        <w:rPr>
+          <w:vertAlign w:val="superscript"/>
+        </w:rPr>
+        <w:t xml:space="preserve">2−</w:t>
+      </w:r>
+      <w:r>
+        <w:t xml:space="preserve"> </w:t>
+      </w:r>
+      <w:r>
+        <w:t xml:space="preserve">(2.92 Å [26]), as for the short Pr–O distance noted in Section 2.3.</w:t>
       </w:r>
       <w:r>
         <w:t xml:space="preserve"> </w:t>
@@ -3189,7 +3210,7 @@
           <w:iCs/>
           <w:i/>
         </w:rPr>
-        <w:t xml:space="preserve">Figure 1. The (010) atomic plane containing the dopant site and the oxygen vacancy. (a) Ideal anatase positions built with the lattice parameters of this work (a = 7.63632 Å, c = 9.77900 Å, u = 0.208), with the dopant on the substituted Ti site and the vacant oxygen site marked by a dashed circle. (b) The same plane in the relaxed Rb_VO cell (PBE+U, U(Ti-3d) = 3.5 eV, Γ-only), from the final coordinates of the production relaxation. Arrows give the displacement of each in-plane atom from its ideal site after removal of the mean displacement; the dotted circle marks the ideal Rb site. The oxygen drawn in blue (O8) carries the largest Löwdin spin polarisation (+0.59 μ</w:t>
+        <w:t xml:space="preserve">Figure 1. The (010) atomic plane containing the dopant site and the oxygen vacancy. (a) Ideal anatase positions built with the lattice parameters of this work (a = 7.63632 Å, c = 9.77900 Å, u = 0.208), with the dopant on the substituted Ti site and the vacant oxygen site marked by a dashed circle. (b) The same plane in the relaxed Rb_VO cell (PBE+U, U(Ti-3d) = 3.5 eV, Γ-only), from the final coordinates of the production relaxation. Arrows give the displacement (where larger than 0.2 Å) of each in-plane atom from its ideal site after removal of the mean displacement; the dotted circle marks the ideal Rb site. The oxygen drawn in blue (O8) carries the largest Löwdin spin polarisation (+0.59 μ</w:t>
       </w:r>
       <w:r>
         <w:rPr>
@@ -3302,7 +3323,7 @@
         <w:t xml:space="preserve">2</w:t>
       </w:r>
       <w:r>
-        <w:t xml:space="preserve">, by 3.45 eV for Pr and 8.81 eV for Rb (differences of the unrounded values). At this reference the Pr cell remains uphill, so oxygen removal is not spontaneous; the Rb cell is downhill, so the vacancy-free Rb-substituted cell is unstable against oxygen loss. Part of the Rb reduction is structural: the Rb ion moves 1.27 Å into the space vacated by the oxygen (Section 3.1), and the energy of this relaxation has not been separated from the electronic contribution. The Pr–Rb contrast ΔE</w:t>
+        <w:t xml:space="preserve">, by 3.45 eV for Pr and 8.81 eV for Rb (differences of the unrounded values). At this reference the Pr cell remains uphill, so oxygen removal is not spontaneous; the Rb cell is downhill, so the vacancy-free Rb-substituted cell is unstable against oxygen loss. Structural relaxation may contribute to the Rb reduction: the Rb ion lies 1.27 Å off its ideal site, in the space vacated by the oxygen (Section 3.1). The relaxation energy of the Rb_VO cell was not computed, and the pristine and Pr values also contain relaxation, so its share of the reduction is unknown. The Pr–Rb contrast ΔE</w:t>
       </w:r>
       <w:r>
         <w:rPr>
@@ -4200,7 +4221,57 @@
         <w:t xml:space="preserve">B</w:t>
       </w:r>
       <w:r>
-        <w:t xml:space="preserve">. In smearing free energy (Section 2.4) it lies 0.281 eV above the non-magnetic energy logged with it for comparison and 0.394 eV above the final production energy (Table S9, runs 4, 24 and 25); this free energy includes a −TS term that favours fractionally occupied solutions. The non-magnetic solution is therefore the lower of the two solutions tested at this smearing, and a broader search over spin seeds and local distortions would be needed to establish it as the ground state. For Pr_VO the smeared character is documented by the projected densities of states, in which the occupied conduction-band states have equal weight in the two spin channels, and by the Löwdin analysis, in which no site carries more than 0.001 μ</w:t>
+        <w:t xml:space="preserve">. In smearing free energy (Section 2.4) it lies 0.281 eV above the non-magnetic energy logged with it for comparison and 0.394 eV above the final production energy (Table S9, runs 4, 24 and 25); this free energy includes a −TS term that favours fractionally occupied solutions. The non-magnetic solution is therefore the lower of the two solutions tested at this smearing, and a broader search over spin seeds and local distortions would be needed to establish it as the ground state. For Pr_VO the projected densities of states (Section 3.6) show that the net excess electron occupies Ti-3d conduction-band states with no gap state; because the non-self-consistent run inherits the m = 0 density, its equal spin channels and zero site moments follow by construction and do not test the spin state.</w:t>
+      </w:r>
+      <w:r>
+        <w:t xml:space="preserve"> </w:t>
+      </w:r>
+      <w:r>
+        <w:rPr>
+          <w:bCs/>
+          <w:b/>
+        </w:rPr>
+        <w:t xml:space="preserve">[AUTHOR ACTION: report the fractional occupations near E</w:t>
+      </w:r>
+      <w:r>
+        <w:rPr>
+          <w:vertAlign w:val="subscript"/>
+          <w:bCs/>
+          <w:b/>
+        </w:rPr>
+        <w:t xml:space="preserve">F</w:t>
+      </w:r>
+      <w:r>
+        <w:rPr>
+          <w:bCs/>
+          <w:b/>
+        </w:rPr>
+        <w:t xml:space="preserve"> </w:t>
+      </w:r>
+      <w:r>
+        <w:rPr>
+          <w:bCs/>
+          <w:b/>
+        </w:rPr>
+        <w:t xml:space="preserve">of the non-magnetic Pr_perfect and Pr_VO solutions from their self-consistent outputs.]</w:t>
+      </w:r>
+      <w:r>
+        <w:t xml:space="preserve"> </w:t>
+      </w:r>
+      <w:r>
+        <w:t xml:space="preserve">The isolated O</w:t>
+      </w:r>
+      <w:r>
+        <w:rPr>
+          <w:vertAlign w:val="subscript"/>
+        </w:rPr>
+        <w:t xml:space="preserve">2</w:t>
+      </w:r>
+      <w:r>
+        <w:t xml:space="preserve"> </w:t>
+      </w:r>
+      <w:r>
+        <w:t xml:space="preserve">reference converged to its triplet (m = 2.00 μ</w:t>
       </w:r>
       <w:r>
         <w:rPr>
@@ -4209,38 +4280,15 @@
         <w:t xml:space="preserve">B</w:t>
       </w:r>
       <w:r>
-        <w:t xml:space="preserve"> </w:t>
-      </w:r>
-      <w:r>
-        <w:t xml:space="preserve">(Section 3.6).</w:t>
-      </w:r>
-      <w:r>
-        <w:t xml:space="preserve"> </w:t>
-      </w:r>
-      <w:r>
-        <w:rPr>
-          <w:bCs/>
-          <w:b/>
-        </w:rPr>
-        <w:t xml:space="preserve">[AUTHOR ACTION: document the occupations of the non-magnetic Pr_perfect solution in the same way.]</w:t>
-      </w:r>
-      <w:r>
-        <w:t xml:space="preserve"> </w:t>
-      </w:r>
-      <w:r>
-        <w:t xml:space="preserve">The isolated O</w:t>
-      </w:r>
-      <w:r>
-        <w:rPr>
-          <w:vertAlign w:val="subscript"/>
-        </w:rPr>
-        <w:t xml:space="preserve">2</w:t>
-      </w:r>
-      <w:r>
-        <w:t xml:space="preserve"> </w:t>
-      </w:r>
-      <w:r>
-        <w:t xml:space="preserve">reference converged to its triplet (m = 2.00 μ</w:t>
+        <w:t xml:space="preserve">), which is the expected check of the spin-polarised pipeline.</w:t>
+      </w:r>
+    </w:p>
+    <w:p>
+      <w:pPr>
+        <w:pStyle w:val="BodyText"/>
+      </w:pPr>
+      <w:r>
+        <w:t xml:space="preserve">The Rb cells behave differently. Rb_perfect converged to m = 1.00 μ</w:t>
       </w:r>
       <w:r>
         <w:rPr>
@@ -4249,15 +4297,22 @@
         <w:t xml:space="preserve">B</w:t>
       </w:r>
       <w:r>
-        <w:t xml:space="preserve">), which is the expected check of the spin-polarised pipeline.</w:t>
-      </w:r>
-    </w:p>
-    <w:p>
-      <w:pPr>
-        <w:pStyle w:val="BodyText"/>
-      </w:pPr>
-      <w:r>
-        <w:t xml:space="preserve">The Rb cells behave differently. Rb_perfect converged to m = 1.00 μ</w:t>
+        <w:t xml:space="preserve"> </w:t>
+      </w:r>
+      <w:r>
+        <w:t xml:space="preserve">(m</w:t>
+      </w:r>
+      <w:r>
+        <w:rPr>
+          <w:vertAlign w:val="subscript"/>
+        </w:rPr>
+        <w:t xml:space="preserve">abs</w:t>
+      </w:r>
+      <w:r>
+        <w:t xml:space="preserve"> </w:t>
+      </w:r>
+      <w:r>
+        <w:t xml:space="preserve">= 1.00 μ</w:t>
       </w:r>
       <w:r>
         <w:rPr>
@@ -4266,10 +4321,19 @@
         <w:t xml:space="preserve">B</w:t>
       </w:r>
       <w:r>
-        <w:t xml:space="preserve"> </w:t>
-      </w:r>
-      <w:r>
-        <w:t xml:space="preserve">(m</w:t>
+        <w:t xml:space="preserve">) from the production starting magnetisation, and Rb_VO to m = −0.97 μ</w:t>
+      </w:r>
+      <w:r>
+        <w:rPr>
+          <w:vertAlign w:val="subscript"/>
+        </w:rPr>
+        <w:t xml:space="preserve">B</w:t>
+      </w:r>
+      <w:r>
+        <w:t xml:space="preserve"> </w:t>
+      </w:r>
+      <w:r>
+        <w:t xml:space="preserve">with m</w:t>
       </w:r>
       <w:r>
         <w:rPr>
@@ -4281,7 +4345,7 @@
         <w:t xml:space="preserve"> </w:t>
       </w:r>
       <w:r>
-        <w:t xml:space="preserve">= 1.00 μ</w:t>
+        <w:t xml:space="preserve">= 1.21 μ</w:t>
       </w:r>
       <w:r>
         <w:rPr>
@@ -4290,7 +4354,7 @@
         <w:t xml:space="preserve">B</w:t>
       </w:r>
       <w:r>
-        <w:t xml:space="preserve">) from the production starting magnetisation, and Rb_VO to m = −0.97 μ</w:t>
+        <w:t xml:space="preserve">. Single-point calculations started from zero magnetisation on the final Rb_VO geometry, at the production U without and with the D3 term (Section 3.7) and at other U values (Table S1), converge instead to m = 1.00 μ</w:t>
       </w:r>
       <w:r>
         <w:rPr>
@@ -4299,10 +4363,37 @@
         <w:t xml:space="preserve">B</w:t>
       </w:r>
       <w:r>
-        <w:t xml:space="preserve"> </w:t>
-      </w:r>
-      <w:r>
-        <w:t xml:space="preserve">with m</w:t>
+        <w:t xml:space="preserve">. The two solutions are nearly degenerate: the from-scratch Γ single point (m = 1.00 μ</w:t>
+      </w:r>
+      <w:r>
+        <w:rPr>
+          <w:vertAlign w:val="subscript"/>
+        </w:rPr>
+        <w:t xml:space="preserve">B</w:t>
+      </w:r>
+      <w:r>
+        <w:t xml:space="preserve">, E</w:t>
+      </w:r>
+      <w:r>
+        <w:rPr>
+          <w:vertAlign w:val="subscript"/>
+        </w:rPr>
+        <w:t xml:space="preserve">F</w:t>
+      </w:r>
+      <w:r>
+        <w:t xml:space="preserve"> </w:t>
+      </w:r>
+      <w:r>
+        <w:t xml:space="preserve">= 7.120 eV) lies 6.4 meV above the last relaxation step (m = −0.97 μ</w:t>
+      </w:r>
+      <w:r>
+        <w:rPr>
+          <w:vertAlign w:val="subscript"/>
+        </w:rPr>
+        <w:t xml:space="preserve">B</w:t>
+      </w:r>
+      <w:r>
+        <w:t xml:space="preserve">, m</w:t>
       </w:r>
       <w:r>
         <w:rPr>
@@ -4323,7 +4414,108 @@
         <w:t xml:space="preserve">B</w:t>
       </w:r>
       <w:r>
-        <w:t xml:space="preserve">. Single-point calculations started from zero magnetisation on the final Rb_VO geometry, at the production U without and with the D3 term (Section 3.7) and at other U values (Table S1), converge instead to m = 1.00 μ</w:t>
+        <w:t xml:space="preserve">, E</w:t>
+      </w:r>
+      <w:r>
+        <w:rPr>
+          <w:vertAlign w:val="subscript"/>
+        </w:rPr>
+        <w:t xml:space="preserve">F</w:t>
+      </w:r>
+      <w:r>
+        <w:t xml:space="preserve"> </w:t>
+      </w:r>
+      <w:r>
+        <w:t xml:space="preserve">= 7.133 eV; Tables S2a and S9). The self-consistent run that preceded the projected densities of states, started from 0.3 on Ti, reproduced the production Fermi energy to 0.1 meV, but the two solutions differ in E</w:t>
+      </w:r>
+      <w:r>
+        <w:rPr>
+          <w:vertAlign w:val="subscript"/>
+        </w:rPr>
+        <w:t xml:space="preserve">F</w:t>
+      </w:r>
+      <w:r>
+        <w:t xml:space="preserve"> </w:t>
+      </w:r>
+      <w:r>
+        <w:t xml:space="preserve">by only 13 meV and that run’s total energy was not compared, so Figure 4 is taken to represent both near-degenerate solutions.</w:t>
+      </w:r>
+      <w:r>
+        <w:t xml:space="preserve"> </w:t>
+      </w:r>
+      <w:r>
+        <w:rPr>
+          <w:bCs/>
+          <w:b/>
+        </w:rPr>
+        <w:t xml:space="preserve">[AUTHOR ACTION: report E</w:t>
+      </w:r>
+      <w:r>
+        <w:rPr>
+          <w:vertAlign w:val="subscript"/>
+          <w:bCs/>
+          <w:b/>
+        </w:rPr>
+        <w:t xml:space="preserve">tot</w:t>
+      </w:r>
+      <w:r>
+        <w:rPr>
+          <w:bCs/>
+          <w:b/>
+        </w:rPr>
+        <w:t xml:space="preserve">, m and m</w:t>
+      </w:r>
+      <w:r>
+        <w:rPr>
+          <w:vertAlign w:val="subscript"/>
+          <w:bCs/>
+          <w:b/>
+        </w:rPr>
+        <w:t xml:space="preserve">abs</w:t>
+      </w:r>
+      <w:r>
+        <w:rPr>
+          <w:bCs/>
+          <w:b/>
+        </w:rPr>
+        <w:t xml:space="preserve"> </w:t>
+      </w:r>
+      <w:r>
+        <w:rPr>
+          <w:bCs/>
+          <w:b/>
+        </w:rPr>
+        <w:t xml:space="preserve">of the self-consistent run that preceded the Rb_VO projected densities of states.]</w:t>
+      </w:r>
+      <w:r>
+        <w:t xml:space="preserve"> </w:t>
+      </w:r>
+      <w:r>
+        <w:t xml:space="preserve">With three formal holes in Rb_perfect and one residual hole in Rb_VO (Table 1), the Ti-3d-only Hubbard treatment thus yields one unpaired spin in each Rb cell; the remaining two holes of Rb_perfect are spin-paired in this treatment (m</w:t>
+      </w:r>
+      <w:r>
+        <w:rPr>
+          <w:vertAlign w:val="subscript"/>
+        </w:rPr>
+        <w:t xml:space="preserve">abs</w:t>
+      </w:r>
+      <w:r>
+        <w:t xml:space="preserve"> </w:t>
+      </w:r>
+      <w:r>
+        <w:t xml:space="preserve">= |m| excludes antiparallel moments), a point that the oxygen-site Hubbard test of Section 3.4 revisits. The excess of m</w:t>
+      </w:r>
+      <w:r>
+        <w:rPr>
+          <w:vertAlign w:val="subscript"/>
+        </w:rPr>
+        <w:t xml:space="preserve">abs</w:t>
+      </w:r>
+      <w:r>
+        <w:t xml:space="preserve"> </w:t>
+      </w:r>
+      <w:r>
+        <w:t xml:space="preserve">over |m| in Rb_VO (0.24 μ</w:t>
       </w:r>
       <w:r>
         <w:rPr>
@@ -4332,7 +4524,7 @@
         <w:t xml:space="preserve">B</w:t>
       </w:r>
       <w:r>
-        <w:t xml:space="preserve">. The two solutions are nearly degenerate: the from-scratch Γ single point (m = 1.00 μ</w:t>
+        <w:t xml:space="preserve">) indicates regions of spin density of the opposite sign, which can arise from spin polarisation of the surrounding ions whether the hole is localised or delocalised, so this quantity does not by itself fix the degree of localisation; the Löwdin analysis (Section 3.6) finds a weak antiparallel polarisation of the Ti sublattice (−0.12 μ</w:t>
       </w:r>
       <w:r>
         <w:rPr>
@@ -4341,19 +4533,10 @@
         <w:t xml:space="preserve">B</w:t>
       </w:r>
       <w:r>
-        <w:t xml:space="preserve">, E</w:t>
-      </w:r>
-      <w:r>
-        <w:rPr>
-          <w:vertAlign w:val="subscript"/>
-        </w:rPr>
-        <w:t xml:space="preserve">F</w:t>
-      </w:r>
-      <w:r>
-        <w:t xml:space="preserve"> </w:t>
-      </w:r>
-      <w:r>
-        <w:t xml:space="preserve">= 7.120 eV) lies 6.4 meV above the last relaxation step (m = −0.97 μ</w:t>
+        <w:t xml:space="preserve"> </w:t>
+      </w:r>
+      <w:r>
+        <w:t xml:space="preserve">in total), which accounts for essentially all of the 0.24 μ</w:t>
       </w:r>
       <w:r>
         <w:rPr>
@@ -4362,7 +4545,10 @@
         <w:t xml:space="preserve">B</w:t>
       </w:r>
       <w:r>
-        <w:t xml:space="preserve">, m</w:t>
+        <w:t xml:space="preserve"> </w:t>
+      </w:r>
+      <w:r>
+        <w:t xml:space="preserve">excess (m</w:t>
       </w:r>
       <w:r>
         <w:rPr>
@@ -4374,73 +4560,7 @@
         <w:t xml:space="preserve"> </w:t>
       </w:r>
       <w:r>
-        <w:t xml:space="preserve">= 1.21 μ</w:t>
-      </w:r>
-      <w:r>
-        <w:rPr>
-          <w:vertAlign w:val="subscript"/>
-        </w:rPr>
-        <w:t xml:space="preserve">B</w:t>
-      </w:r>
-      <w:r>
-        <w:t xml:space="preserve">, E</w:t>
-      </w:r>
-      <w:r>
-        <w:rPr>
-          <w:vertAlign w:val="subscript"/>
-        </w:rPr>
-        <w:t xml:space="preserve">F</w:t>
-      </w:r>
-      <w:r>
-        <w:t xml:space="preserve"> </w:t>
-      </w:r>
-      <w:r>
-        <w:t xml:space="preserve">= 7.133 eV; Table S2a). The self-consistent run that preceded the projected densities of states, started from 0.3 on Ti, reproduced the production Fermi energy and is taken to be the production solution, with the opposite (arbitrary) sign of m. With three formal holes in Rb_perfect and one residual hole in Rb_VO (Table 1), the Ti-3d-only Hubbard treatment thus yields one unpaired spin in each Rb cell; the remaining two holes of Rb_perfect are spin-paired in this treatment (m</w:t>
-      </w:r>
-      <w:r>
-        <w:rPr>
-          <w:vertAlign w:val="subscript"/>
-        </w:rPr>
-        <w:t xml:space="preserve">abs</w:t>
-      </w:r>
-      <w:r>
-        <w:t xml:space="preserve"> </w:t>
-      </w:r>
-      <w:r>
-        <w:t xml:space="preserve">= |m| excludes antiparallel moments), a point that the oxygen-site Hubbard test of Section 3.4 revisits. The excess of m</w:t>
-      </w:r>
-      <w:r>
-        <w:rPr>
-          <w:vertAlign w:val="subscript"/>
-        </w:rPr>
-        <w:t xml:space="preserve">abs</w:t>
-      </w:r>
-      <w:r>
-        <w:t xml:space="preserve"> </w:t>
-      </w:r>
-      <w:r>
-        <w:t xml:space="preserve">over |m| in Rb_VO (0.24 μ</w:t>
-      </w:r>
-      <w:r>
-        <w:rPr>
-          <w:vertAlign w:val="subscript"/>
-        </w:rPr>
-        <w:t xml:space="preserve">B</w:t>
-      </w:r>
-      <w:r>
-        <w:t xml:space="preserve">) indicates regions of spin density of the opposite sign, which can arise from spin polarisation of the surrounding ions whether the hole is localised or delocalised, so this quantity does not by itself fix the degree of localisation; the Löwdin analysis (Section 3.6) finds a weak antiparallel polarisation of the Ti sublattice (−0.12 μ</w:t>
-      </w:r>
-      <w:r>
-        <w:rPr>
-          <w:vertAlign w:val="subscript"/>
-        </w:rPr>
-        <w:t xml:space="preserve">B</w:t>
-      </w:r>
-      <w:r>
-        <w:t xml:space="preserve"> </w:t>
-      </w:r>
-      <w:r>
-        <w:t xml:space="preserve">in total), which accounts for part of the excess.</w:t>
+        <w:t xml:space="preserve">− |m| is twice the integrated spin density of the minority sign).</w:t>
       </w:r>
     </w:p>
     <w:p>
@@ -6190,7 +6310,7 @@
         <w:t xml:space="preserve"> </w:t>
       </w:r>
       <w:r>
-        <w:t xml:space="preserve">The Fermi energies printed for the production cells (Table 3) are 7.89 eV (pristine), 9.99 eV (Pr_VO) and 7.13 eV (Rb_VO). They are referenced to each cell’s own average electrostatic potential and are not aligned to a common vacuum or core level; in the insulating pristine cell the printed value lies in the gap at a position set by the smearing rather than by a physical level (the same Γ-only cell prints 7.89 eV in the production run and 8.24 eV in a single point of the k-mesh series at the same total energy, Table S2a). The differences (+2.10 eV for Pr_VO and −0.76 eV for Rb_VO relative to pristine; 2.86 eV between the two doped vacancy cells) should therefore be read as qualitative indicators and not as band offsets or carrier-density shifts. With that caveat, the large upward shift in Pr_VO is consistent with the net excess electron of Table 1 occupying conduction-band states in a cell containing one carrier per 570 Å</w:t>
+        <w:t xml:space="preserve">The Fermi energies printed for the production cells (Table 3) are 7.89 eV (pristine), 9.99 eV (Pr_VO) and 7.13 eV (Rb_VO). They are referenced to each cell’s own average electrostatic potential and are not aligned to a common vacuum or core level; in the insulating pristine cell the printed value lies in the gap at a position set by the smearing rather than by a physical level (the same Γ-only cell prints 7.89 eV in the production run and 8.24 eV in a single point of the k-mesh series at the same total energy, Table S2a). The differences (+2.10 eV for Pr_VO and −0.75 eV for Rb_VO relative to pristine; 2.86 eV between the two doped vacancy cells) should therefore be read as qualitative indicators and not as band offsets or carrier-density shifts. With that caveat, the large upward shift in Pr_VO is consistent with the net excess electron of Table 1 occupying conduction-band states in a cell containing one carrier per 570 Å</w:t>
       </w:r>
       <w:r>
         <w:rPr>
@@ -6293,7 +6413,7 @@
         <w:t xml:space="preserve"> </w:t>
       </w:r>
       <w:r>
-        <w:t xml:space="preserve">and the Fermi level lies in the Ti-3d conduction band. The occupied conduction-band states within 0.6 eV below E</w:t>
+        <w:t xml:space="preserve">and the Fermi level lies in the Ti-3d conduction band. The occupied conduction-band states are 95 % Ti-3d, no feature appears inside the gap at this broadening, and the Pr-5d projection is small at both band edges. The electron count fixes 0.5 occupied states per spin channel; the broadened DOS integrates to 0.70 per channel between E</w:t>
       </w:r>
       <w:r>
         <w:rPr>
@@ -6305,7 +6425,19 @@
         <w:t xml:space="preserve"> </w:t>
       </w:r>
       <w:r>
-        <w:t xml:space="preserve">have equal weight in the two spin channels (0.70 states each in the broadened DOS, 95 % Ti-3d), no feature appears inside the gap at this broadening, and the Pr-5d projection is small at both band edges. No site carries a Löwdin spin polarisation above 0.001 μ</w:t>
+        <w:t xml:space="preserve">− 0.6 eV and E</w:t>
+      </w:r>
+      <w:r>
+        <w:rPr>
+          <w:vertAlign w:val="subscript"/>
+        </w:rPr>
+        <w:t xml:space="preserve">F</w:t>
+      </w:r>
+      <w:r>
+        <w:t xml:space="preserve"> </w:t>
+      </w:r>
+      <w:r>
+        <w:t xml:space="preserve">because of the 0.136 eV Gaussian tails. Equal spin channels and Löwdin moments below 0.001 μ</w:t>
       </w:r>
       <w:r>
         <w:rPr>
@@ -6314,7 +6446,10 @@
         <w:t xml:space="preserve">B</w:t>
       </w:r>
       <w:r>
-        <w:t xml:space="preserve">, so the net excess electron is spin-paired over delocalised conduction-band states: this is the smeared solution of Section 3.3. The Pr-4f states are frozen in the core and cannot appear (Section 2.1). In Rb_VO the Fermi level lies at the top of the O-2p valence band and an empty state lies just above it in one spin channel only: between E</w:t>
+        <w:t xml:space="preserve"> </w:t>
+      </w:r>
+      <w:r>
+        <w:t xml:space="preserve">on every site follow from the m = 0 density on which this run is based (Section 3.3). The Pr-4f states are frozen in the core and cannot appear (Section 2.1). In Rb_VO the Fermi level lies at the top of the O-2p valence band and an empty state lies just above it in one spin channel only. In the eigenvalues it is a single minority-spin band 0.04–0.13 eV above E</w:t>
       </w:r>
       <w:r>
         <w:rPr>
@@ -6323,6 +6458,15 @@
         <w:t xml:space="preserve">F</w:t>
       </w:r>
       <w:r>
+        <w:t xml:space="preserve">, 2.5 eV below the next minority band; in the broadened DOS it carries 0.79 states between E</w:t>
+      </w:r>
+      <w:r>
+        <w:rPr>
+          <w:vertAlign w:val="subscript"/>
+        </w:rPr>
+        <w:t xml:space="preserve">F</w:t>
+      </w:r>
+      <w:r>
         <w:t xml:space="preserve"> </w:t>
       </w:r>
       <w:r>
@@ -6338,7 +6482,7 @@
         <w:t xml:space="preserve"> </w:t>
       </w:r>
       <w:r>
-        <w:t xml:space="preserve">+ 0.6 eV the minority channel holds 0.79 states and the majority channel none, and 93 % of the minority weight is O-2p (Ti-3d 5 %). This empty minority-spin state is the residual hole of Table 1. The Löwdin moments locate it (Figure S1, Section S2.2). Of the total of +1.01 μ</w:t>
+        <w:t xml:space="preserve">+ 0.6 eV in the minority channel and none in the majority channel, 93 % of it O-2p (Ti-3d 5 %). This empty minority-spin band is the residual hole of Table 1. The Löwdin moments locate it (Figure S1, Section S2.2). Of the total of +1.01 μ</w:t>
       </w:r>
       <w:r>
         <w:rPr>
@@ -6407,7 +6551,7 @@
         <w:t xml:space="preserve"> </w:t>
       </w:r>
       <w:r>
-        <w:t xml:space="preserve">on any Ti) and Rb none. O8 is bonded to the displaced Rb ion (2.56 Å) and to two Ti atoms (1.96 Å) and lies 3.40 Å from the vacant site; it is also the oxygen with the largest Bader depletion (Section 3.7). The residual hole is therefore an O-2p hole centred on one oxygen next to the dopant, with smaller weight on its oxygen neighbours and no Ti</w:t>
+        <w:t xml:space="preserve">on any Ti) and Rb none. O8 is bonded to the displaced Rb ion (2.56 Å) and to two Ti atoms (1.96 Å) and lies 3.39 Å from the vacant site; it is also the oxygen with the largest Bader depletion (Section 3.7). The residual hole is therefore an O-2p hole with the largest share of its Löwdin moment on one oxygen next to the dopant and the rest on neighbouring oxygens; no Ti</w:t>
       </w:r>
       <w:r>
         <w:rPr>
@@ -6419,7 +6563,7 @@
         <w:t xml:space="preserve"> </w:t>
       </w:r>
       <w:r>
-        <w:t xml:space="preserve">character. The sum of the magnitudes of the Löwdin moments (1.24 μ</w:t>
+        <w:t xml:space="preserve">centre forms. Because the relaxation retained the mirror plane of the cell (Section 2.4), configurations in which the hole sits on only one oxygen of a mirror-related pair were not sampled. The sum of the magnitudes of the Löwdin moments (1.24 μ</w:t>
       </w:r>
       <w:r>
         <w:rPr>
@@ -6449,7 +6593,16 @@
         <w:t xml:space="preserve">B</w:t>
       </w:r>
       <w:r>
-        <w:t xml:space="preserve">). Löwdin moments depend on the projector basis, so these numbers locate the spin density rather than quantify it. The separation between the valence-band top and the conduction-band onset is about 2.4–2.5 eV in both cells (onsets taken where the total DOS reaches 0.5 states eV</w:t>
+        <w:t xml:space="preserve">). Löwdin moments depend on the projector basis, so these numbers locate the spin density rather than quantify it. The Kohn–Sham gap of Rb_VO from the non-self-consistent eigenvalues is 2.87 eV in the majority channel (valence-band top 0.22 eV below E</w:t>
+      </w:r>
+      <w:r>
+        <w:rPr>
+          <w:vertAlign w:val="subscript"/>
+        </w:rPr>
+        <w:t xml:space="preserve">F</w:t>
+      </w:r>
+      <w:r>
+        <w:t xml:space="preserve">, conduction-band minimum 2.65 eV above it); in the broadened DOS of Pr_VO the valence-band top and the conduction-band onset are 2.46 eV apart at a threshold of 0.5 states eV</w:t>
       </w:r>
       <w:r>
         <w:rPr>
@@ -6458,7 +6611,7 @@
         <w:t xml:space="preserve">−1</w:t>
       </w:r>
       <w:r>
-        <w:t xml:space="preserve">). In the run used for Figure 4 the net moment is positive, so the hole appears in the spin-down channel; the sign of m is arbitrary in a collinear calculation, and the production relaxation (m = −0.97 μ</w:t>
+        <w:t xml:space="preserve">, which underestimates the eigenvalue gap because of the broadening. In the run used for Figure 4 the net moment is positive, so the hole appears in the spin-down channel; the sign of m is arbitrary in a collinear calculation (the production relaxation has m = −0.97 μ</w:t>
       </w:r>
       <w:r>
         <w:rPr>
@@ -6467,7 +6620,17 @@
         <w:t xml:space="preserve">B</w:t>
       </w:r>
       <w:r>
-        <w:t xml:space="preserve">) corresponds to the same solution with the spins interchanged (Section 3.3). The Fermi energy of Pr_VO in Figure 4 (10.31 eV, 2×2×2 non-self-consistent) differs from the Γ-only self-consistent value (9.99 eV) because of the k-mesh dependence of the conduction-band filling; the Rb_VO Fermi energy is mesh-stable (7.13 versus 7.14 eV).</w:t>
+        <w:t xml:space="preserve">). The Fermi energy of Pr_VO in Figure 4 (10.31 eV, 2×2×2 non-self-consistent) differs from the Γ-only self-consistent value (9.99 eV) because of the k-mesh dependence of the conduction-band filling; the Rb_VO Fermi energy is mesh-stable (7.13 versus 7.14 eV). In the non-self-consistent Rb_VO run pw.x reported 33–37 unconverged eigenvalues per k-point; in a Davidson calculation with 226 bands these are normally the highest bands, well above the hole band (band 188 of the minority channel) and the conduction-band minimum, but the upper conduction-band PDOS should be confirmed.</w:t>
+      </w:r>
+      <w:r>
+        <w:t xml:space="preserve"> </w:t>
+      </w:r>
+      <w:r>
+        <w:rPr>
+          <w:bCs/>
+          <w:b/>
+        </w:rPr>
+        <w:t xml:space="preserve">[AUTHOR ACTION: repeat the non-self-consistent step with diago_full_acc = .true., and report the eigenvalue gap of Pr_VO.]</w:t>
       </w:r>
       <w:r>
         <w:t xml:space="preserve"> </w:t>
@@ -6551,7 +6714,7 @@
           <w:iCs/>
           <w:i/>
         </w:rPr>
-        <w:t xml:space="preserve">, from 2×2×2 non-self-consistent calculations on the relaxed cells (PBE+U, U(Ti-3d) = 3.5 eV; tetrahedron occupations; Gaussian broadening 0.01 Ry). Spin up is plotted upwards and spin down downwards; energies are relative to each cell’s Fermi level (10.31 and 7.14 eV). Filled blue: Ti-3d summed over 15 Ti; orange: O-2p summed over 31 O; green: Pr-5d multiplied by 5; grey: total. The Rb dataset has no d projector, so no dopant-d channel exists for Rb_VO. In (b) the occupied conduction-band states have equal weight in the two spin channels (0.70 states each between −0.6 eV and E</w:t>
+        <w:t xml:space="preserve">, from 2×2×2 non-self-consistent calculations on the relaxed cells (PBE+U, U(Ti-3d) = 3.5 eV; tetrahedron occupations; Gaussian broadening 0.01 Ry). Spin up is plotted upwards and spin down downwards; energies are relative to each cell’s Fermi level (10.31 and 7.14 eV). Filled blue: Ti-3d summed over 15 Ti; orange: O-2p summed over 31 O; green: Pr-5d multiplied by 5; grey: total. The Rb dataset has no d projector, so no dopant-d channel exists for Rb_VO. In (b) the occupied conduction-band states have equal weight in the two spin channels, as the m = 0 density implies (95 % Ti-3d; the broadened DOS holds 0.70 states per channel between −0.6 eV and E</w:t>
       </w:r>
       <w:r>
         <w:rPr>
@@ -6566,7 +6729,14 @@
           <w:iCs/>
           <w:i/>
         </w:rPr>
-        <w:t xml:space="preserve">, 95 % Ti-3d). In (d) the empty state just above E</w:t>
+        <w:t xml:space="preserve"> </w:t>
+      </w:r>
+      <w:r>
+        <w:rPr>
+          <w:iCs/>
+          <w:i/>
+        </w:rPr>
+        <w:t xml:space="preserve">for 0.5 electrons). In (d) the empty band just above E</w:t>
       </w:r>
       <w:r>
         <w:rPr>
@@ -6588,7 +6758,7 @@
           <w:iCs/>
           <w:i/>
         </w:rPr>
-        <w:t xml:space="preserve">appears in the spin-down channel only (0.79 states between E</w:t>
+        <w:t xml:space="preserve">(0.04–0.13 eV in the eigenvalues) appears in the spin-down channel only (93 % O-2p; broadened weight 0.79 states between E</w:t>
       </w:r>
       <w:r>
         <w:rPr>
@@ -6610,7 +6780,7 @@
           <w:iCs/>
           <w:i/>
         </w:rPr>
-        <w:t xml:space="preserve">and +0.6 eV, 93 % O-2p; spin up 0.00). Plotted without smoothing from the summed projwfc.x output by figures/make_pdos_figures.py.</w:t>
+        <w:t xml:space="preserve">and +0.6 eV). Plotted without smoothing from the summed projwfc.x output by figures/make_pdos_figures.py.</w:t>
       </w:r>
     </w:p>
     <w:p>
@@ -6740,7 +6910,7 @@
         <w:t xml:space="preserve"> </w:t>
       </w:r>
       <w:r>
-        <w:t xml:space="preserve">For Pristine_perfect, Pr_VO and Rb_VO the total energy was computed at Γ, 2×2×1, 2×2×2 and 3×3×2 meshes at U = 3.5 eV. The Γ-only energies differ from the 3×3×2 values by 1.05, 1.08 and 1.16 eV per cell (22, 23 and 25 meV per atom), whereas the 2×2×1 energies are within 1.15, 1.05 and 0.42 meV per atom of 3×3×2. The Γ-only energies lie below the 3×3×2 values, and the 2×2×2 energies of the same series lie 0.2, 1.5 and 2.1 meV per atom above them for Pr_VO, Rb_VO and Pristine_perfect (Table S2a), so convergence beyond 2×2×1 is at the 1–2 meV per atom level and is not monotonic across mesh families. The Γ-only production energies are therefore not converged in absolute terms, and the formation energies of Table 2 rely on cancellation between the perfect and defective cell of the same host rather than on convergence of each total energy. The 2×2×2 column of Table 2 quantifies the residual: −0.10 eV (Pr), −0.14 eV (Rb) and +0.04 eV on their difference. Because the k-mesh single points start from scratch, the Γ-to-2×2×2 shifts include the differences between the from-scratch and relaxation-endpoint solutions at Γ (0.038 eV for Pr_VO and 6.4 meV for Rb_VO, Table S2a), which lie within the stated mesh dependence. A complete formation-energy cycle exists only at Γ and, for the doped hosts, at 2×2×2. The total magnetisations are mesh-independent: 0.00 μ</w:t>
+        <w:t xml:space="preserve">For Pristine_perfect, Pr_VO and Rb_VO the total energy was computed at Γ, 2×2×1, 2×2×2 and 3×3×2 meshes at U = 3.5 eV. The Γ-only energies differ from the 3×3×2 values by 1.05, 1.08 and 1.16 eV per cell (22, 23 and 25 meV per atom), whereas the 2×2×1 energies are within 1.15, 1.05 and 0.42 meV per atom of 3×3×2. The Γ-only energies lie below the 3×3×2 values, and the 2×2×2 energies of the same series lie 0.2, 1.5 and 2.1 meV per atom above them for Pr_VO, Rb_VO and Pristine_perfect (Table S2a), so convergence beyond 2×2×1 is at the 1–2 meV per atom level and is not monotonic across mesh families. The Γ-only production energies are therefore not converged in absolute terms, and the formation energies of Table 2 rely on cancellation between the perfect and defective cell of the same host rather than on convergence of each total energy. The 2×2×2 column of Table 2 quantifies the residual: −0.10 eV (Pr), −0.14 eV (Rb) and +0.04 eV on their difference. Because the k-mesh single points start from scratch, the Γ-to-2×2×2 shifts include the differences between the from-scratch and relaxation-endpoint solutions at Γ (0.038 eV for Pr_VO and 6.4 meV for Rb_VO, Table S2a). If these offsets carry over to 2×2×2, they account for essentially all of the +0.04 eV change in the contrast (leaving 0.006 eV); the perfect-cell 2×2×2 runs were not checked for such offsets. A complete formation-energy cycle exists only at Γ and, for the doped hosts, at 2×2×2. The total magnetisations are mesh-independent: 0.00 μ</w:t>
       </w:r>
       <w:r>
         <w:rPr>
@@ -6794,7 +6964,7 @@
         <w:t xml:space="preserve"> </w:t>
       </w:r>
       <w:r>
-        <w:t xml:space="preserve">Ry, to the from-scratch Γ single point of the k-mesh series (Table S2a), so the offset belongs to the from-scratch SCF solution of the smeared Pr_VO cell and not to the D3 term. The dispersion energies of the perfect substituted cells and of the O</w:t>
+        <w:t xml:space="preserve">Ry, to the from-scratch Γ single point of the k-mesh series (Table S2a), so the offset is common to the from-scratch single points and is not caused by the D3 term; its origin (a different smeared solution, a smearing difference or the manually stopped relaxation) has not been established. The dispersion energies of the perfect substituted cells and of the O</w:t>
       </w:r>
       <w:r>
         <w:rPr>
@@ -6940,7 +7110,7 @@
         <w:t xml:space="preserve"> </w:t>
       </w:r>
       <w:r>
-        <w:t xml:space="preserve">Three further Pr_VO cells were relaxed with the vacancy at the oxygen indices O1, O7 and O17 of the production input (Table S4). Sites O1 and O17 are symmetry-equivalent second-shell positions (Pr–O = 3.99 Å) and give E</w:t>
+        <w:t xml:space="preserve">Three further Pr_VO cells were relaxed with the vacancy at oxygen sites 1, 7 and 17 of the orchestration input (Table S4; these labels are not the pw.x atom numbers used elsewhere). Sites 1 and 17 are symmetry-equivalent second-shell positions (Pr–O = 3.99 Å) and give E</w:t>
       </w:r>
       <w:r>
         <w:rPr>
@@ -6952,7 +7122,7 @@
         <w:t xml:space="preserve"> </w:t>
       </w:r>
       <w:r>
-        <w:t xml:space="preserve">= +2.07 eV each, agreeing to 0.1 meV; the more distant site O7 (4.94 Å) gives +2.72 eV. The production site is thus the lowest of the four sampled sites by 0.78 eV. This is a comparison among selected configurations in a 2×2×1 cell, where</w:t>
+        <w:t xml:space="preserve">= +2.07 eV each, agreeing to 0.1 meV; the more distant site 7 (4.94 Å) gives +2.72 eV. The production site is thus the lowest of the four sampled sites by 0.78 eV. This is a comparison among selected configurations in a 2×2×1 cell, where</w:t>
       </w:r>
       <w:r>
         <w:t xml:space="preserve"> </w:t>
@@ -6970,7 +7140,7 @@
         <w:t xml:space="preserve"> </w:t>
       </w:r>
       <w:r>
-        <w:t xml:space="preserve">sites are still within one lattice parameter of the periodic images of the dopant. It indicates a preference for the production site over the two more distant positions sampled but is not a global search. The production site is itself a first-shell oxygen of the dopant site (Section 2.3); a second first-shell candidate was not computed, site multiplicities are not given, and no corresponding sampling was performed for the Rb cell. The positions of the removed oxygens are listed in Table S4.</w:t>
+        <w:t xml:space="preserve">sites are still within one lattice parameter of the periodic images of the dopant. It indicates a preference for the production site over the two more distant positions sampled but is not a global search. The production site is a first-shell oxygen of the dopant site in the Rb cell, and the Löwdin populations of Pr_VO are consistent with the same site (Section 2.3); other first-shell sites were not computed, site multiplicities are not given, and no corresponding sampling was performed for the Rb cell. The positions of the removed oxygens are listed in Table S4.</w:t>
       </w:r>
       <w:r>
         <w:t xml:space="preserve"> </w:t>
@@ -7008,13 +7178,13 @@
           <w:bCs/>
           <w:b/>
         </w:rPr>
-        <w:t xml:space="preserve">[AUTHOR ACTION: these two values are inconsistent with the mean Ti and O populations of Table S3, from which the sum rule gives +2.04 e (Pr) and +0.87 e (Rb); re-extract all four numbers from ACF.dat. Also state that the two cells share the same atom ordering and which oxygen index was removed in each, and report the grid used; Bader grid convergence was not tested. ]</w:t>
-      </w:r>
-      <w:r>
-        <w:t xml:space="preserve"> </w:t>
-      </w:r>
-      <w:r>
-        <w:t xml:space="preserve">Relative to the Pr_VO cell, the 31 oxygen atoms of Rb_VO hold 0.97 e less in total, with the depletion concentrated on one oxygen bonded to the displaced Rb ion (−0.26 e, O8; Rb–O8 = 2.56 Å, 3.40 Å from the vacant site) and a second oxygen (−0.14 e, O30; 3.07 Å from Rb), five further oxygens contributing −0.05 to −0.09 e each. The 15 Ti atoms show a uniform mean depletion of −0.012 e (−0.18 e in total) and no Ti differs by more than 0.05 e. No Ti site shows the excess of a few tenths of an electron, relative to the other Ti sites, that a localised Ti</w:t>
+        <w:t xml:space="preserve">[AUTHOR ACTION: these two values are inconsistent with the mean Ti and O populations of Table S3, from which the sum rule gives +2.04 e (Pr) and +0.87 e (Rb); re-extract all four numbers from ACF.dat. Also report the grid used; Bader grid convergence was not tested.]</w:t>
+      </w:r>
+      <w:r>
+        <w:t xml:space="preserve"> </w:t>
+      </w:r>
+      <w:r>
+        <w:t xml:space="preserve">Relative to the Pr_VO cell, the 31 oxygen atoms of Rb_VO hold 0.97 e less in total, with the depletion concentrated on one oxygen bonded to the displaced Rb ion (−0.26 e, O8; Rb–O8 = 2.56 Å, 3.39 Å from the vacant site) and a second oxygen (−0.14 e, O30; 3.07 Å from Rb), with five further oxygens contributing −0.05 to −0.09 e each. The 15 Ti atoms show a uniform mean depletion of −0.012 e (−0.18 e in total) and no Ti differs by more than 0.05 e. No Ti site shows the excess of a few tenths of an electron, relative to the other Ti sites, that a localised Ti</w:t>
       </w:r>
       <w:r>
         <w:rPr>
@@ -7095,7 +7265,7 @@
         <w:t xml:space="preserve">+</w:t>
       </w:r>
       <w:r>
-        <w:t xml:space="preserve">. Transferring an electron from a conduction-band-like state to an oxygen-2p-derived hole near the valence-band edge recovers an energy of the order of the band gap, so reductions of a few eV per transferred electron are expected; the reductions found (3.45 eV for one electron in the Pr cell, 8.81 eV for two in the Rb cell) are of that order but not equal per electron. The valence-to-conduction-band separation in the projected densities of states of the two vacancy cells is about 2.4–2.5 eV (Section 3.6), smaller than either per-electron reduction (3.45 eV for Pr, 4.40 eV per electron for Rb), so electron transfer across the gap does not account for the reductions on its own. The remainder must come from the electrostatic interaction between the vacancy and the dopant, which the dependence of E</w:t>
+        <w:t xml:space="preserve">. Transferring an electron from a conduction-band-like state to an oxygen-2p-derived hole near the valence-band edge recovers an energy of the order of the band gap, so reductions of a few eV per transferred electron are expected; the reductions found (3.45 eV for one electron in the Pr cell, 8.81 eV for two in the Rb cell) are of that order but not equal per electron. The Kohn–Sham gap of the Rb_VO cell is 2.87 eV and the band separation in the broadened densities of states of Pr_VO about 2.5 eV (Section 3.6), both smaller than either per-electron reduction (3.45 eV for Pr, 4.40 eV per electron for Rb), so electron transfer across the gap does not account for the reductions on its own. The remainder would have to come from other contributions, for example the electrostatic interaction between the vacancy and the dopant, which the dependence of E</w:t>
       </w:r>
       <w:r>
         <w:rPr>
@@ -7107,7 +7277,7 @@
         <w:t xml:space="preserve"> </w:t>
       </w:r>
       <w:r>
-        <w:t xml:space="preserve">on the vacancy site in the Pr cell indicates (Section 3.7), and from lattice relaxation, which in the Rb cell includes a 1.27 Å displacement of the Rb ion into the space vacated by the oxygen (Section 3.1); the two-dopant design cannot decompose the formation-energy difference into these contributions.</w:t>
+        <w:t xml:space="preserve">on the vacancy site in the Pr cell indicates (Section 3.7), lattice relaxation (the Rb ion lies 1.27 Å off its ideal site in Rb_VO, Section 3.1), band filling and interactions with periodic images; the two-dopant design cannot decompose the formation-energy difference into these contributions.</w:t>
       </w:r>
     </w:p>
     <w:p>
@@ -7344,7 +7514,7 @@
         <w:t xml:space="preserve">O</w:t>
       </w:r>
       <w:r>
-        <w:t xml:space="preserve">) at the oxygen-rich reference; it does not hold size constant, and no strain or fixed-geometry decomposition was computed, so the contrast cannot be apportioned between electronic and elastic contributions. What can be said is that the sign of the contrast and the size of the reductions are consistent with the electron count; because the ordering pristine &gt; Pr &gt; Rb is also the order of increasing cation radius (0.605, 0.99 and 1.52 Å) and Carey and Nolan found a radius dependence at fixed alkali valence [16], a size-based explanation of the ordering is not excluded. The relaxed Rb_VO cell gives a direct indication of the elastic part: the Rb ion moves 1.27 Å off the cation site into the space vacated by the adjacent oxygen (Section 3.1), a relaxation channel that only an adjacent vacancy opens and that a smaller ion would exploit less, but whose energy has not been separated from the electronic contribution. Isolating the two variables would require a controlled series within the same protocol, for example La</w:t>
+        <w:t xml:space="preserve">) at the oxygen-rich reference; it does not hold size constant, and no strain or fixed-geometry decomposition was computed, so the contrast cannot be apportioned between electronic and elastic contributions. What can be said is that the sign of the contrast and the size of the reductions are consistent with the electron count; because the ordering pristine &gt; Pr &gt; Rb is also the order of increasing cation radius (0.605, 0.99 and 1.52 Å) and Carey and Nolan found a radius dependence at fixed alkali valence [16], a size-based explanation of the ordering is not excluded. The relaxed Rb_VO cell shows that an elastic channel exists: the Rb ion lies 1.27 Å off its ideal site, in the space vacated by the adjacent oxygen (Section 3.1), but the energy of this relaxation has not been separated from the electronic contribution, and the corresponding Pr geometry has not been analysed. Isolating the two variables would require a controlled series within the same protocol, for example La</w:t>
       </w:r>
       <w:r>
         <w:rPr>
@@ -7741,7 +7911,19 @@
         <w:t xml:space="preserve"> </w:t>
       </w:r>
       <w:r>
-        <w:t xml:space="preserve">The production relaxations started from zero magnetisation (Section 2.5), and one magnetic trial was performed, for Pr_VO; occupations, smearing and symmetry settings were not varied, and two spin solutions of Rb_VO were found that differ by 6.4 meV (Section 3.3). Because E</w:t>
+        <w:t xml:space="preserve">The production relaxations of the doped cells started from zero magnetisation (the pristine V</w:t>
+      </w:r>
+      <w:r>
+        <w:rPr>
+          <w:vertAlign w:val="subscript"/>
+        </w:rPr>
+        <w:t xml:space="preserve">O</w:t>
+      </w:r>
+      <w:r>
+        <w:t xml:space="preserve"> </w:t>
+      </w:r>
+      <w:r>
+        <w:t xml:space="preserve">cell from 0.05; Section 2.5), and one magnetic trial was performed, for Pr_VO; occupations, smearing and symmetry settings were not varied, and two spin solutions of Rb_VO were found that differ by 6.4 meV (Section 3.3). Because E</w:t>
       </w:r>
       <w:r>
         <w:rPr>
@@ -7995,7 +8177,7 @@
         <w:t xml:space="preserve"> </w:t>
       </w:r>
       <w:r>
-        <w:t xml:space="preserve">The Bader comparison is between cells that differ in composition and by two carriers. The Löwdin moments that place the Rb_VO hole mainly on one oxygen depend on the projector basis and have not been cross-checked with a spin-density isosurface or another partitioning; for Pr_perfect and the dual-U cells no site-resolved analysis exists. (xiv)</w:t>
+        <w:t xml:space="preserve">The Bader comparison is between cells that differ in composition and by two carriers. The Löwdin moments that place the Rb_VO hole mainly on one oxygen depend on the projector basis and have not been cross-checked with a spin-density isosurface or another partitioning, and the relaxations retained the mirror plane of the defect cell, so hole configurations that break it were not sampled; for Pr_perfect and the dual-U cells no site-resolved analysis exists. (xiv)</w:t>
       </w:r>
       <w:r>
         <w:t xml:space="preserve"> </w:t>
@@ -8052,7 +8234,7 @@
         <w:t xml:space="preserve">+</w:t>
       </w:r>
       <w:r>
-        <w:t xml:space="preserve">, with a single vacancy over-compensating Pr and leaving one residual hole in the Rb cell. The Rb cells carry unpaired spin in every treatment tested. In Rb_VO the residual hole is an empty minority-spin O-2p state whose Löwdin moment sits mainly on one oxygen bonded to the Rb ion (0.59 of 1.01 μ</w:t>
+        <w:t xml:space="preserve">, with a single vacancy over-compensating Pr and leaving one residual hole in the Rb cell. The Rb cells carry unpaired spin in every treatment tested. In Rb_VO the residual hole is an empty minority-spin O-2p band whose Löwdin moment sits mainly on one oxygen bonded to the Rb ion (0.59 of 1.01 μ</w:t>
       </w:r>
       <w:r>
         <w:rPr>
@@ -8061,7 +8243,7 @@
         <w:t xml:space="preserve">B</w:t>
       </w:r>
       <w:r>
-        <w:t xml:space="preserve">), and the Rb ion has moved 1.27 Å towards the vacancy, so lattice relaxation contributes to the Rb energetics; a charged-cell series reaches three unpaired spins per Rb</w:t>
+        <w:t xml:space="preserve">), and the Rb ion lies 1.27 Å off its ideal site towards the vacancy; a charged-cell series reaches three unpaired spins per Rb</w:t>
       </w:r>
       <w:r>
         <w:rPr>
@@ -8472,15 +8654,15 @@
         <w:pStyle w:val="BodyText"/>
       </w:pPr>
       <w:r>
-        <w:t xml:space="preserve">[20] Chen, H.; Yao, L.; Yang, S.; Wang, Y.; Liang, X.; Huang, Y. First-Principles Study on Electronic and Optical Properties in Pr-Doped Anatase TiO2. Adv. Mater. Res. 2014, 924, 260–268. DOI: 10.4028/www.scientific.net/AMR.924.260.</w:t>
-      </w:r>
-    </w:p>
-    <w:p>
-      <w:pPr>
-        <w:pStyle w:val="BodyText"/>
-      </w:pPr>
-      <w:r>
-        <w:t xml:space="preserve">[21] Mazierski, P.; Mikołajczyk, A.; Grzyb, T.; Arellano Caicedo, P. N.; Wei, Z.; Kowalska, E.; Pinto, H. P.; Zaleska-Medynska, A.; Nadolna, J. On the Excitation Mechanism of Visible Responsible Er-TiO2 System Proved by Experimental and Theoretical Investigations for Boosting Photocatalytic Activity. Appl. Surf. Sci. 2020, 527, 146815. DOI: 10.1016/j.apsusc.2020.146815.</w:t>
+        <w:t xml:space="preserve">[20] Mazierski, P.; Mikołajczyk, A.; Grzyb, T.; Arellano Caicedo, P. N.; Wei, Z.; Kowalska, E.; Pinto, H. P.; Zaleska-Medynska, A.; Nadolna, J. On the Excitation Mechanism of Visible Responsible Er-TiO2 System Proved by Experimental and Theoretical Investigations for Boosting Photocatalytic Activity. Appl. Surf. Sci. 2020, 527, 146815. DOI: 10.1016/j.apsusc.2020.146815.</w:t>
+      </w:r>
+    </w:p>
+    <w:p>
+      <w:pPr>
+        <w:pStyle w:val="BodyText"/>
+      </w:pPr>
+      <w:r>
+        <w:t xml:space="preserve">[21] Chen, H.; Yao, L.; Yang, S.; Wang, Y.; Liang, X.; Huang, Y. First-Principles Study on Electronic and Optical Properties in Pr-Doped Anatase TiO2. Adv. Mater. Res. 2014, 924, 260–268. DOI: 10.4028/www.scientific.net/AMR.924.260.</w:t>
       </w:r>
     </w:p>
     <w:p>

</xml_diff>